<commit_message>
docs: round-2 revision — manuscript, supplementary, response letter
Synchronised from the research project after the round-2 textual revisions.

Manuscript: the six zero-risk corrections (citation claim, supplementary
numbering, matrix counts, fingerprint definition, availability statement, and the
fourteen Methods description points). Supplementary material rebuilt with two
independent numbering series and four newly supplied items — per-agent absorption
tier table with sources, full evaluation prompts, TRIPOD-AI checklist, and the ten
L1 disagreement rationales. Round-2 response letter added.

The marked-changes manuscript is included alongside the clean one; the journal
requires the main file to be clean, with the highlighted copy as a related file.
</commit_message>
<xml_diff>
--- a/manuscript/manuscript.docx
+++ b/manuscript/manuscript.docx
@@ -170,7 +170,7 @@
         <w:rPr>
           <w:rFonts w:ascii="Times New Roman" w:hAnsi="Times New Roman"/>
         </w:rPr>
-        <w:t xml:space="preserve">We built OphDDI-CDS, a deterministic three-layer cascade (40 citation-verified mechanism rules; an absorption-scaled 20 × 37 class matrix; a hard-constraint layer), covering 113 ophthalmic and 232 systemic agents, and used it to compare three ways of assigning ophthalmic–systemic DDI risk. Against DDInter severity for all 1,933 registry-matched pairs, 75.0% were graded lower once absorption was modelled (346 downgraded from high; 17.9% of all pairs), and 77.0% of downgrades were attributable to low systemic absorption. On a 118-case literature-derived gold the cascade reached 0.915 exact accuracy (108/118; kappa 0.870) versus 0.415–0.741 for three LLM baselines, with significant McNemar tests. On a semi-independent 92-case audit set it reached 0.707 accuracy but the lowest high-risk sensitivity of the four methods (0.440, 11 of 25). Two independent ophthalmologists reviewed the assigned grades for 12 cases with both the proposed gold and the system grade visible, agreed closely with each other (kappa 0.846), and yet did not endorse most grades, placing a consistent one-tier divergence between their clinical judgment and the evidence-graded assessment; because the system reproduced its gold on all 12 cases, this comparison cannot separate the two.</w:t>
+        <w:t xml:space="preserve">We built OphDDI-CDS, a deterministic three-layer cascade (40 mechanism rules, each carrying at least one source record; an absorption-scaled class matrix; a hard-constraint layer), covering 113 ophthalmic and 232 systemic agents, and used it to compare three ways of assigning ophthalmic–systemic DDI risk. Against DDInter severity for all 1,933 registry-matched pairs, 75.0% were graded lower once absorption was modelled (346 downgraded from high; 17.9% of all pairs), and 77.0% of downgrades were attributable to low systemic absorption. On a 118-case literature-derived gold the cascade reached 0.915 exact accuracy (108/118; kappa 0.870) versus 0.415–0.741 for three LLM baselines, with significant McNemar tests. On a semi-independent 92-case audit set it reached 0.707 accuracy but the lowest high-risk sensitivity of the four methods (0.440, 11 of 25). Two independent ophthalmologists reviewed the assigned grades for 12 cases with both the proposed gold and the system grade visible, agreed closely with each other (kappa 0.846), and yet did not endorse most grades, placing a consistent one-tier divergence between their clinical judgment and the evidence-graded assessment; because the system reproduced its gold on all 12 cases, this comparison cannot separate the two.</w:t>
       </w:r>
     </w:p>
     <w:p>
@@ -259,7 +259,7 @@
         <w:rPr>
           <w:rFonts w:ascii="Times New Roman" w:hAnsi="Times New Roman"/>
         </w:rPr>
-        <w:t xml:space="preserve">We present an ophthalmic DDI decision-support system built on a deterministic, fully explainable three-layer cascade. The L1 rule engine contains 40 citation-verified mechanism rules. The L2 drug-class matrix applies absorption-scaled upgrades. The L3 hard constraint encodes ophthalmic systemic-absorption pharmacology. The system is grounded in a curated knowledge base of 1,307 verified evidence chunks (113 ophthalmic agents, 232 systemic agents). It produces traceable risk grades (high, medium, or low) with matched rule IDs and evidence chains. The production path requires zero LLM calls, shows zero variance across temperature conditions, and completes inference in milliseconds.</w:t>
+        <w:t xml:space="preserve">We present an ophthalmic DDI decision-support system built on a deterministic, fully explainable three-layer cascade. The L1 rule engine contains 40 mechanism rules, each carrying at least one source record. The L2 drug-class matrix applies absorption-scaled upgrades. The L3 hard constraint encodes ophthalmic systemic-absorption pharmacology. The system is grounded in a curated knowledge base of 1,307 verified evidence chunks (113 ophthalmic agents, 232 systemic agents). It produces traceable risk grades (high, medium, or low) with matched rule IDs and evidence chains. The production path requires zero LLM calls, shows zero variance across temperature conditions, and completes inference in milliseconds.</w:t>
       </w:r>
     </w:p>
     <w:p>
@@ -323,6 +323,57 @@
       <w:r>
         <w:rPr>
           <w:rFonts w:ascii="Times New Roman" w:hAnsi="Times New Roman"/>
+          <w:b/>
+          <w:bCs/>
+        </w:rPr>
+        <w:t xml:space="preserve">How route of administration is represented.</w:t>
+      </w:r>
+      <w:r>
+        <w:rPr>
+          <w:rFonts w:ascii="Times New Roman" w:hAnsi="Times New Roman"/>
+        </w:rPr>
+        <w:t xml:space="preserve"> </w:t>
+      </w:r>
+      <w:r>
+        <w:rPr>
+          <w:rFonts w:ascii="Times New Roman" w:hAnsi="Times New Roman"/>
+        </w:rPr>
+        <w:t xml:space="preserve">Route is modelled explicitly, through two mechanisms rather than through a route field. First, the ophthalmic registry is restricted to agents administered to the eye and each carries a systemic-absorption tier (high, medium, low, very-low, minimal or none); that tier is the operational proxy for how much of a topical dose reaches the systemic circulation, and it is what the absorption-scaling step acts on. Second, the rule layer encodes route-dependent predicates directly, for example a rule that requires the flag</w:t>
+      </w:r>
+      <w:r>
+        <w:rPr>
+          <w:rFonts w:ascii="Times New Roman" w:hAnsi="Times New Roman"/>
+        </w:rPr>
+        <w:t xml:space="preserve"> </w:t>
+      </w:r>
+      <w:r>
+        <w:rPr>
+          <w:rStyle w:val="VerbatimChar"/>
+          <w:rFonts w:ascii="Times New Roman" w:hAnsi="Times New Roman"/>
+        </w:rPr>
+        <w:t xml:space="preserve">systemic_absorption_high</w:t>
+      </w:r>
+      <w:r>
+        <w:rPr>
+          <w:rFonts w:ascii="Times New Roman" w:hAnsi="Times New Roman"/>
+        </w:rPr>
+        <w:t xml:space="preserve"> </w:t>
+      </w:r>
+      <w:r>
+        <w:rPr>
+          <w:rFonts w:ascii="Times New Roman" w:hAnsi="Times New Roman"/>
+        </w:rPr>
+        <w:t xml:space="preserve">before it fires. Route is therefore not a free-text attribute of a pair but a numeric modifier and a flag that gate which rules and matrix cells can assign a grade. The tier assignment procedure and its sources are described in Section 2.2 and listed per agent in Supplementary Table S5.</w:t>
+      </w:r>
+    </w:p>
+    <w:p>
+      <w:pPr>
+        <w:pStyle w:val="BodyText"/>
+        <w:spacing w:line="480" w:lineRule="auto"/>
+      </w:pPr>
+      <w:r>
+        <w:rPr>
+          <w:rFonts w:ascii="Times New Roman" w:hAnsi="Times New Roman"/>
         </w:rPr>
         <w:t xml:space="preserve">Evidence and gold labels were derived from multiple sources. DDInter 2.0, a curated database of 302,516 DDI records, provided severity levels and drug-pair evidence [16]. FDA prescribing labels for ophthalmic products provided product-specific warnings. Stockley’s Drug Interactions and the British National Formulary [26] provided mechanism-level annotations, and peer-reviewed literature was retrieved from PubMed. All 1,307 evidence chunks were filtered to approved-release status and graded by evidence level (A, regulatory label; B, meta-analysis or systematic review; C, original study; D, in vitro, animal, or pharmacokinetic first principles; E, class-level mechanism inference). The approved distribution was A = 53, B = 191, C = 215, D = 584, E = 264.</w:t>
       </w:r>
@@ -362,8 +413,48 @@
       <w:r>
         <w:rPr>
           <w:rFonts w:ascii="Times New Roman" w:hAnsi="Times New Roman"/>
-        </w:rPr>
-        <w:t xml:space="preserve">L1 rule engine. Forty mechanism rules define DDI risk, including additive beta-blockade, beta-blocker–calcium-channel-blocker additive effects, additive alpha-2 CNS depression, CYP3A4 induction or inhibition, and QT-prolongation risk with low-absorption fluoroquinolones. Each rule is defined by entity-flag predicates with match-all or match-any semantics, and the highest-severity hit is retained (MAX-MATCH). Every rule carries at least one citation that passed a three-source cross-check (Crossref, OpenAlex, PubMed) with mandatory retraction screening (screened July 2026; all verified, zero policy errors). The 43 policy entries comprise 40 rules plus 3 patient-factor policies; 8 rule-level citations were additionally verified for title agreement. Per-rule citation identifiers and verification status are recorded in the rule configuration and in the citation verification report (available in the supplementary material); Table 2 lists the rule inventory with flags and match semantics.</w:t>
+          <w:b/>
+          <w:bCs/>
+        </w:rPr>
+        <w:t xml:space="preserve">L1 rule engine.</w:t>
+      </w:r>
+      <w:r>
+        <w:rPr>
+          <w:rFonts w:ascii="Times New Roman" w:hAnsi="Times New Roman"/>
+        </w:rPr>
+        <w:t xml:space="preserve"> </w:t>
+      </w:r>
+      <w:r>
+        <w:rPr>
+          <w:rFonts w:ascii="Times New Roman" w:hAnsi="Times New Roman"/>
+        </w:rPr>
+        <w:t xml:space="preserve">Forty mechanism rules define DDI risk, including additive beta-blockade, beta-blocker–calcium-channel-blocker additive effects, additive alpha-2 CNS depression, CYP3A4 induction or inhibition, and QT-prolongation risk with low-absorption fluoroquinolones. Each rule is defined by entity-flag predicates with match-all or match-any semantics, and the highest-severity hit is retained (MAX-MATCH). The 43 policy entries comprise 40 rules plus 3 patient-factor policies; Table 2 lists the rule inventory with flags and match semantics.</w:t>
+      </w:r>
+      <w:r>
+        <w:rPr>
+          <w:rFonts w:ascii="Times New Roman" w:hAnsi="Times New Roman"/>
+        </w:rPr>
+        <w:t xml:space="preserve"> </w:t>
+      </w:r>
+      <w:r>
+        <w:rPr>
+          <w:rFonts w:ascii="Times New Roman" w:hAnsi="Times New Roman"/>
+          <w:b/>
+          <w:bCs/>
+        </w:rPr>
+        <w:t xml:space="preserve">No second-order interactions are modelled:</w:t>
+      </w:r>
+      <w:r>
+        <w:rPr>
+          <w:rFonts w:ascii="Times New Roman" w:hAnsi="Times New Roman"/>
+        </w:rPr>
+        <w:t xml:space="preserve"> </w:t>
+      </w:r>
+      <w:r>
+        <w:rPr>
+          <w:rFonts w:ascii="Times New Roman" w:hAnsi="Times New Roman"/>
+        </w:rPr>
+        <w:t xml:space="preserve">each rule is evaluated independently on the properties of the two agents, and no rule’s activation depends on whether another rule fired. The only cross-layer composition is the final maximum of the rule and matrix layers (Section 4.2); combination products are handled by assigning the tier of the dominant component rather than by modelling component interactions.</w:t>
       </w:r>
     </w:p>
     <w:p>
@@ -375,7 +466,31 @@
         <w:rPr>
           <w:rFonts w:ascii="Times New Roman" w:hAnsi="Times New Roman"/>
         </w:rPr>
-        <w:t xml:space="preserve">L2 class matrix. A 20 (ophthalmic) × 37 (systemic) drug-class matrix defines 82 cell-level risks. Four upgrade rules require both a class match and specific absorption or selectivity flags, for example a non-selective beta-blocker with high systemic absorption. An absorption-scaling step forces agents with low or very-low systemic absorption to low risk unless an upgrade condition applies; high or medium absorption preserves the cell level.</w:t>
+        <w:t xml:space="preserve">Citation coverage is narrower than the phrase</w:t>
+      </w:r>
+      <w:r>
+        <w:rPr>
+          <w:rFonts w:ascii="Times New Roman" w:hAnsi="Times New Roman"/>
+        </w:rPr>
+        <w:t xml:space="preserve"> </w:t>
+      </w:r>
+      <w:r>
+        <w:rPr>
+          <w:rFonts w:ascii="Times New Roman" w:hAnsi="Times New Roman"/>
+        </w:rPr>
+        <w:t xml:space="preserve">“citation-verified”</w:t>
+      </w:r>
+      <w:r>
+        <w:rPr>
+          <w:rFonts w:ascii="Times New Roman" w:hAnsi="Times New Roman"/>
+        </w:rPr>
+        <w:t xml:space="preserve"> </w:t>
+      </w:r>
+      <w:r>
+        <w:rPr>
+          <w:rFonts w:ascii="Times New Roman" w:hAnsi="Times New Roman"/>
+        </w:rPr>
+        <w:t xml:space="preserve">would suggest, and we state it precisely. Every rule carries at least one source record, but the records are heterogeneous: 41 are DrugBank entries, 7 are regulatory label records, 2 are DOIs, 2 are DDInter pair annotations and 1 is a PubMed citation. Independent verification against three sources (Crossref, OpenAlex, PubMed) with retraction screening was performed for a subset: the verification report covers 8 manifest items spanning 7 distinct DOIs, and of these, three rules resolve to a verified literature citation (additive_beta_blockade, beta_blocker_ccb_additive, beta_blocker_digoxin_additive). The remaining rules cite DrugBank or label records, which were not independently re-verified in this work. The report is bound to a SHA-256 of the rule configuration so that any later edit invalidates it, and it is deposited with the manuscript (Supplementary Text S2).</w:t>
       </w:r>
     </w:p>
     <w:p>
@@ -387,7 +502,7 @@
         <w:rPr>
           <w:rFonts w:ascii="Times New Roman" w:hAnsi="Times New Roman"/>
         </w:rPr>
-        <w:t xml:space="preserve">L3 hard constraint. Low or very-low absorption with no rule hit and no matrix signal yields low risk (G19). For pairs with no rule or matrix signal, the default is low with a documented decision path. Unknown or ambiguous medications are not silently classified: the engine returns an explicit unknown-drug path and the screening service raises an error requesting resolution, so out-of-coverage pairs are never assigned a risk grade by default.</w:t>
+        <w:t xml:space="preserve">Two consequences of that partial coverage should be noted. First, several rules whose output class would call for a citation declare a citation list that does not resolve to a verified item; the gate accepts this, and the claim in earlier versions of this manuscript that all forty rules were citation-verified was overstated. Second, beta_blocker_digoxin_additive cites a study of additive topical-plus-systemic beta-blockade rather than a digoxin-specific source, and it grades as high a pair that its own DDInter annotation records as moderate; we retain the conservative high grade but flag the provenance gap here.</w:t>
       </w:r>
     </w:p>
     <w:p>
@@ -398,8 +513,329 @@
       <w:r>
         <w:rPr>
           <w:rFonts w:ascii="Times New Roman" w:hAnsi="Times New Roman"/>
-        </w:rPr>
-        <w:t xml:space="preserve">Drug-class mapping (113 ophthalmic agents, 232 systemic agents) was built from ATC codes, DrugBank records, and manual pharmacologic review, with DrugBank identifiers for 103 and 218 agents respectively; combination products were tiered by their dominant component. Ophthalmic systemic-absorption tiers (high, medium, low, or very-low) were assigned from pharmacokinetic sources and regulatory labels, including nasolacrimal-drainage bioavailability for timolol [1], plasma-level measurements for timolol [27], and instillation-technique effects on systemic exposure [14]. Ocular drug transfer from systemic administration is likewise complex and incompletely characterized [28]. For atropine and dexamethasone, tier assignment drew on regulatory labels and pharmacovigilance evidence [29]. The full per-agent tier table is provided as Supplementary Table S5.</w:t>
+          <w:b/>
+          <w:bCs/>
+        </w:rPr>
+        <w:t xml:space="preserve">L2 class matrix.</w:t>
+      </w:r>
+      <w:r>
+        <w:rPr>
+          <w:rFonts w:ascii="Times New Roman" w:hAnsi="Times New Roman"/>
+        </w:rPr>
+        <w:t xml:space="preserve"> </w:t>
+      </w:r>
+      <w:r>
+        <w:rPr>
+          <w:rFonts w:ascii="Times New Roman" w:hAnsi="Times New Roman"/>
+        </w:rPr>
+        <w:t xml:space="preserve">A drug-class matrix relates ophthalmic drug classes to systemic drug classes. The released configuration declares 21 ophthalmic row keys and 40 systemic column keys, of which 34 columns are used, and assigns an explicit risk level to 104 cells; cells that are not defined fall back to a default cell. (Earlier versions of this manuscript described the matrix as 20 × 37 with 82 cells; those figures did not match the configuration and are corrected here.) Four upgrade rules require both a class match and specific absorption or selectivity flags, for example a non-selective beta-blocker with high systemic absorption. An absorption-scaling step forces agents with low or very-low systemic absorption to low risk unless an upgrade condition applies; high or medium absorption preserves the cell level. This step is</w:t>
+      </w:r>
+      <w:r>
+        <w:rPr>
+          <w:rFonts w:ascii="Times New Roman" w:hAnsi="Times New Roman"/>
+        </w:rPr>
+        <w:t xml:space="preserve"> </w:t>
+      </w:r>
+      <w:r>
+        <w:rPr>
+          <w:rFonts w:ascii="Times New Roman" w:hAnsi="Times New Roman"/>
+          <w:b/>
+          <w:bCs/>
+        </w:rPr>
+        <w:t xml:space="preserve">not empirically validated</w:t>
+      </w:r>
+      <w:r>
+        <w:rPr>
+          <w:rFonts w:ascii="Times New Roman" w:hAnsi="Times New Roman"/>
+        </w:rPr>
+        <w:t xml:space="preserve"> </w:t>
+      </w:r>
+      <w:r>
+        <w:rPr>
+          <w:rFonts w:ascii="Times New Roman" w:hAnsi="Times New Roman"/>
+        </w:rPr>
+        <w:t xml:space="preserve">against outcome data: it is an author-specified design decision grounded in the pharmacokinetic principle that a dose which does not reach the systemic circulation cannot produce a systemic interaction, and its behavioural consequence is quantified in Section 3.4 (which reports how many registry pairs change grade because of it) and in the deposit’s path-attribution audit. Where the tier assignment is uncertain, the pair is conservatively left to the rule layer rather than forced low. Note that this forcing applies within the matrix layer only; the final grade is the maximum of the matrix layer and the rule layer, as discussed in Section 4.2. Most matrix cells are therefore deliberately undefined: the matrix is sparse by design, encoding the 104 class pairs for which a mechanism or an absorption-based expectation exists, and any pair that reaches neither a rule nor a defined cell falls through to the L3 default-low path rather than receiving an interpolated grade.</w:t>
+      </w:r>
+      <w:r>
+        <w:rPr>
+          <w:rFonts w:ascii="Times New Roman" w:hAnsi="Times New Roman"/>
+        </w:rPr>
+        <w:t xml:space="preserve"> </w:t>
+      </w:r>
+      <w:r>
+        <w:rPr>
+          <w:rFonts w:ascii="Times New Roman" w:hAnsi="Times New Roman"/>
+          <w:b/>
+          <w:bCs/>
+        </w:rPr>
+        <w:t xml:space="preserve">Layer scope of the class mapping:</w:t>
+      </w:r>
+      <w:r>
+        <w:rPr>
+          <w:rFonts w:ascii="Times New Roman" w:hAnsi="Times New Roman"/>
+        </w:rPr>
+        <w:t xml:space="preserve"> </w:t>
+      </w:r>
+      <w:r>
+        <w:rPr>
+          <w:rFonts w:ascii="Times New Roman" w:hAnsi="Times New Roman"/>
+        </w:rPr>
+        <w:t xml:space="preserve">the drug-to-class mapping (113 ophthalmic agents, 232 systemic agents;</w:t>
+      </w:r>
+      <w:r>
+        <w:rPr>
+          <w:rFonts w:ascii="Times New Roman" w:hAnsi="Times New Roman"/>
+        </w:rPr>
+        <w:t xml:space="preserve"> </w:t>
+      </w:r>
+      <w:r>
+        <w:rPr>
+          <w:rStyle w:val="VerbatimChar"/>
+          <w:rFonts w:ascii="Times New Roman" w:hAnsi="Times New Roman"/>
+        </w:rPr>
+        <w:t xml:space="preserve">configs/drug_classes.yaml</w:t>
+      </w:r>
+      <w:r>
+        <w:rPr>
+          <w:rFonts w:ascii="Times New Roman" w:hAnsi="Times New Roman"/>
+        </w:rPr>
+        <w:t xml:space="preserve">) is consumed by the L2 matrix layer only. The L1 rules operate on mechanism flags rather than classes, and the L3 hard constraint operates on the absorption tier alone.</w:t>
+      </w:r>
+    </w:p>
+    <w:p>
+      <w:pPr>
+        <w:pStyle w:val="BodyText"/>
+        <w:spacing w:line="480" w:lineRule="auto"/>
+      </w:pPr>
+      <w:r>
+        <w:rPr>
+          <w:rFonts w:ascii="Times New Roman" w:hAnsi="Times New Roman"/>
+          <w:b/>
+          <w:bCs/>
+        </w:rPr>
+        <w:t xml:space="preserve">L3 hard constraint.</w:t>
+      </w:r>
+      <w:r>
+        <w:rPr>
+          <w:rFonts w:ascii="Times New Roman" w:hAnsi="Times New Roman"/>
+        </w:rPr>
+        <w:t xml:space="preserve"> </w:t>
+      </w:r>
+      <w:r>
+        <w:rPr>
+          <w:rFonts w:ascii="Times New Roman" w:hAnsi="Times New Roman"/>
+        </w:rPr>
+        <w:t xml:space="preserve">Low or very-low absorption with no rule hit and no matrix signal yields low risk (G19). For pairs with no rule or matrix signal, the default is low with a documented decision path. Unknown or ambiguous medications are not silently classified: the engine returns an explicit unknown-drug path and the screening service raises an error requesting resolution, so out-of-coverage pairs are never assigned a risk grade by default.</w:t>
+      </w:r>
+    </w:p>
+    <w:p>
+      <w:pPr>
+        <w:pStyle w:val="BodyText"/>
+        <w:spacing w:line="480" w:lineRule="auto"/>
+      </w:pPr>
+      <w:r>
+        <w:rPr>
+          <w:rFonts w:ascii="Times New Roman" w:hAnsi="Times New Roman"/>
+        </w:rPr>
+        <w:t xml:space="preserve">Drug-class mapping (113 ophthalmic agents, 232 systemic agents) was built from ATC codes, DrugBank records, and manual pharmacologic review, with DrugBank identifiers for 103 and 218 agents respectively; combination products were tiered by their dominant component.</w:t>
+      </w:r>
+      <w:r>
+        <w:rPr>
+          <w:rFonts w:ascii="Times New Roman" w:hAnsi="Times New Roman"/>
+        </w:rPr>
+        <w:t xml:space="preserve"> </w:t>
+      </w:r>
+      <w:r>
+        <w:rPr>
+          <w:rFonts w:ascii="Times New Roman" w:hAnsi="Times New Roman"/>
+          <w:b/>
+          <w:bCs/>
+        </w:rPr>
+        <w:t xml:space="preserve">Absorption tiers and their definition.</w:t>
+      </w:r>
+      <w:r>
+        <w:rPr>
+          <w:rFonts w:ascii="Times New Roman" w:hAnsi="Times New Roman"/>
+        </w:rPr>
+        <w:t xml:space="preserve"> </w:t>
+      </w:r>
+      <w:r>
+        <w:rPr>
+          <w:rFonts w:ascii="Times New Roman" w:hAnsi="Times New Roman"/>
+        </w:rPr>
+        <w:t xml:space="preserve">Ophthalmic systemic-absorption tiers were assigned from pharmacokinetic sources and regulatory labels, including nasolacrimal-drainage bioavailability for timolol [1], plasma-level measurements for timolol [27], and instillation-technique effects on systemic exposure [14]. The registry uses</w:t>
+      </w:r>
+      <w:r>
+        <w:rPr>
+          <w:rFonts w:ascii="Times New Roman" w:hAnsi="Times New Roman"/>
+        </w:rPr>
+        <w:t xml:space="preserve"> </w:t>
+      </w:r>
+      <w:r>
+        <w:rPr>
+          <w:rFonts w:ascii="Times New Roman" w:hAnsi="Times New Roman"/>
+          <w:b/>
+          <w:bCs/>
+        </w:rPr>
+        <w:t xml:space="preserve">six</w:t>
+      </w:r>
+      <w:r>
+        <w:rPr>
+          <w:rFonts w:ascii="Times New Roman" w:hAnsi="Times New Roman"/>
+        </w:rPr>
+        <w:t xml:space="preserve"> </w:t>
+      </w:r>
+      <w:r>
+        <w:rPr>
+          <w:rFonts w:ascii="Times New Roman" w:hAnsi="Times New Roman"/>
+        </w:rPr>
+        <w:t xml:space="preserve">tier values, not the four used in earlier descriptions of this work:</w:t>
+      </w:r>
+      <w:r>
+        <w:rPr>
+          <w:rFonts w:ascii="Times New Roman" w:hAnsi="Times New Roman"/>
+        </w:rPr>
+        <w:t xml:space="preserve"> </w:t>
+      </w:r>
+      <w:r>
+        <w:rPr>
+          <w:rStyle w:val="VerbatimChar"/>
+          <w:rFonts w:ascii="Times New Roman" w:hAnsi="Times New Roman"/>
+        </w:rPr>
+        <w:t xml:space="preserve">systemic_absorption_high</w:t>
+      </w:r>
+      <w:r>
+        <w:rPr>
+          <w:rFonts w:ascii="Times New Roman" w:hAnsi="Times New Roman"/>
+        </w:rPr>
+        <w:t xml:space="preserve">,</w:t>
+      </w:r>
+      <w:r>
+        <w:rPr>
+          <w:rFonts w:ascii="Times New Roman" w:hAnsi="Times New Roman"/>
+        </w:rPr>
+        <w:t xml:space="preserve"> </w:t>
+      </w:r>
+      <w:r>
+        <w:rPr>
+          <w:rStyle w:val="VerbatimChar"/>
+          <w:rFonts w:ascii="Times New Roman" w:hAnsi="Times New Roman"/>
+        </w:rPr>
+        <w:t xml:space="preserve">systemic_absorption_medium</w:t>
+      </w:r>
+      <w:r>
+        <w:rPr>
+          <w:rFonts w:ascii="Times New Roman" w:hAnsi="Times New Roman"/>
+        </w:rPr>
+        <w:t xml:space="preserve">,</w:t>
+      </w:r>
+      <w:r>
+        <w:rPr>
+          <w:rFonts w:ascii="Times New Roman" w:hAnsi="Times New Roman"/>
+        </w:rPr>
+        <w:t xml:space="preserve"> </w:t>
+      </w:r>
+      <w:r>
+        <w:rPr>
+          <w:rStyle w:val="VerbatimChar"/>
+          <w:rFonts w:ascii="Times New Roman" w:hAnsi="Times New Roman"/>
+        </w:rPr>
+        <w:t xml:space="preserve">systemic_absorption_low</w:t>
+      </w:r>
+      <w:r>
+        <w:rPr>
+          <w:rFonts w:ascii="Times New Roman" w:hAnsi="Times New Roman"/>
+        </w:rPr>
+        <w:t xml:space="preserve">,</w:t>
+      </w:r>
+      <w:r>
+        <w:rPr>
+          <w:rFonts w:ascii="Times New Roman" w:hAnsi="Times New Roman"/>
+        </w:rPr>
+        <w:t xml:space="preserve"> </w:t>
+      </w:r>
+      <w:r>
+        <w:rPr>
+          <w:rStyle w:val="VerbatimChar"/>
+          <w:rFonts w:ascii="Times New Roman" w:hAnsi="Times New Roman"/>
+        </w:rPr>
+        <w:t xml:space="preserve">systemic_absorption_very_low</w:t>
+      </w:r>
+      <w:r>
+        <w:rPr>
+          <w:rFonts w:ascii="Times New Roman" w:hAnsi="Times New Roman"/>
+        </w:rPr>
+        <w:t xml:space="preserve">,</w:t>
+      </w:r>
+      <w:r>
+        <w:rPr>
+          <w:rFonts w:ascii="Times New Roman" w:hAnsi="Times New Roman"/>
+        </w:rPr>
+        <w:t xml:space="preserve"> </w:t>
+      </w:r>
+      <w:r>
+        <w:rPr>
+          <w:rStyle w:val="VerbatimChar"/>
+          <w:rFonts w:ascii="Times New Roman" w:hAnsi="Times New Roman"/>
+        </w:rPr>
+        <w:t xml:space="preserve">minimal_systemic_absorption</w:t>
+      </w:r>
+      <w:r>
+        <w:rPr>
+          <w:rFonts w:ascii="Times New Roman" w:hAnsi="Times New Roman"/>
+        </w:rPr>
+        <w:t xml:space="preserve"> </w:t>
+      </w:r>
+      <w:r>
+        <w:rPr>
+          <w:rFonts w:ascii="Times New Roman" w:hAnsi="Times New Roman"/>
+        </w:rPr>
+        <w:t xml:space="preserve">and</w:t>
+      </w:r>
+      <w:r>
+        <w:rPr>
+          <w:rFonts w:ascii="Times New Roman" w:hAnsi="Times New Roman"/>
+        </w:rPr>
+        <w:t xml:space="preserve"> </w:t>
+      </w:r>
+      <w:r>
+        <w:rPr>
+          <w:rStyle w:val="VerbatimChar"/>
+          <w:rFonts w:ascii="Times New Roman" w:hAnsi="Times New Roman"/>
+        </w:rPr>
+        <w:t xml:space="preserve">systemic_absorption_none</w:t>
+      </w:r>
+      <w:r>
+        <w:rPr>
+          <w:rFonts w:ascii="Times New Roman" w:hAnsi="Times New Roman"/>
+        </w:rPr>
+        <w:t xml:space="preserve"> </w:t>
+      </w:r>
+      <w:r>
+        <w:rPr>
+          <w:rFonts w:ascii="Times New Roman" w:hAnsi="Times New Roman"/>
+        </w:rPr>
+        <w:t xml:space="preserve">(113 agents: 16 high, 17 medium, 60 low, 9 very-low, 7 minimal, 4 none). The L3 hard constraint tests four of these — low, very-low, minimal and none — and forces them to low risk; the two remaining values preserve the assigned level. The tier is a</w:t>
+      </w:r>
+      <w:r>
+        <w:rPr>
+          <w:rFonts w:ascii="Times New Roman" w:hAnsi="Times New Roman"/>
+        </w:rPr>
+        <w:t xml:space="preserve"> </w:t>
+      </w:r>
+      <w:r>
+        <w:rPr>
+          <w:rFonts w:ascii="Times New Roman" w:hAnsi="Times New Roman"/>
+          <w:b/>
+          <w:bCs/>
+        </w:rPr>
+        <w:t xml:space="preserve">categorical assignment, not a measured quantity</w:t>
+      </w:r>
+      <w:r>
+        <w:rPr>
+          <w:rFonts w:ascii="Times New Roman" w:hAnsi="Times New Roman"/>
+        </w:rPr>
+        <w:t xml:space="preserve">: the intended reading is fractional systemic bioavailability after topical instillation (high above roughly 50%, medium roughly 10-50%, low below roughly 10%, with very-low, minimal and none indicating progressively smaller exposure), but the sources report heterogeneous quantities (bioavailability fractions, plasma concentrations, or qualitative statements), so the tiers should be read as an explicitly stated ordinal model rather than as measured exposure for every agent. Two limitations follow and are stated here rather than discovered later: first, the current assignment contains at least one internal inconsistency (flurbiprofen is tiered high in the registry while the candidate curation file records no tier flag for it), and second, nine of the 113 agents in the ophthalmic registry are not topically administered (six intravitreal anti-VEGF agents, intraocular acetylcholine, and two surgical viscoelastics), so the topical-absorption rationale does not apply to them in the same way. Both are flagged as required corrections in Section 4.4; the per-agent table with a source column is Supplementary Table S5. Ocular drug transfer from systemic administration is likewise complex and incompletely characterized [28]. For atropine and dexamethasone, tier assignment drew on regulatory labels and pharmacovigilance evidence [29]. The full per-agent tier table, with a source record for each agent, is provided as Supplementary Table S5.</w:t>
       </w:r>
     </w:p>
     <w:p>
@@ -438,7 +874,161 @@
         <w:rPr>
           <w:rFonts w:ascii="Times New Roman" w:hAnsi="Times New Roman"/>
         </w:rPr>
-        <w:t xml:space="preserve">L1 literature-derived gold (118 cases). Gold labels were constructed by the study team from authoritative sources, without reference to system outputs. The 118 cases comprise 20 mechanism annotations from FDA labels, Stockley’s, or the BNF; 40 procedurally frozen blind cases (SHA-256 locked before evaluation); and 58 guideline-sourced cases labelled from FDA product labels, BNF interaction tables, and Stockley’s (case-level source references recorded in the gold file). We disclose that no human expert participated in gold construction, and that the gold shares its literature sources with the rules (homogeneous construction). We further disclose that one of the two 20-case blind subsets (blind 2, cases C01–C20) entered the development loop through error attribution during class-matrix versions v2.1–v2.3; the other subset (blind 1, cases B01–B20) was never used in development. Gold-level distribution: 28 high, 51 medium, 39 low (Table 4).</w:t>
+        <w:t xml:space="preserve">L1 literature-derived gold (118 cases). Gold labels were constructed by the study team from authoritative sources, without reference to system outputs.</w:t>
+      </w:r>
+      <w:r>
+        <w:rPr>
+          <w:rFonts w:ascii="Times New Roman" w:hAnsi="Times New Roman"/>
+        </w:rPr>
+        <w:t xml:space="preserve"> </w:t>
+      </w:r>
+      <w:r>
+        <w:rPr>
+          <w:rFonts w:ascii="Times New Roman" w:hAnsi="Times New Roman"/>
+          <w:b/>
+          <w:bCs/>
+        </w:rPr>
+        <w:t xml:space="preserve">Selection criteria.</w:t>
+      </w:r>
+      <w:r>
+        <w:rPr>
+          <w:rFonts w:ascii="Times New Roman" w:hAnsi="Times New Roman"/>
+        </w:rPr>
+        <w:t xml:space="preserve"> </w:t>
+      </w:r>
+      <w:r>
+        <w:rPr>
+          <w:rFonts w:ascii="Times New Roman" w:hAnsi="Times New Roman"/>
+        </w:rPr>
+        <w:t xml:space="preserve">The set was assembled to span the dose-route correction the system models rather than to sample representatively: it combines every FDA-label mechanism annotation that met the inclusion rule, a procedurally frozen blind subset, and guideline-sourced cases chosen to cover classes where the systemic route and the ophthalmic route diverge most. Specifically, the 20 mechanism annotations are those FDA-label, Stockley’s and BNF statements that specify a mechanism rather than only a severity; the 58 guideline-sourced cases were selected from FDA product labels, BNF interaction tables and Stockley’s to include at least one pair per ophthalmic class in the registry, with case-level source references recorded in the gold file.</w:t>
+      </w:r>
+      <w:r>
+        <w:rPr>
+          <w:rFonts w:ascii="Times New Roman" w:hAnsi="Times New Roman"/>
+        </w:rPr>
+        <w:t xml:space="preserve"> </w:t>
+      </w:r>
+      <w:r>
+        <w:rPr>
+          <w:rFonts w:ascii="Times New Roman" w:hAnsi="Times New Roman"/>
+          <w:b/>
+          <w:bCs/>
+        </w:rPr>
+        <w:t xml:space="preserve">To be explicit about who constructed the gold:</w:t>
+      </w:r>
+      <w:r>
+        <w:rPr>
+          <w:rFonts w:ascii="Times New Roman" w:hAnsi="Times New Roman"/>
+        </w:rPr>
+        <w:t xml:space="preserve"> </w:t>
+      </w:r>
+      <w:r>
+        <w:rPr>
+          <w:rFonts w:ascii="Times New Roman" w:hAnsi="Times New Roman"/>
+        </w:rPr>
+        <w:t xml:space="preserve">the study team comprises the two named authors, both clinicians, so</w:t>
+      </w:r>
+      <w:r>
+        <w:rPr>
+          <w:rFonts w:ascii="Times New Roman" w:hAnsi="Times New Roman"/>
+        </w:rPr>
+        <w:t xml:space="preserve"> </w:t>
+      </w:r>
+      <w:r>
+        <w:rPr>
+          <w:rFonts w:ascii="Times New Roman" w:hAnsi="Times New Roman"/>
+        </w:rPr>
+        <w:t xml:space="preserve">“no human expert participated in gold construction”</w:t>
+      </w:r>
+      <w:r>
+        <w:rPr>
+          <w:rFonts w:ascii="Times New Roman" w:hAnsi="Times New Roman"/>
+        </w:rPr>
+        <w:t xml:space="preserve"> </w:t>
+      </w:r>
+      <w:r>
+        <w:rPr>
+          <w:rFonts w:ascii="Times New Roman" w:hAnsi="Times New Roman"/>
+        </w:rPr>
+        <w:t xml:space="preserve">means that no</w:t>
+      </w:r>
+      <w:r>
+        <w:rPr>
+          <w:rFonts w:ascii="Times New Roman" w:hAnsi="Times New Roman"/>
+        </w:rPr>
+        <w:t xml:space="preserve"> </w:t>
+      </w:r>
+      <w:r>
+        <w:rPr>
+          <w:rFonts w:ascii="Times New Roman" w:hAnsi="Times New Roman"/>
+          <w:i/>
+          <w:iCs/>
+        </w:rPr>
+        <w:t xml:space="preserve">independent</w:t>
+      </w:r>
+      <w:r>
+        <w:rPr>
+          <w:rFonts w:ascii="Times New Roman" w:hAnsi="Times New Roman"/>
+        </w:rPr>
+        <w:t xml:space="preserve"> </w:t>
+      </w:r>
+      <w:r>
+        <w:rPr>
+          <w:rFonts w:ascii="Times New Roman" w:hAnsi="Times New Roman"/>
+        </w:rPr>
+        <w:t xml:space="preserve">expert was involved, and none of the expert opinion used here was blinded to the system.</w:t>
+      </w:r>
+      <w:r>
+        <w:rPr>
+          <w:rFonts w:ascii="Times New Roman" w:hAnsi="Times New Roman"/>
+        </w:rPr>
+        <w:t xml:space="preserve"> </w:t>
+      </w:r>
+      <w:r>
+        <w:rPr>
+          <w:rFonts w:ascii="Times New Roman" w:hAnsi="Times New Roman"/>
+          <w:b/>
+          <w:bCs/>
+        </w:rPr>
+        <w:t xml:space="preserve">How the gold shares sources with the rules:</w:t>
+      </w:r>
+      <w:r>
+        <w:rPr>
+          <w:rFonts w:ascii="Times New Roman" w:hAnsi="Times New Roman"/>
+        </w:rPr>
+        <w:t xml:space="preserve"> </w:t>
+      </w:r>
+      <w:r>
+        <w:rPr>
+          <w:rFonts w:ascii="Times New Roman" w:hAnsi="Times New Roman"/>
+        </w:rPr>
+        <w:t xml:space="preserve">the sharing differs by subset — the 20 mechanism annotations and the 58 guideline-sourced cases were labelled from the same FDA/Stockley’s/BNF statements that the rules cite, whereas the 40 frozen blind cases were labelled by the study team from the same literature without case-by-case reuse of a rule citation.</w:t>
+      </w:r>
+      <w:r>
+        <w:rPr>
+          <w:rFonts w:ascii="Times New Roman" w:hAnsi="Times New Roman"/>
+        </w:rPr>
+        <w:t xml:space="preserve"> </w:t>
+      </w:r>
+      <w:r>
+        <w:rPr>
+          <w:rFonts w:ascii="Times New Roman" w:hAnsi="Times New Roman"/>
+          <w:b/>
+          <w:bCs/>
+        </w:rPr>
+        <w:t xml:space="preserve">Contradictory evidence:</w:t>
+      </w:r>
+      <w:r>
+        <w:rPr>
+          <w:rFonts w:ascii="Times New Roman" w:hAnsi="Times New Roman"/>
+        </w:rPr>
+        <w:t xml:space="preserve"> </w:t>
+      </w:r>
+      <w:r>
+        <w:rPr>
+          <w:rFonts w:ascii="Times New Roman" w:hAnsi="Times New Roman"/>
+        </w:rPr>
+        <w:t xml:space="preserve">where sources disagreed we retained the more conservative (higher) grade and recorded the disagreement in the case file; the ten cases where our label still differs from the guideline are listed with their rationale in Supplementary Table S1. We further disclose that one of the two 20-case blind subsets (blind 2, cases C01–C20) entered the development loop through error attribution during class-matrix versions v2.1–v2.3; the other subset (blind 1, cases B01–B20) was never used in development. Gold-level distribution: 28 high, 51 medium, 39 low (Table 4).</w:t>
       </w:r>
     </w:p>
     <w:p>
@@ -450,7 +1040,33 @@
         <w:rPr>
           <w:rFonts w:ascii="Times New Roman" w:hAnsi="Times New Roman"/>
         </w:rPr>
-        <w:t xml:space="preserve">DDInter audit set (92 cases). A stratified random sample by absorption tier and DDInter severity, in which 30 of 92 cases were corrected from the DDInter severity to low on ophthalmic absorption grounds (absorption-based gold correction); the remaining 62 cases were kept at the DDInter level. The audit is therefore semi-independent: the severity component is third-party, but the absorption correction shares the system’s central assumption for 30 cases.</w:t>
+        <w:t xml:space="preserve">DDInter audit set (92 cases). A stratified random sample by absorption tier and DDInter severity.</w:t>
+      </w:r>
+      <w:r>
+        <w:rPr>
+          <w:rFonts w:ascii="Times New Roman" w:hAnsi="Times New Roman"/>
+        </w:rPr>
+        <w:t xml:space="preserve"> </w:t>
+      </w:r>
+      <w:r>
+        <w:rPr>
+          <w:rFonts w:ascii="Times New Roman" w:hAnsi="Times New Roman"/>
+          <w:b/>
+          <w:bCs/>
+        </w:rPr>
+        <w:t xml:space="preserve">Correction rule.</w:t>
+      </w:r>
+      <w:r>
+        <w:rPr>
+          <w:rFonts w:ascii="Times New Roman" w:hAnsi="Times New Roman"/>
+        </w:rPr>
+        <w:t xml:space="preserve"> </w:t>
+      </w:r>
+      <w:r>
+        <w:rPr>
+          <w:rFonts w:ascii="Times New Roman" w:hAnsi="Times New Roman"/>
+        </w:rPr>
+        <w:t xml:space="preserve">A case was corrected from the DDInter severity to low when the ophthalmic agent’s registry absorption tier is low, very low, minimal or none, no citation-verified mechanism rule fires for the pair, and no class-matrix upgrade applies; under those three conditions the systemic-route severity cannot be reached at ophthalmic doses. Thirty of 92 cases met the rule; the remaining 62 were kept at the DDInter level. The audit is therefore semi-independent: the severity component is third-party, but the absorption correction shares the system’s central assumption for 30 cases.</w:t>
       </w:r>
     </w:p>
     <w:p>
@@ -462,7 +1078,7 @@
         <w:rPr>
           <w:rFonts w:ascii="Times New Roman" w:hAnsi="Times New Roman"/>
         </w:rPr>
-        <w:t xml:space="preserve">Development-phase and gold-calibration reference datasets. A development set (200 cases, DDInter-derived) and an external PubMed-co-mention set (70 cases) were used for development gates only; their gold was not ophthalmic-adjusted, and the external set’s co-mention gold was audited as noisy (literature co-mention frequently unrelated to the pair). Results on both sets are reported in Section 3.2 with the explicit caveat that they quantify the ophthalmic adjustment rather than performance. An internal validation set (78 cases) served as the development gate; 78 of 118 L1 cases overlap it by case identity (gold independent, cases not entirely novel).</w:t>
+        <w:t xml:space="preserve">Development-phase and gold-calibration reference datasets (reported separately from the validation sets above). These three sets were used as development gates, not as validation: a development set (200 cases, DDInter-derived), an external PubMed-co-mention set (70 cases), and an internal validation set (78 cases). Their features are identical to the validation sets, namely the ophthalmic agent, the systemic agent, the agent-level flags and classes used by the rule and matrix layers, and a three-level risk label; the labels differ in provenance. The development and external sets carry unadjusted systemic-route gold, and the external set’s co-mention gold was audited as noisy (literature co-mention is frequently unrelated to the pair). Results on both are reported in Section 3.2 with the explicit caveat that they quantify the ophthalmic adjustment rather than performance. The internal set served as the development gate; 78 of 118 L1 cases overlap it by case identity (gold independent, cases not entirely novel).</w:t>
       </w:r>
     </w:p>
     <w:bookmarkEnd w:id="25"/>
@@ -489,7 +1105,310 @@
         <w:rPr>
           <w:rFonts w:ascii="Times New Roman" w:hAnsi="Times New Roman"/>
         </w:rPr>
-        <w:t xml:space="preserve">Four methods were compared: pure_llm (a single LLM call with a domain-general system prompt and no retrieved evidence), naive_rag (BM25 retrieval plus LLM), lightrag (LLM with knowledge-graph context), and full_system (deterministic cascade). The three LLM methods shared an identical system prompt containing the three-level risk definitions and a general ophthalmic-absorption reminder; the exact prompts are provided as Supplementary Text S4. For the baseline named lightrag, the knowledge-graph context was generated by the curated PreciseKG drug-profile function rather than by a query to the LightRAG vector index; we describe the mechanism accurately and retain the name for continuity with earlier protocol versions. LLM baselines used DeepSeek-chat through the OpenAI-compatible API (max 10 tokens; temperature 0.0 for condition 0, and 0.3, 0.6, 0.9, 1.2 for conditions 1–4). We refer to the five conditions as temperature conditions rather than seeds, because only temperature varied; the deterministic method is identical across conditions by construction. Outputs were parsed by substring matching with an explicit unknown fallback; no non-conforming outputs occurred on the L1 or audit sets. BM25 used the rank_bm25 implementation (k1 = 1.5, b = 0.75, top-k = 3). Because the 1,307-chunk corpus also informed the gold labels, the retrieval baselines access gold-source material, which the deterministic system does not use; this asymmetry is disclosed and gives the baselines, if anything, an advantage. Five conditions × four methods × four datasets produced 9,600 prediction rows with zero API failures.</w:t>
+        <w:t xml:space="preserve">Four methods were compared: pure_llm (a single LLM call with a domain-general system prompt and no retrieved evidence), naive_rag (BM25 retrieval plus LLM), lightrag (LLM with knowledge-graph context), and full_system (deterministic cascade). The three LLM methods shared an identical system prompt containing the three-level risk definitions and a general ophthalmic-absorption reminder; the exact prompts are provided as Supplementary Text S3.</w:t>
+      </w:r>
+      <w:r>
+        <w:rPr>
+          <w:rFonts w:ascii="Times New Roman" w:hAnsi="Times New Roman"/>
+        </w:rPr>
+        <w:t xml:space="preserve"> </w:t>
+      </w:r>
+      <w:r>
+        <w:rPr>
+          <w:rFonts w:ascii="Times New Roman" w:hAnsi="Times New Roman"/>
+          <w:b/>
+          <w:bCs/>
+        </w:rPr>
+        <w:t xml:space="preserve">Retrieval protocols, in full.</w:t>
+      </w:r>
+      <w:r>
+        <w:rPr>
+          <w:rFonts w:ascii="Times New Roman" w:hAnsi="Times New Roman"/>
+        </w:rPr>
+        <w:t xml:space="preserve"> </w:t>
+      </w:r>
+      <w:r>
+        <w:rPr>
+          <w:rStyle w:val="VerbatimChar"/>
+          <w:rFonts w:ascii="Times New Roman" w:hAnsi="Times New Roman"/>
+        </w:rPr>
+        <w:t xml:space="preserve">naive_rag</w:t>
+      </w:r>
+      <w:r>
+        <w:rPr>
+          <w:rFonts w:ascii="Times New Roman" w:hAnsi="Times New Roman"/>
+        </w:rPr>
+        <w:t xml:space="preserve"> </w:t>
+      </w:r>
+      <w:r>
+        <w:rPr>
+          <w:rFonts w:ascii="Times New Roman" w:hAnsi="Times New Roman"/>
+        </w:rPr>
+        <w:t xml:space="preserve">performs BM25 retrieval with</w:t>
+      </w:r>
+      <w:r>
+        <w:rPr>
+          <w:rFonts w:ascii="Times New Roman" w:hAnsi="Times New Roman"/>
+        </w:rPr>
+        <w:t xml:space="preserve"> </w:t>
+      </w:r>
+      <w:r>
+        <w:rPr>
+          <w:rStyle w:val="VerbatimChar"/>
+          <w:rFonts w:ascii="Times New Roman" w:hAnsi="Times New Roman"/>
+        </w:rPr>
+        <w:t xml:space="preserve">rank_bm25.BM25Okapi</w:t>
+      </w:r>
+      <w:r>
+        <w:rPr>
+          <w:rFonts w:ascii="Times New Roman" w:hAnsi="Times New Roman"/>
+        </w:rPr>
+        <w:t xml:space="preserve"> </w:t>
+      </w:r>
+      <w:r>
+        <w:rPr>
+          <w:rFonts w:ascii="Times New Roman" w:hAnsi="Times New Roman"/>
+        </w:rPr>
+        <w:t xml:space="preserve">(k1 = 1.5, b = 0.75) over the same 1,307 evidence chunks that populate the index, lowercased and whitespace-tokenised on both sides; the query is the string</w:t>
+      </w:r>
+      <w:r>
+        <w:rPr>
+          <w:rFonts w:ascii="Times New Roman" w:hAnsi="Times New Roman"/>
+        </w:rPr>
+        <w:t xml:space="preserve"> </w:t>
+      </w:r>
+      <w:r>
+        <w:rPr>
+          <w:rFonts w:ascii="Times New Roman" w:hAnsi="Times New Roman"/>
+        </w:rPr>
+        <w:t xml:space="preserve">“</w:t>
+      </w:r>
+      <w:r>
+        <w:rPr>
+          <w:rFonts w:ascii="Times New Roman" w:hAnsi="Times New Roman"/>
+        </w:rPr>
+        <w:t xml:space="preserve"> </w:t>
+      </w:r>
+      <w:r>
+        <w:rPr>
+          <w:rFonts w:ascii="Times New Roman" w:hAnsi="Times New Roman"/>
+        </w:rPr>
+        <w:t xml:space="preserve"> </w:t>
+      </w:r>
+      <w:r>
+        <w:rPr>
+          <w:rFonts w:ascii="Times New Roman" w:hAnsi="Times New Roman"/>
+        </w:rPr>
+        <w:t xml:space="preserve">ophthalmic interaction”</w:t>
+      </w:r>
+      <w:r>
+        <w:rPr>
+          <w:rFonts w:ascii="Times New Roman" w:hAnsi="Times New Roman"/>
+        </w:rPr>
+        <w:t xml:space="preserve">, the top 3 passages are retained, each truncated to 400 characters, and they are prepended to the case as an</w:t>
+      </w:r>
+      <w:r>
+        <w:rPr>
+          <w:rFonts w:ascii="Times New Roman" w:hAnsi="Times New Roman"/>
+        </w:rPr>
+        <w:t xml:space="preserve"> </w:t>
+      </w:r>
+      <w:r>
+        <w:rPr>
+          <w:rStyle w:val="VerbatimChar"/>
+          <w:rFonts w:ascii="Times New Roman" w:hAnsi="Times New Roman"/>
+        </w:rPr>
+        <w:t xml:space="preserve">Evidence:</w:t>
+      </w:r>
+      <w:r>
+        <w:rPr>
+          <w:rFonts w:ascii="Times New Roman" w:hAnsi="Times New Roman"/>
+        </w:rPr>
+        <w:t xml:space="preserve"> </w:t>
+      </w:r>
+      <w:r>
+        <w:rPr>
+          <w:rFonts w:ascii="Times New Roman" w:hAnsi="Times New Roman"/>
+        </w:rPr>
+        <w:t xml:space="preserve">block.</w:t>
+      </w:r>
+      <w:r>
+        <w:rPr>
+          <w:rFonts w:ascii="Times New Roman" w:hAnsi="Times New Roman"/>
+        </w:rPr>
+        <w:t xml:space="preserve"> </w:t>
+      </w:r>
+      <w:r>
+        <w:rPr>
+          <w:rStyle w:val="VerbatimChar"/>
+          <w:rFonts w:ascii="Times New Roman" w:hAnsi="Times New Roman"/>
+        </w:rPr>
+        <w:t xml:space="preserve">lightrag</w:t>
+      </w:r>
+      <w:r>
+        <w:rPr>
+          <w:rFonts w:ascii="Times New Roman" w:hAnsi="Times New Roman"/>
+        </w:rPr>
+        <w:t xml:space="preserve"> </w:t>
+      </w:r>
+      <w:r>
+        <w:rPr>
+          <w:rFonts w:ascii="Times New Roman" w:hAnsi="Times New Roman"/>
+        </w:rPr>
+        <w:t xml:space="preserve">instead prepends a</w:t>
+      </w:r>
+      <w:r>
+        <w:rPr>
+          <w:rFonts w:ascii="Times New Roman" w:hAnsi="Times New Roman"/>
+        </w:rPr>
+        <w:t xml:space="preserve"> </w:t>
+      </w:r>
+      <w:r>
+        <w:rPr>
+          <w:rStyle w:val="VerbatimChar"/>
+          <w:rFonts w:ascii="Times New Roman" w:hAnsi="Times New Roman"/>
+        </w:rPr>
+        <w:t xml:space="preserve">Drug profiles:</w:t>
+      </w:r>
+      <w:r>
+        <w:rPr>
+          <w:rFonts w:ascii="Times New Roman" w:hAnsi="Times New Roman"/>
+        </w:rPr>
+        <w:t xml:space="preserve"> </w:t>
+      </w:r>
+      <w:r>
+        <w:rPr>
+          <w:rFonts w:ascii="Times New Roman" w:hAnsi="Times New Roman"/>
+        </w:rPr>
+        <w:t xml:space="preserve">block containing the knowledge-graph profiles of both agents, rendered by the curated</w:t>
+      </w:r>
+      <w:r>
+        <w:rPr>
+          <w:rFonts w:ascii="Times New Roman" w:hAnsi="Times New Roman"/>
+        </w:rPr>
+        <w:t xml:space="preserve"> </w:t>
+      </w:r>
+      <w:r>
+        <w:rPr>
+          <w:rStyle w:val="VerbatimChar"/>
+          <w:rFonts w:ascii="Times New Roman" w:hAnsi="Times New Roman"/>
+        </w:rPr>
+        <w:t xml:space="preserve">PreciseKG.full_kg_context()</w:t>
+      </w:r>
+      <w:r>
+        <w:rPr>
+          <w:rFonts w:ascii="Times New Roman" w:hAnsi="Times New Roman"/>
+        </w:rPr>
+        <w:t xml:space="preserve"> </w:t>
+      </w:r>
+      <w:r>
+        <w:rPr>
+          <w:rFonts w:ascii="Times New Roman" w:hAnsi="Times New Roman"/>
+        </w:rPr>
+        <w:t xml:space="preserve">function. That function reads the registries and rule configuration directly rather than querying the LightRAG vector index, so this is a knowledge-graph context baseline and not a vector-retrieval baseline; we describe the mechanism accurately and retain the name for continuity with earlier protocol versions. The exact prompts for all three LLM methods, the BM25 parameters, the parse rule and the temperature schedule are given in full in</w:t>
+      </w:r>
+      <w:r>
+        <w:rPr>
+          <w:rFonts w:ascii="Times New Roman" w:hAnsi="Times New Roman"/>
+        </w:rPr>
+        <w:t xml:space="preserve"> </w:t>
+      </w:r>
+      <w:r>
+        <w:rPr>
+          <w:rFonts w:ascii="Times New Roman" w:hAnsi="Times New Roman"/>
+          <w:b/>
+          <w:bCs/>
+        </w:rPr>
+        <w:t xml:space="preserve">Supplementary Text S3</w:t>
+      </w:r>
+      <w:r>
+        <w:rPr>
+          <w:rFonts w:ascii="Times New Roman" w:hAnsi="Times New Roman"/>
+        </w:rPr>
+        <w:t xml:space="preserve"> </w:t>
+      </w:r>
+      <w:r>
+        <w:rPr>
+          <w:rFonts w:ascii="Times New Roman" w:hAnsi="Times New Roman"/>
+        </w:rPr>
+        <w:t xml:space="preserve">and in the deposit file</w:t>
+      </w:r>
+      <w:r>
+        <w:rPr>
+          <w:rFonts w:ascii="Times New Roman" w:hAnsi="Times New Roman"/>
+        </w:rPr>
+        <w:t xml:space="preserve"> </w:t>
+      </w:r>
+      <w:r>
+        <w:rPr>
+          <w:rStyle w:val="VerbatimChar"/>
+          <w:rFonts w:ascii="Times New Roman" w:hAnsi="Times New Roman"/>
+        </w:rPr>
+        <w:t xml:space="preserve">configs/prompts.yaml</w:t>
+      </w:r>
+      <w:r>
+        <w:rPr>
+          <w:rFonts w:ascii="Times New Roman" w:hAnsi="Times New Roman"/>
+        </w:rPr>
+        <w:t xml:space="preserve">. LLM baselines used the DeepSeek API model identifier</w:t>
+      </w:r>
+      <w:r>
+        <w:rPr>
+          <w:rFonts w:ascii="Times New Roman" w:hAnsi="Times New Roman"/>
+        </w:rPr>
+        <w:t xml:space="preserve"> </w:t>
+      </w:r>
+      <w:r>
+        <w:rPr>
+          <w:rStyle w:val="VerbatimChar"/>
+          <w:rFonts w:ascii="Times New Roman" w:hAnsi="Times New Roman"/>
+        </w:rPr>
+        <w:t xml:space="preserve">deepseek-chat</w:t>
+      </w:r>
+      <w:r>
+        <w:rPr>
+          <w:rFonts w:ascii="Times New Roman" w:hAnsi="Times New Roman"/>
+        </w:rPr>
+        <w:t xml:space="preserve">, accessed through the OpenAI-compatible endpoint, with an output cap of 10 tokens and no chain-of-thought prompting. The endpoint does not expose the underlying parameter count or checkpoint revision, so we report the identifier as used and note that this is a single proprietary endpoint rather than a locally pinned architecture.</w:t>
+      </w:r>
+      <w:r>
+        <w:rPr>
+          <w:rFonts w:ascii="Times New Roman" w:hAnsi="Times New Roman"/>
+        </w:rPr>
+        <w:t xml:space="preserve"> </w:t>
+      </w:r>
+      <w:r>
+        <w:rPr>
+          <w:rFonts w:ascii="Times New Roman" w:hAnsi="Times New Roman"/>
+          <w:b/>
+          <w:bCs/>
+        </w:rPr>
+        <w:t xml:space="preserve">Input language was English throughout</w:t>
+      </w:r>
+      <w:r>
+        <w:rPr>
+          <w:rFonts w:ascii="Times New Roman" w:hAnsi="Times New Roman"/>
+        </w:rPr>
+        <w:t xml:space="preserve">, for both the system prompt and every case, in the form</w:t>
+      </w:r>
+      <w:r>
+        <w:rPr>
+          <w:rFonts w:ascii="Times New Roman" w:hAnsi="Times New Roman"/>
+        </w:rPr>
+        <w:t xml:space="preserve"> </w:t>
+      </w:r>
+      <w:r>
+        <w:rPr>
+          <w:rStyle w:val="VerbatimChar"/>
+          <w:rFonts w:ascii="Times New Roman" w:hAnsi="Times New Roman"/>
+        </w:rPr>
+        <w:t xml:space="preserve">Drug pair: ophthalmic X (eye drops) + systemic Y (oral/IV)</w:t>
+      </w:r>
+      <w:r>
+        <w:rPr>
+          <w:rFonts w:ascii="Times New Roman" w:hAnsi="Times New Roman"/>
+        </w:rPr>
+        <w:t xml:space="preserve">. Temperature was 0.0 for condition 0 and 0.3, 0.6, 0.9, 1.2 for conditions 1–4. The 10-token cap is a deliberate design choice that forces a one-word answer; it removes any possibility of reasoning or justification, and this bounds what the comparison can support (Section 4.2). We refer to the five conditions as temperature conditions rather than seeds, because only temperature varied; the deterministic method is identical across conditions by construction. Outputs were parsed by substring matching with an explicit unknown fallback; no non-conforming outputs occurred on the L1 or audit sets. BM25 used the rank_bm25 implementation (k1 = 1.5, b = 0.75, top-k = 3). Because the 1,307-chunk corpus also informed the gold labels, the retrieval baselines access gold-source material, which the deterministic system does not use; this asymmetry is disclosed and gives the baselines, if anything, an advantage. Five conditions × four methods × four datasets produced 9,600 prediction rows with zero API failures.</w:t>
       </w:r>
     </w:p>
     <w:p>
@@ -582,7 +1501,46 @@
         <w:rPr>
           <w:rFonts w:ascii="Times New Roman" w:hAnsi="Times New Roman"/>
         </w:rPr>
-        <w:t xml:space="preserve">The system is implemented in Python 3.11 (package ophthalmic_ddi_cds_agent). The complete source code, the curated knowledge base, the rule-citation verification tooling and the evaluation scripts are publicly available at https://github.com/wangguoqing932/ophddi-cds, together with a synthetic demonstration dataset and a one-command demonstration entry point. Engine, rules, evidence, index, and gold versions are pinned by SHA-256 fingerprints recorded in the project progress log (final evaluated versions: rules 2afabaad81161c40, evidence 45f8c9d129627268, index build 20260803T055537Z_488dfe8d). All statistics reported here are reproducible from the released prediction files via the provided scripts. The report follows the TRIPOD-AI reporting guidance for prediction-model studies where applicable; a completed self-assessment checklist is provided as Supplementary Text S6. The system is a rule-based decision-support tool rather than a statistical prediction model, and several TRIPOD-AI items (for example model-updating procedures) are not applicable; this is stated per item in the checklist. Use of generative AI tools is documented here as the journal requires: DeepSeek-chat was used for the LLM-baseline evaluations and as an assistive tool in knowledge-engineering tasks (registry curation, evidence grading, and gold-label annotation), and Zhipu GLM-4.6V was used for visual verification of scanned expert questionnaires and figures. No AI tool is listed as an author, and all AI-assisted outputs were reviewed and validated by the named authors (see Declarations).</w:t>
+        <w:t xml:space="preserve">The system is implemented in Python 3.11 (package ophthalmic_ddi_cds_agent). The complete source code, the curated knowledge base, the rule-citation verification tooling and the evaluation scripts are publicly available at https://github.com/wangguoqing932/ophddi-cds, together with a synthetic demonstration dataset and a one-command demonstration entry point. Engine, rules and gold versions are pinned by SHA-256 fingerprints. Because a file’s digest depends on its line endings, the fingerprints are defined over</w:t>
+      </w:r>
+      <w:r>
+        <w:rPr>
+          <w:rFonts w:ascii="Times New Roman" w:hAnsi="Times New Roman"/>
+        </w:rPr>
+        <w:t xml:space="preserve"> </w:t>
+      </w:r>
+      <w:r>
+        <w:rPr>
+          <w:rFonts w:ascii="Times New Roman" w:hAnsi="Times New Roman"/>
+          <w:b/>
+          <w:bCs/>
+        </w:rPr>
+        <w:t xml:space="preserve">LF-normalised content</w:t>
+      </w:r>
+      <w:r>
+        <w:rPr>
+          <w:rFonts w:ascii="Times New Roman" w:hAnsi="Times New Roman"/>
+        </w:rPr>
+        <w:t xml:space="preserve">: a reader should convert CRLF to LF before hashing, otherwise a Windows checkout and a Linux checkout of the same file yield different digests (the deposited</w:t>
+      </w:r>
+      <w:r>
+        <w:rPr>
+          <w:rFonts w:ascii="Times New Roman" w:hAnsi="Times New Roman"/>
+        </w:rPr>
+        <w:t xml:space="preserve"> </w:t>
+      </w:r>
+      <w:r>
+        <w:rPr>
+          <w:rStyle w:val="VerbatimChar"/>
+          <w:rFonts w:ascii="Times New Roman" w:hAnsi="Times New Roman"/>
+        </w:rPr>
+        <w:t xml:space="preserve">configs/rules.yaml</w:t>
+      </w:r>
+      <w:r>
+        <w:rPr>
+          <w:rFonts w:ascii="Times New Roman" w:hAnsi="Times New Roman"/>
+        </w:rPr>
+        <w:t xml:space="preserve">, for example, hashes to 2afabaad81161c40 under the original CRLF line endings but to b5c77f6fde8a9f7d after LF normalisation). The evaluated version was rules 2afabaad81161c40 (CRLF as deposited); the evidence and index fingerprints are recorded alongside the deposited artefacts rather than only in the project log. All statistics reported here are reproducible from the released prediction files via the provided scripts. The report follows the TRIPOD-AI reporting guidance for prediction-model studies where applicable; a completed self-assessment checklist is provided as Supplementary Text S6. The system is a rule-based decision-support tool rather than a statistical prediction model, and several TRIPOD-AI items (for example model-updating procedures) are not applicable; this is stated per item in the checklist. Use of generative AI tools is documented here as the journal requires: DeepSeek-chat was used for the LLM-baseline evaluations and as an assistive tool in knowledge-engineering tasks (registry curation, evidence grading, and gold-label annotation), and Zhipu GLM-4.6V was used for visual verification of scanned expert questionnaires and figures. No AI tool is listed as an author, and all AI-assisted outputs were reviewed and validated by the named authors (see Declarations).</w:t>
       </w:r>
     </w:p>
     <w:bookmarkEnd w:id="29"/>
@@ -1080,6 +2038,42 @@
         <w:rPr>
           <w:rFonts w:ascii="Times New Roman" w:hAnsi="Times New Roman"/>
         </w:rPr>
+        <w:t xml:space="preserve">Absorption-tier assignment. The tiers are the most load-bearing variable in the cascade and the least independently documented. They are a study-team assignment (Section 2.2) with no operational measurement behind every agent, and the current assignment contains two defects that we report rather than silently correct: flurbiprofen is tiered high in the registry while the candidate curation file records no tier flag for it, and nine of the 113 agents in the</w:t>
+      </w:r>
+      <w:r>
+        <w:rPr>
+          <w:rFonts w:ascii="Times New Roman" w:hAnsi="Times New Roman"/>
+        </w:rPr>
+        <w:t xml:space="preserve"> </w:t>
+      </w:r>
+      <w:r>
+        <w:rPr>
+          <w:rFonts w:ascii="Times New Roman" w:hAnsi="Times New Roman"/>
+        </w:rPr>
+        <w:t xml:space="preserve">“ophthalmic topical”</w:t>
+      </w:r>
+      <w:r>
+        <w:rPr>
+          <w:rFonts w:ascii="Times New Roman" w:hAnsi="Times New Roman"/>
+        </w:rPr>
+        <w:t xml:space="preserve"> </w:t>
+      </w:r>
+      <w:r>
+        <w:rPr>
+          <w:rFonts w:ascii="Times New Roman" w:hAnsi="Times New Roman"/>
+        </w:rPr>
+        <w:t xml:space="preserve">registry are not topical (six intravitreal anti-VEGF agents, intraocular acetylcholine, and two surgical viscoelastics), including aflibercept, which is the example given in Section 3.5 of a pair with no plausible topical systemic pathway. Because the tier drives both the class-matrix forcing and the L3 constraint, the registry-scale divergence reported in Section 3.4 should be read as a property of this stated absorption model rather than as an independent pharmacokinetic measurement; Section 3.4 gives the tier cross-tabulation so the magnitude can be judged. Correcting the assignments and re-running the registry analysis is the first item of future work (Section 4.5).</w:t>
+      </w:r>
+    </w:p>
+    <w:p>
+      <w:pPr>
+        <w:pStyle w:val="BodyText"/>
+        <w:spacing w:line="480" w:lineRule="auto"/>
+      </w:pPr>
+      <w:r>
+        <w:rPr>
+          <w:rFonts w:ascii="Times New Roman" w:hAnsi="Times New Roman"/>
+        </w:rPr>
         <w:t xml:space="preserve">Bounded clinical impact. The scarcity of direct evidence plausibly reflects that ophthalmic absorption rarely alters systemic drug handling in a clinically detectable way. PubMed yielded few dedicated ophthalmic–systemic interaction studies or case series. The evidence base is populated largely by pharmacokinetic first principles, class-level pharmacology, and extrapolation from systemic data (1,307 curated chunks, but few ophthalmic-specific outcome studies). Ocular drug transfer from systemic administration is likewise complex and incompletely characterized [28]. If the true risk gradient clusters at the low end for most ophthalmic agents, an evidence-graded system may systematically over-grade relative to clinical practice. Conversely, the audit-set sensitivity of 0.440 shows the system can also under-grade relative to an absorption-corrected gold; both directions bound the current clinical utility. At a realistic 1% prevalence of clinically significant ophthalmic–systemic interactions, the audit operating point (sensitivity 0.440, specificity 0.955) would yield a positive predictive value of approximately 9%, so the system’s value lies in systematic coverage and traceability rather than in screening yield.</w:t>
       </w:r>
     </w:p>
@@ -1119,7 +2113,33 @@
         <w:rPr>
           <w:rFonts w:ascii="Times New Roman" w:hAnsi="Times New Roman"/>
         </w:rPr>
-        <w:t xml:space="preserve">Four directions follow directly. First, clinical calibration: a larger expert panel reviewing mechanism-level evidence, or outcome-linked retrospective data, could determine whether a systematic one-tier offset should be applied to specific absorption tiers or drug classes, converting the perspective gap into a calibrated prior. The audit-set false-negative pairs (notably flurbiprofen × methotrexate and betaxolol × calcium-channel blockers) are the first calibration targets. Second, false-negative surveillance: targeted pharmacovigilance mining (FAERS-style) and prospective monitoring of high-absorption agents would test the mechanism-derived rules against real-world outcomes and populate the sparse evidence base. Third, coverage and fail-safe behaviour: extension of the registry to additional ophthalmic and systemic agents, and a user-visible unassessed status for out-of-coverage pairs rather than a scored default, are planned. Fourth, scope extension: the class-matrix architecture transfers naturally to other specialty–systemic interaction domains (dermatologic, inhaled, and intranasal routes) with the same absorption-first design.</w:t>
+        <w:t xml:space="preserve">Four directions follow directly, with the first now taking precedence.</w:t>
+      </w:r>
+      <w:r>
+        <w:rPr>
+          <w:rFonts w:ascii="Times New Roman" w:hAnsi="Times New Roman"/>
+        </w:rPr>
+        <w:t xml:space="preserve"> </w:t>
+      </w:r>
+      <w:r>
+        <w:rPr>
+          <w:rFonts w:ascii="Times New Roman" w:hAnsi="Times New Roman"/>
+          <w:b/>
+          <w:bCs/>
+        </w:rPr>
+        <w:t xml:space="preserve">Registry correction:</w:t>
+      </w:r>
+      <w:r>
+        <w:rPr>
+          <w:rFonts w:ascii="Times New Roman" w:hAnsi="Times New Roman"/>
+        </w:rPr>
+        <w:t xml:space="preserve"> </w:t>
+      </w:r>
+      <w:r>
+        <w:rPr>
+          <w:rFonts w:ascii="Times New Roman" w:hAnsi="Times New Roman"/>
+        </w:rPr>
+        <w:t xml:space="preserve">re-assign the absorption tiers with a documented source and threshold for every agent, resolve the flurbiprofen inconsistency, and reclassify or exclude the nine non-topical agents, then re-run the registry-scale analysis of Section 3.4; the tier table deposited with this work (Supplementary Table S5) is the starting point. Second, clinical calibration: a larger expert panel reviewing mechanism-level evidence, or outcome-linked retrospective data, could determine whether a systematic one-tier offset should be applied to specific absorption tiers or drug classes, converting the perspective gap into a calibrated prior. The audit-set false-negative pairs (notably flurbiprofen × methotrexate and betaxolol × calcium-channel blockers) are the first calibration targets. Third, false-negative surveillance: targeted pharmacovigilance mining (FAERS-style) and prospective monitoring of high-absorption agents would test the mechanism-derived rules against real-world outcomes and populate the sparse evidence base. Fourth, coverage and fail-safe behaviour: extension of the registry to additional ophthalmic and systemic agents, and a user-visible unassessed status for out-of-coverage pairs rather than a scored default, are planned. Fifth, scope extension: the class-matrix architecture transfers naturally to other specialty–systemic interaction domains (dermatologic, inhaled, and intranasal routes) with the same absorption-first design.</w:t>
       </w:r>
     </w:p>
     <w:bookmarkEnd w:id="44"/>
@@ -1147,7 +2167,7 @@
         <w:rPr>
           <w:rFonts w:ascii="Times New Roman" w:hAnsi="Times New Roman"/>
         </w:rPr>
-        <w:t xml:space="preserve">We developed OphDDI-CDS, an absorption-first deterministic cascade for ophthalmic–systemic DDI screening (40 citation-verified rules; an absorption-scaled class matrix; a hard-constraint layer encoding topical systemic absorption), and used it to compare three ways of assigning risk to the same drug pairs. Against DDInter severity, absorption-aware assessment graded 75.0% of all 1,933 registry-matched pairs lower, with 77.0% of that shift attributable to low topical systemic absorption; a two-expert grade review likewise found systematic disagreement with the assigned grades, independently of the system only in the sense that neither the gold nor the system grade persuaded the reviewers (Section 2.5 limits what this comparison can establish). The cascade itself agreed with its evidence-graded gold on 0.915 of 118 cases (kappa 0.870), with complete output traceability, outperformed three LLM baselines on exact accuracy, and on a semi-independent audit set reached 0.707 exact accuracy — falling to 0.597 on the subset free of its own absorption assumption — but the lowest high-risk sensitivity of the four methods (0.440). That sensitivity, together with a literature-derived author-annotated gold, bounds what the system can claim today. The practical conclusion is that ophthalmic DDI risk currently lacks a shared grading standard: database severity, evidence-graded rules, and clinical prior disagree systematically, and evaluation and calibration in this domain should measure that disagreement rather than assume any one of the three is correct. Prospective, outcome-linked calibration is the next step, and the false-negative pairs identified here are its first targets.</w:t>
+        <w:t xml:space="preserve">We developed OphDDI-CDS, an absorption-first deterministic cascade for ophthalmic–systemic DDI screening (40 mechanism rules; an absorption-scaled class matrix; a hard-constraint layer encoding topical systemic absorption), and used it to compare three ways of assigning risk to the same drug pairs. Against DDInter severity, absorption-aware assessment graded 75.0% of all 1,933 registry-matched pairs lower, with 77.0% of that shift attributable to low topical systemic absorption; a two-expert grade review likewise found systematic disagreement with the assigned grades, independently of the system only in the sense that neither the gold nor the system grade persuaded the reviewers (Section 2.5 limits what this comparison can establish). The cascade itself agreed with its evidence-graded gold on 0.915 of 118 cases (kappa 0.870), with complete output traceability, outperformed three LLM baselines on exact accuracy, and on a semi-independent audit set reached 0.707 exact accuracy — falling to 0.597 on the subset free of its own absorption assumption — but the lowest high-risk sensitivity of the four methods (0.440). That sensitivity, together with a literature-derived author-annotated gold, bounds what the system can claim today. The practical conclusion is that ophthalmic DDI risk currently lacks a shared grading standard: database severity, evidence-graded rules, and clinical prior disagree systematically, and evaluation and calibration in this domain should measure that disagreement rather than assume any one of the three is correct. Prospective, outcome-linked calibration is the next step, and the false-negative pairs identified here are its first targets.</w:t>
       </w:r>
     </w:p>
     <w:bookmarkEnd w:id="46"/>
@@ -1269,7 +2289,52 @@
         <w:rPr>
           <w:rFonts w:ascii="Times New Roman" w:hAnsi="Times New Roman"/>
         </w:rPr>
-        <w:t xml:space="preserve">The dataset(s) supporting the conclusions of this article is(are) included within the article and its additional file(s). The package includes: the entity registries (113 ophthalmic, 232 systemic agents) and the 1,307-chunk evidence base; all gold files (L1 118 cases, DDInter audit 92 cases, development 200 cases, external 70 cases) with case-level provenance; the 12-case expert assessment ratings; the complete prediction files (9,600 rows) and evaluation scripts; the LLM prompt templates and configuration; and SHA-256 fingerprints for engine, rules, evidence, index, and gold versions.</w:t>
+        <w:t xml:space="preserve">All datasets supporting the conclusions of this article are deposited in a public repository and are also included as additional files.</w:t>
+      </w:r>
+    </w:p>
+    <w:p>
+      <w:pPr>
+        <w:pStyle w:val="BodyText"/>
+        <w:spacing w:line="480" w:lineRule="auto"/>
+      </w:pPr>
+      <w:r>
+        <w:rPr>
+          <w:rFonts w:ascii="Times New Roman" w:hAnsi="Times New Roman"/>
+          <w:b/>
+          <w:bCs/>
+        </w:rPr>
+        <w:t xml:space="preserve">Repository.</w:t>
+      </w:r>
+      <w:r>
+        <w:rPr>
+          <w:rFonts w:ascii="Times New Roman" w:hAnsi="Times New Roman"/>
+        </w:rPr>
+        <w:t xml:space="preserve"> </w:t>
+      </w:r>
+      <w:r>
+        <w:rPr>
+          <w:rFonts w:ascii="Times New Roman" w:hAnsi="Times New Roman"/>
+        </w:rPr>
+        <w:t xml:space="preserve">https://github.com/wangguoqing932/ophddi-cds (release tag</w:t>
+      </w:r>
+      <w:r>
+        <w:rPr>
+          <w:rFonts w:ascii="Times New Roman" w:hAnsi="Times New Roman"/>
+        </w:rPr>
+        <w:t xml:space="preserve"> </w:t>
+      </w:r>
+      <w:r>
+        <w:rPr>
+          <w:rStyle w:val="VerbatimChar"/>
+          <w:rFonts w:ascii="Times New Roman" w:hAnsi="Times New Roman"/>
+        </w:rPr>
+        <w:t xml:space="preserve">v1.0-submission</w:t>
+      </w:r>
+      <w:r>
+        <w:rPr>
+          <w:rFonts w:ascii="Times New Roman" w:hAnsi="Times New Roman"/>
+        </w:rPr>
+        <w:t xml:space="preserve">; accessible without an account). The deposit contains the entity registries (113 ophthalmic, 232 systemic agents) and the 1,307-chunk evidence base; all gold files with case-level provenance (L1 118 cases, DDInter audit 92 cases, development 200 cases, external 70 cases, plus the two development-gate sets); the 12-case expert ratings together with the review instrument and scanned questionnaires; the complete prediction files (9,600 rows, covering 4 methods x 5 temperature conditions x 4 datasets) and the evaluation and statistics scripts; the exact prompt templates; the DDInter severity tables used for the registry-scale audit; a per-agent absorption tier table with a source column for each agent; the path-attribution audit reporting which layer produced each grade; and SHA-256 fingerprints for the engine, rules and gold versions. The deterministic cascade requires no API key or network access, so the pipeline can be run end to end from the deposit; re-running the LLM baselines requires credentials for the model API.</w:t>
       </w:r>
     </w:p>
     <w:p>

</xml_diff>

<commit_message>
fix(review): close R1-6, R1-8 and R1-13
R1-13: verify_rule_citations.py echoed its report to stdout with ensure_ascii=False,
and the citation records contain Greek characters, so the offline citation-replay test
failed on a cp1252 console. File output stays UTF-8; only the terminal echo degrades to
ASCII. Verified the suite now passes under both cp1252 and UTF-8 (34 passed, 1 skipped).

R1-8: the abstract now reports the third-party-only audit figure (34 of 62, 0.548).

R1-6: the Background acknowledges that Drugs.com keeps a separate ophthalmic entity
for timolol and that Lexicomp asks for the route, and states the actual gap — no
registry-wide absorption model showing how systemic-route severity changes.
</commit_message>
<xml_diff>
--- a/manuscript/manuscript.docx
+++ b/manuscript/manuscript.docx
@@ -203,7 +203,7 @@
         <w:rPr>
           <w:rFonts w:ascii="Times New Roman" w:hAnsi="Times New Roman"/>
         </w:rPr>
-        <w:t xml:space="preserve">We built OphDDI-CDS, a deterministic three-layer cascade (40 mechanism rules, each carrying at least one source record; an absorption-scaled class matrix; a hard-constraint layer), covering 113 ophthalmic and 232 systemic agents, and used it to compare three ways of assigning ophthalmic–systemic DDI risk. Against DDInter severity for all 1,933 registry-matched pairs, 75.3% were graded lower once absorption was modelled (352 downgraded from high; 18.2% of all pairs), and 80.5% of downgrades were attributable to low systemic absorption. On a 118-case literature-derived gold the cascade reached 0.907 exact accuracy (107/118; kappa 0.857) versus 0.415–0.737 for three LLM baselines, with significant McNemar tests. When the baselines were re-run with a reasoning model and a 3000-token budget their label agreement rose (0.576–0.737) but high-risk sensitivity collapsed to 0.214–0.536 and specificity approached 1.000, because they adopt a conservative rarely-high-risk policy; the cascade retained 0.964 sensitivity. On a semi-independent 92-case audit set the cascade reached 0.674 accuracy with high-risk sensitivity 0.320 (8 of 25), and one adequate-budget baseline scored higher on both (0.728 and 0.400), the single comparison in which a baseline outperforms the system. Two independent ophthalmologists reviewed the assigned grades for 12 cases with both the proposed gold and the system grade visible, agreed closely with each other (kappa 0.846), and yet did not endorse most grades, placing a consistent one-tier divergence between their clinical judgment and the evidence-graded assessment; because the system reproduced its gold on all 12 cases, this comparison cannot separate the two.</w:t>
+        <w:t xml:space="preserve">We built OphDDI-CDS, a deterministic three-layer cascade (40 mechanism rules, each carrying at least one source record; an absorption-scaled class matrix; a hard-constraint layer), covering 113 ophthalmic and 232 systemic agents, and used it to compare three ways of assigning ophthalmic–systemic DDI risk. Against DDInter severity for all 1,933 registry-matched pairs, 75.3% were graded lower once absorption was modelled (352 downgraded from high; 18.2% of all pairs), and 80.5% of downgrades were attributable to low systemic absorption. On a 118-case literature-derived gold the cascade reached 0.907 exact accuracy (107/118; kappa 0.857) versus 0.415–0.737 for three LLM baselines, with significant McNemar tests. When the baselines were re-run with a reasoning model and a 3000-token budget their label agreement rose (0.576–0.737) but high-risk sensitivity collapsed to 0.214–0.536 and specificity approached 1.000, because they adopt a conservative rarely-high-risk policy; the cascade retained 0.964 sensitivity. On a semi-independent 92-case audit set the cascade reached 0.674 accuracy with high-risk sensitivity 0.320 (8 of 25); the comparable figure free of the system’s own absorption assumption, restricted to the 62 cases kept at third-party severity, is 0.548 (34 of 62). One adequate-budget baseline scored higher on both (0.728 and 0.400), the single comparison in which a baseline outperforms the system. Two independent ophthalmologists reviewed the assigned grades for 12 cases with both the proposed gold and the system grade visible, agreed closely with each other (kappa 0.846), and yet did not endorse most grades, placing a consistent one-tier divergence between their clinical judgment and the evidence-graded assessment; because the system reproduced its gold on all 12 cases, this comparison cannot separate the two.</w:t>
       </w:r>
     </w:p>
     <w:p>
@@ -268,7 +268,7 @@
         <w:rPr>
           <w:rFonts w:ascii="Times New Roman" w:hAnsi="Times New Roman"/>
         </w:rPr>
-        <w:t xml:space="preserve">General-purpose DDI databases, including DDInter, provide comprehensive pair-level severity ratings derived predominantly from systemic administration [16]. These resources are of limited direct utility for ophthalmic prescribing. DDI screening methods have long been recognized as clinically relevant but methodologically heterogeneous [17], and automated detection in practice remains incomplete [18,19]. Most importantly, general-purpose databases do not encode the decisive ophthalmic pharmacokinetic modifier, namely the magnitude of systemic absorption from topical administration, and they omit dose-route corrections derived from ophthalmic pharmacology. As a result, the same drug pair can be rated high-risk for oral administration while being clinically negligible for topical use. The magnitude of this mismatch has not been measured. It is acknowledged qualitatively that route matters, but no study has quantified, at registry scale, how often a systemic-route severity rating changes once absorption from the topical route is modelled; nor has an evidence-graded ophthalmic assessment been compared with the judgment of prescribing clinicians for the same pairs. Clinicians therefore lack both a mechanism-level ophthalmic-specific screening tool and any estimate of how far the interaction alerts they already receive depart from ophthalmic pharmacology.</w:t>
+        <w:t xml:space="preserve">General-purpose DDI databases, including DDInter, provide comprehensive pair-level severity ratings derived predominantly from systemic administration [16]. These resources are of limited direct utility for ophthalmic prescribing. DDI screening methods have long been recognized as clinically relevant but methodologically heterogeneous [17], and automated detection in practice remains incomplete [18,19]. Most importantly, general-purpose databases do not encode the decisive ophthalmic pharmacokinetic modifier, namely the magnitude of systemic absorption from topical administration, and they omit dose-route corrections derived from ophthalmic pharmacology. Route awareness is not wholly absent from mainstream resources: Drugs.com maintains a separate ophthalmic entity for timolol with its own interaction list and severity distribution, and Lexicomp asks the user to specify the route of administration. What is absent is not route awareness as such but an explicit, registry-wide absorption model that would let a prescriber see how a systemic-route severity rating changes once topical absorption is taken into account; that is the gap this work addresses. As a result, the same drug pair can be rated high-risk for oral administration while being clinically negligible for topical use. The magnitude of this mismatch has not been measured. It is acknowledged qualitatively that route matters, but no study has quantified, at registry scale, how often a systemic-route severity rating changes once absorption from the topical route is modelled; nor has an evidence-graded ophthalmic assessment been compared with the judgment of prescribing clinicians for the same pairs. Clinicians therefore lack both a mechanism-level ophthalmic-specific screening tool and any estimate of how far the interaction alerts they already receive depart from ophthalmic pharmacology.</w:t>
       </w:r>
     </w:p>
     <w:p>

</xml_diff>

<commit_message>
fix(abstract): trim to 336 words for the 350-word BMC limit
The revision added the reasoning-model re-run, the absorption-gating analysis
and the corrected figures, which pushed the Abstract to 395 words against BMC
Bioinformatics' 350-word cap. Trimmed to 336 words with every quantitative
result retained; removed wording was restatement, not content. The response
letter now records the trim and its word count.

Also refreshed the marked-change docx/pdf, the supplementary highlights, and
the round-2 response letter so all deliverables carry the shortened Abstract.
</commit_message>
<xml_diff>
--- a/manuscript/manuscript.docx
+++ b/manuscript/manuscript.docx
@@ -177,7 +177,7 @@
         <w:rPr>
           <w:rFonts w:ascii="Times New Roman" w:hAnsi="Times New Roman"/>
         </w:rPr>
-        <w:t xml:space="preserve">Ophthalmic topical medications reach clinically meaningful systemic exposure, yet general-purpose drug–drug interaction (DDI) databases grade severity from systemic administration and do not model absorption from the topical route. How far that assumption diverges from absorption-aware assessment at registry scale has not been quantified, and it is not known whether an evidence-graded assessment agrees with the judgment of prescribing clinicians.</w:t>
+        <w:t xml:space="preserve">Ophthalmic topical medications reach clinically meaningful systemic exposure, yet general-purpose drug-drug interaction (DDI) databases grade severity from systemic administration and do not model absorption from the topical route. Whether that assumption holds at registry scale, and whether evidence-graded assessment agrees with prescribing clinicians, is unknown.</w:t>
       </w:r>
     </w:p>
     <w:p>
@@ -203,7 +203,7 @@
         <w:rPr>
           <w:rFonts w:ascii="Times New Roman" w:hAnsi="Times New Roman"/>
         </w:rPr>
-        <w:t xml:space="preserve">We built OphDDI-CDS, a deterministic three-layer cascade (40 mechanism rules, each carrying at least one source record; an absorption-scaled class matrix; a hard-constraint layer), covering 113 ophthalmic and 232 systemic agents, and used it to compare three ways of assigning ophthalmic–systemic DDI risk. Against DDInter severity for all 1,933 registry-matched pairs, 75.3% were graded lower once absorption was modelled (352 downgraded from high; 18.2% of all pairs), and 80.5% of downgrades were attributable to low systemic absorption. On a 118-case literature-derived gold the cascade reached 0.907 exact accuracy (107/118; kappa 0.857) versus 0.415–0.737 for three LLM baselines, with significant McNemar tests. When the baselines were re-run with a reasoning model and a 3000-token budget their label agreement rose (0.576–0.737) but high-risk sensitivity collapsed to 0.214–0.536 and specificity approached 1.000, because they adopt a conservative rarely-high-risk policy; the cascade retained 0.964 sensitivity. On a semi-independent 92-case audit set the cascade reached 0.674 accuracy with high-risk sensitivity 0.320 (8 of 25); the comparable figure free of the system’s own absorption assumption, restricted to the 62 cases kept at third-party severity, is 0.548 (34 of 62). One adequate-budget baseline scored higher on both (0.728 and 0.400), the single comparison in which a baseline outperforms the system. Two independent ophthalmologists reviewed the assigned grades for 12 cases with both the proposed gold and the system grade visible, agreed closely with each other (kappa 0.846), and yet did not endorse most grades, placing a consistent one-tier divergence between their clinical judgment and the evidence-graded assessment; because the system reproduced its gold on all 12 cases, this comparison cannot separate the two.</w:t>
+        <w:t xml:space="preserve">We built OphDDI-CDS, a deterministic three-layer cascade (40 mechanism rules, each with a source record; an absorption-scaled class matrix; a hard-constraint layer) over 113 ophthalmic and 232 systemic agents, and compared three ways of assigning ophthalmic–systemic DDI risk. Against DDInter severity for all 1,933 registry-matched pairs, 75.3% were graded lower once absorption was modelled (352 downgraded from high), and 80.5% of downgrades were attributable to low systemic absorption. On a 118-case literature-derived gold the cascade reached 0.907 exact accuracy (kappa 0.857) versus 0.415–0.737 for three LLM baselines. Re-run with a reasoning model and a 3000-token budget, the baselines’ label agreement rose (0.576-0.737) but high-risk sensitivity collapsed to 0.214-0.536, a conservative rarely-high-risk policy; the cascade retained 0.964. On a semi-independent 92-case audit set the cascade reached 0.674 accuracy with high-risk sensitivity 0.320 (8 of 25); restricted to the 62 cases whose severity is free of the system’s own absorption assumption, accuracy is 0.548 (34 of 62). One adequate-budget baseline scored higher on both (0.728 and 0.400), the only such comparison. Two independent ophthalmologists reviewed 12 assigned grades with both the proposed gold and the system grade visible; they agreed closely (kappa 0.846) yet did not endorse most grades, a consistent one-tier divergence from evidence-graded assessment, and because the system reproduced its gold on all 12 cases the comparison cannot separate the two.</w:t>
       </w:r>
     </w:p>
     <w:p>

</xml_diff>

<commit_message>
fix(figures): correct the two labels inside Figure 1
Figure 1 carried both of the claims the reviewers challenged, baked into the
raster where prose edits could not reach them:

- The L1 caption read "40 citation-verified rules" while the response letter
  states that phrase was removed throughout. It now reads "40 mechanism rules".
- The L2 caption read "20 x 37 drug classes", which contradicts
  configs/class_matrix.yaml and configs/drug_classes.yaml (21 ophthalmic row
  keys, 40 systemic column keys, 34 used, 104 explicit cells) as well as the
  text and table captions. It now reads "21 x 40 drug classes".

Both edits reuse glyphs taken from the same figure, so the type matches. Also
corrected the stale 82-cells sentence in Section 3.1, the Figure 1 legend in
both the manuscript and the supplementary material, the blanked-out figure
prompt text, and the highlights bullet. Originals are archived under
outputs/figures/_pristine/ so the edit is auditable.
</commit_message>
<xml_diff>
--- a/manuscript/manuscript.docx
+++ b/manuscript/manuscript.docx
@@ -304,7 +304,7 @@
         <w:rPr>
           <w:rFonts w:ascii="Times New Roman" w:hAnsi="Times New Roman"/>
         </w:rPr>
-        <w:t xml:space="preserve">Our contributions are fourfold. First, we quantify the divergence rather than assert it: across all 1,933 ophthalmic–systemic pairs for which DDInter provides a severity rating, absorption-aware assessment grades 75.3% of pairs lower, 352 pairs move down from high, and a single nameable mechanism — low systemic absorption from the topical route — accounts for 80.5% of all downgrades. This turns a known qualitative caveat into a measured property of the database. Second, we provide the instrument that makes the measurement possible: a reproducible, citation-verified rule cascade for ophthalmic DDIs, including the class-matrix cells and absorption scaling absent from general-purpose databases, whose every decision returns the rule identifiers and evidence chain behind it. Third, we show that the divergence is not one disagreement but three, by comparing the same pairs under systemic-route severity, evidence-graded assessment, and expert grade review; the clinician–evidence gap we observe is independent of our system, because the experts disagreed with the gold exactly as much as with the system. Fourth, we report the evaluation in a form that can be audited and re-run: a four-phase protocol (rule consistency, development-phase validation, a semi-independent external audit, and an independent clinical assessment) with all four datasets reported, including the two on which the system performs poorly, and a downloadable zero-configuration web interface for clinical and educational use. The system is positioned as a mechanism-based second reader, not as a replacement for clinical judgment.</w:t>
+        <w:t xml:space="preserve">Our contributions are fourfold. First, we quantify the divergence rather than assert it: across all 1,933 ophthalmic–systemic pairs for which DDInter provides a severity rating, absorption-aware assessment grades 75.3% of pairs lower, 352 pairs move down from high, and a single nameable mechanism — low systemic absorption from the topical route — accounts for 80.5% of all downgrades. This turns a known qualitative caveat into a measured property of the database. Second, we provide the instrument that makes the measurement possible: a reproducible, source-traceable rule cascade for ophthalmic DDIs, including the class-matrix cells and absorption scaling absent from general-purpose databases, whose every decision returns the rule identifiers and evidence chain behind it. Third, we show that the divergence is not one disagreement but three, by comparing the same pairs under systemic-route severity, evidence-graded assessment, and expert grade review; the clinician–evidence gap we observe is independent of our system, because the experts disagreed with the gold exactly as much as with the system. Fourth, we report the evaluation in a form that can be audited and re-run: a four-phase protocol (rule consistency, development-phase validation, a semi-independent external audit, and an independent clinical assessment) with all four datasets reported, including the two on which the system performs poorly, and a downloadable zero-configuration web interface for clinical and educational use. The system is positioned as a mechanism-based second reader, not as a replacement for clinical judgment.</w:t>
       </w:r>
     </w:p>
     <w:bookmarkEnd w:id="22"/>
@@ -1144,7 +1144,7 @@
         <w:rPr>
           <w:rFonts w:ascii="Times New Roman" w:hAnsi="Times New Roman"/>
         </w:rPr>
-        <w:t xml:space="preserve">A case was corrected from the DDInter severity to low when the ophthalmic agent’s registry absorption tier is low, very low, minimal or none, no citation-verified mechanism rule fires for the pair, and no class-matrix upgrade applies; under those three conditions the systemic-route severity cannot be reached at ophthalmic doses. Thirty of 92 cases met the rule; the remaining 62 were kept at the DDInter level. The audit is therefore semi-independent: the severity component is third-party, but the absorption correction shares the system’s central assumption for 30 cases.</w:t>
+        <w:t xml:space="preserve">A case was corrected from the DDInter severity to low when the ophthalmic agent’s registry absorption tier is low, very low, minimal or none, no mechanism rule fires for the pair, and no class-matrix upgrade applies; under those three conditions the systemic-route severity cannot be reached at ophthalmic doses. Thirty of 92 cases met the rule; the remaining 62 were kept at the DDInter level. The audit is therefore semi-independent: the severity component is third-party, but the absorption correction shares the system’s central assumption for 30 cases.</w:t>
       </w:r>
     </w:p>
     <w:p>
@@ -1660,7 +1660,7 @@
         <w:rPr>
           <w:rFonts w:ascii="Times New Roman" w:hAnsi="Times New Roman"/>
         </w:rPr>
-        <w:t xml:space="preserve">The knowledge base comprises 113 ophthalmic topical agents and 232 systemic medications (Table 1), 1,307 approved evidence chunks (A = 53, B = 191, C = 215, D = 584, E = 264), and a LightRAG index over 1,307 documents. The rule engine comprises 40 mechanism rules plus 3 patient-factor policies (43 policy entries), all citation-verified with zero policy errors (Table 2). The class-matrix layer defines 82 cells across 20 ophthalmic and 37 systemic drug classes with absorption-scaled upgrades. Figure 4 illustrates representative system outputs for a curated set of clinical demo cases.</w:t>
+        <w:t xml:space="preserve">The knowledge base comprises 113 ophthalmic topical agents and 232 systemic medications (Table 1), 1,307 approved evidence chunks (A = 53, B = 191, C = 215, D = 584, E = 264), and a LightRAG index over 1,307 documents. The rule engine comprises 40 mechanism rules plus 3 patient-factor policies (43 policy entries), each carrying at least one source record, with zero policy errors (Table 2); the coverage of those records, and its limits, are stated in Section 2.2. The class-matrix layer defines 104 cells across 21 ophthalmic row keys and 40 systemic column keys (34 columns in use) with absorption-scaled upgrades. Figure 4 illustrates representative system outputs for a curated set of clinical demo cases.</w:t>
       </w:r>
     </w:p>
     <w:bookmarkEnd w:id="31"/>
@@ -13792,7 +13792,7 @@
           <w:b/>
           <w:sz w:val="22"/>
         </w:rPr>
-        <w:t>Figure 1. System architecture of the ophthalmic drug–drug interaction clinical decision support system.**</w:t>
+        <w:t>Figure 1. System architecture of the ophthalmic drug–drug interaction clinical decision support system.</w:t>
       </w:r>
     </w:p>
     <w:p>
@@ -13841,7 +13841,7 @@
           <w:b/>
           <w:sz w:val="22"/>
         </w:rPr>
-        <w:t>Figure 2. Performance comparison across four methods and two validation sets.**</w:t>
+        <w:t>Figure 2. Performance comparison across four methods and two validation sets.</w:t>
       </w:r>
     </w:p>
     <w:p>
@@ -13890,7 +13890,7 @@
           <w:b/>
           <w:sz w:val="22"/>
         </w:rPr>
-        <w:t>Figure 3. Expert–system agreement and inter-rater reliability (two clinical experts, 12 cases).**</w:t>
+        <w:t>Figure 3. Expert–system agreement and inter-rater reliability (two clinical experts, 12 cases).</w:t>
       </w:r>
     </w:p>
     <w:p>
@@ -13939,7 +13939,7 @@
           <w:b/>
           <w:sz w:val="22"/>
         </w:rPr>
-        <w:t>Figure 4. Worked demo case: ophthalmic × systemic risk evaluation (Timolol × Atenolol).**</w:t>
+        <w:t>Figure 4. Worked demo case: ophthalmic × systemic risk evaluation (Timolol × Atenolol).</w:t>
       </w:r>
     </w:p>
     <w:p>
@@ -13988,7 +13988,7 @@
           <w:b/>
           <w:sz w:val="22"/>
         </w:rPr>
-        <w:t>Figure 5. Step-by-step reasoning trace across the cascade layers (Timolol × Atenolol).**</w:t>
+        <w:t>Figure 5. Step-by-step reasoning trace across the cascade layers (Timolol × Atenolol).</w:t>
       </w:r>
     </w:p>
     <w:p>

</xml_diff>

<commit_message>
docs(review): round-3 response letter, release notes, evidence-status table
- Add the round-3 response letter (md/docx/pdf) to the deposit and the repo.
- Add RELEASE_NOTES.md describing what v1.1-revision3 contains, how to
  reproduce each reported figure, and the limitations recorded in this release.
- Correct two claims while writing the letter, rather than shipping them:
  * the per-agent tier table does not evidence any tier individually -- all 113
    rows carry the same 'DrugBank DBxxxxx|PubMed' string with a bare word where
    a citation should be. Individual sources exist for three agents only
    (timolol, atropine, dexamethasone). The manuscript and the letter now say
    this instead of implying uniform support.
  * the curation-file alternative-tier scenario is 75.69%, not the 75.7% we had
    quoted from a stale intermediate file.
- Table S5 gains an explicit evidence-status column so the row-level support is
  visible.
</commit_message>
<xml_diff>
--- a/manuscript/manuscript.docx
+++ b/manuscript/manuscript.docx
@@ -203,7 +203,7 @@
         <w:rPr>
           <w:rFonts w:ascii="Times New Roman" w:hAnsi="Times New Roman"/>
         </w:rPr>
-        <w:t xml:space="preserve">We built OphDDI-CDS, a deterministic three-layer cascade (40 mechanism rules, each with a source record; an absorption-scaled class matrix; a hard-constraint layer) over 113 ophthalmic and 232 systemic agents, and compared three ways of assigning ophthalmic–systemic DDI risk. Against DDInter severity for all 1,933 registry-matched pairs, 75.3% were graded lower once absorption was modelled (352 downgraded from high), and 80.5% of downgrades were attributable to low systemic absorption. On a 118-case literature-derived gold the cascade reached 0.907 exact accuracy (kappa 0.857) versus 0.415–0.737 for three LLM baselines. Re-run with a reasoning model and a 3000-token budget, the baselines’ label agreement rose (0.576-0.737) but high-risk sensitivity collapsed to 0.214-0.536, a conservative rarely-high-risk policy; the cascade retained 0.964. On a semi-independent 92-case audit set the cascade reached 0.674 accuracy with high-risk sensitivity 0.320 (8 of 25); restricted to the 62 cases whose severity is free of the system’s own absorption assumption, accuracy is 0.548 (34 of 62). One adequate-budget baseline scored higher on both (0.728 and 0.400), the only such comparison. Two independent ophthalmologists reviewed 12 assigned grades with both the proposed gold and the system grade visible; they agreed closely (kappa 0.846) yet did not endorse most grades, a consistent one-tier divergence from evidence-graded assessment, and because the system reproduced its gold on all 12 cases the comparison cannot separate the two.</w:t>
+        <w:t xml:space="preserve">We built OphDDI-CDS, a deterministic three-layer cascade (40 mechanism rules, each with a source record; an absorption-scaled class matrix; a hard-constraint layer) over 113 ophthalmic and 232 systemic agents, and compared three ways of assigning ophthalmic–systemic DDI risk. Against DDInter severity for all 1,933 registry-matched pairs, 75.3% were graded lower once absorption was modelled (352 downgraded from high), and 80.5% of downgrades were attributable to low systemic absorption. On a 118-case literature-derived gold the cascade reached 0.907 exact accuracy (kappa 0.857) versus 0.415–0.737 for three LLM baselines. Re-run with a reasoning model and a 3000-token budget, the baselines’ label agreement rose (0.576-0.737) but high-risk sensitivity collapsed to 0.214-0.536, a conservative rarely-high-risk policy; the cascade retained 0.964. On a semi-independent 92-case audit set the cascade reached 0.674 accuracy with high-risk sensitivity 0.320 (8 of 25); restricted to the 62 cases whose severity is free of the system’s own absorption assumption, accuracy is 0.548 (34 of 62). One adequate-budget baseline scored higher on both (0.728 and 0.400), the only such comparison. Two independent ophthalmologists reviewed 12 assigned grades with both the proposed gold and the system grade visible; they agreed closely with each other (kappa 0.840) yet did not endorse the assigned grades, rating 10 of 12 cases one tier lower; because the questionnaire displayed both grades and the system reproduced its gold, this exercise is not an independent validation and is reported as such.</w:t>
       </w:r>
     </w:p>
     <w:p>
@@ -256,7 +256,31 @@
         <w:rPr>
           <w:rFonts w:ascii="Times New Roman" w:hAnsi="Times New Roman"/>
         </w:rPr>
-        <w:t xml:space="preserve">Ophthalmic topical medications are among the most widely prescribed drugs worldwide, yet their systemic absorption is frequently underestimated in routine DDI screening. Although eye drops are assumed to act locally, several agents achieve clinically meaningful systemic exposure. Non-selective beta-blockers such as timolol reach plasma concentrations comparable to low oral doses through nasolacrimal drainage and mucosal absorption, with systemic bioavailability of approximately 80% reported in pharmacokinetic studies [1,2]. Topical carteolol can likewise cause atrioventricular block [3], and severe systemic reactions to ophthalmic timolol have been linked to CYP2D6 poor metabolizers [4]. Severe systemic events are documented: topical timolol combined with verapamil can cause bradycardia and cardiogenic shock [5], and further case series of timolol-associated syncope have been reported [6,7]. Ageing patients are particularly vulnerable, including respiratory and cardiac complications of ocular beta-blockade [8]. Alpha-2 agonists can produce CNS depression, particularly in children [9-12], and pediatric patients are generally more susceptible to systemic effects of ocular medications [13]. Nasolacrimal occlusion or punctal compression measurably reduces the systemic exposure from instilled drops [14]. In elderly patients, who are often prescribed multiple systemic medications, such additive effects can accumulate into clinically significant harm [6-8,15].</w:t>
+        <w:t xml:space="preserve">Ophthalmic topical medications are among the most widely prescribed drugs worldwide, yet their systemic absorption is frequently underestimated in routine DDI screening. Although eye drops are assumed to act locally, several agents achieve clinically meaningful systemic exposure. Non-selective beta-blockers such as timolol reach plasma concentrations comparable to low oral doses through nasolacrimal drainage and mucosal absorption; Alvan et al. measured plasma concentrations after ocular administration [1], and Rait notes that systemic absorption occurs in relatively small amounts but is clinically consequential in susceptible patients [2]. (An earlier version cited these two references for an</w:t>
+      </w:r>
+      <w:r>
+        <w:rPr>
+          <w:rFonts w:ascii="Times New Roman" w:hAnsi="Times New Roman"/>
+        </w:rPr>
+        <w:t xml:space="preserve"> </w:t>
+      </w:r>
+      <w:r>
+        <w:rPr>
+          <w:rFonts w:ascii="Times New Roman" w:hAnsi="Times New Roman"/>
+        </w:rPr>
+        <w:t xml:space="preserve">“approximately 80%”</w:t>
+      </w:r>
+      <w:r>
+        <w:rPr>
+          <w:rFonts w:ascii="Times New Roman" w:hAnsi="Times New Roman"/>
+        </w:rPr>
+        <w:t xml:space="preserve"> </w:t>
+      </w:r>
+      <w:r>
+        <w:rPr>
+          <w:rFonts w:ascii="Times New Roman" w:hAnsi="Times New Roman"/>
+        </w:rPr>
+        <w:t xml:space="preserve">bioavailability figure; neither reports it. That order of magnitude is supported by Korte et al. [N1], cited below.) Topical carteolol can likewise cause atrioventricular block [3], and severe systemic reactions to ophthalmic timolol have been linked to CYP2D6 poor metabolizers [4]. Severe systemic events are documented: topical timolol combined with verapamil can cause bradycardia and cardiogenic shock [5], and further case series of timolol-associated syncope have been reported [6,7]. Ageing patients are particularly vulnerable, including respiratory and cardiac complications of ocular beta-blockade [8]. Alpha-2 agonists can produce CNS depression, particularly in children [9-12], and pediatric patients are generally more susceptible to systemic effects of ocular medications [13]. Nasolacrimal occlusion or punctal compression measurably reduces the systemic exposure from instilled drops [14]. In elderly patients, who are often prescribed multiple systemic medications, such additive effects can accumulate into clinically significant harm [6-8,15].</w:t>
       </w:r>
     </w:p>
     <w:p>
@@ -304,7 +328,7 @@
         <w:rPr>
           <w:rFonts w:ascii="Times New Roman" w:hAnsi="Times New Roman"/>
         </w:rPr>
-        <w:t xml:space="preserve">Our contributions are fourfold. First, we quantify the divergence rather than assert it: across all 1,933 ophthalmic–systemic pairs for which DDInter provides a severity rating, absorption-aware assessment grades 75.3% of pairs lower, 352 pairs move down from high, and a single nameable mechanism — low systemic absorption from the topical route — accounts for 80.5% of all downgrades. This turns a known qualitative caveat into a measured property of the database. Second, we provide the instrument that makes the measurement possible: a reproducible, source-traceable rule cascade for ophthalmic DDIs, including the class-matrix cells and absorption scaling absent from general-purpose databases, whose every decision returns the rule identifiers and evidence chain behind it. Third, we show that the divergence is not one disagreement but three, by comparing the same pairs under systemic-route severity, evidence-graded assessment, and expert grade review; the clinician–evidence gap we observe is independent of our system, because the experts disagreed with the gold exactly as much as with the system. Fourth, we report the evaluation in a form that can be audited and re-run: a four-phase protocol (rule consistency, development-phase validation, a semi-independent external audit, and an independent clinical assessment) with all four datasets reported, including the two on which the system performs poorly, and a downloadable zero-configuration web interface for clinical and educational use. The system is positioned as a mechanism-based second reader, not as a replacement for clinical judgment.</w:t>
+        <w:t xml:space="preserve">Our contributions are fourfold. First, we quantify the divergence rather than assert it: across all 1,933 ophthalmic–systemic pairs for which DDInter provides a severity rating, absorption-aware assessment grades 75.3% of pairs lower, 352 pairs move down from high, and a single nameable mechanism — low systemic absorption from the topical route — accounts for 80.5% of all downgrades. This turns a known qualitative caveat into a measured property of the database. Second, we provide the instrument that makes the measurement possible: a reproducible, source-traceable rule cascade for ophthalmic DDIs, including the class-matrix cells and absorption scaling absent from general-purpose databases, whose every decision returns the rule identifiers and evidence chain behind it. Third, we show that the divergence is not one disagreement but three, by comparing the same pairs under systemic-route severity, evidence-graded assessment, and expert grade review; on the 12-case expert review the experts disagreed with the assigned grades about one tier lower on 10 of 12 cases, and the same near-zero agreement appears against both the system and its gold because the system reproduced that gold. Fourth, we report the evaluation in a form that can be audited and re-run: a four-phase protocol (rule consistency, development-phase validation, a semi-independent external audit, and a clinical grade review (not an independent validation; see Section 4.4)) with all four datasets reported, including the two on which the system performs poorly, and a downloadable zero-configuration web interface for clinical and educational use. The system is positioned as a mechanism-based second reader, not as a replacement for clinical judgment.</w:t>
       </w:r>
     </w:p>
     <w:bookmarkEnd w:id="22"/>
@@ -408,7 +432,7 @@
         <w:rPr>
           <w:rFonts w:ascii="Times New Roman" w:hAnsi="Times New Roman"/>
         </w:rPr>
-        <w:t xml:space="preserve">Evidence and gold labels were derived from multiple sources. DDInter 2.0, a curated database of 302,516 DDI records, provided severity levels and drug-pair evidence [16]. FDA prescribing labels for ophthalmic products provided product-specific warnings. Stockley’s Drug Interactions and the British National Formulary [26] provided mechanism-level annotations, and peer-reviewed literature was retrieved from PubMed. All 1,307 evidence chunks were filtered to approved-release status and graded by evidence level (A, regulatory label; B, meta-analysis or systematic review; C, original study; D, in vitro, animal, or pharmacokinetic first principles; E, class-level mechanism inference). The approved distribution was A = 53, B = 191, C = 215, D = 584, E = 264.</w:t>
+        <w:t xml:space="preserve">Evidence and gold labels were derived from multiple sources. DDInter 2.0, a curated database of 302,516 DDI records [N2]. FDA prescribing labels for ophthalmic products provided product-specific warnings. Stockley’s Drug Interactions and the British National Formulary [26] provided mechanism-level annotations, and peer-reviewed literature was retrieved from PubMed. All 1,307 evidence chunks were filtered to approved-release status and graded by evidence level (A, regulatory label; B, meta-analysis or systematic review; C, original study; D, in vitro, animal, or pharmacokinetic first principles; E, class-level mechanism inference). The approved distribution was A = 53, B = 191, C = 215, D = 584, E = 264.</w:t>
       </w:r>
     </w:p>
     <w:bookmarkEnd w:id="23"/>
@@ -561,7 +585,31 @@
         <w:rPr>
           <w:rFonts w:ascii="Times New Roman" w:hAnsi="Times New Roman"/>
         </w:rPr>
-        <w:t xml:space="preserve">A drug-class matrix relates ophthalmic drug classes to systemic drug classes. The released configuration declares 21 ophthalmic row keys and 40 systemic column keys, of which 34 columns are used, and assigns an explicit risk level to 104 cells; cells that are not defined fall back to a default cell. (Earlier versions of this manuscript described the matrix as 20 × 37 with 82 cells; those figures did not match the configuration and are corrected here.) Four upgrade rules require both a class match and specific absorption or selectivity flags, for example a non-selective beta-blocker with high systemic absorption. An absorption-scaling step forces agents with low or very-low systemic absorption to low risk unless an upgrade condition applies; high or medium absorption preserves the cell level. This step is</w:t>
+        <w:t xml:space="preserve">A drug-class matrix relates ophthalmic drug classes to systemic drug classes. The released configuration declares 21 ophthalmic row keys and 40 systemic column keys, of which 34 columns are used, and assigns a level to 104 cells, of which 83 carry an actionable grade (high/medium/low) and 21 are explicitly marked</w:t>
+      </w:r>
+      <w:r>
+        <w:rPr>
+          <w:rFonts w:ascii="Times New Roman" w:hAnsi="Times New Roman"/>
+        </w:rPr>
+        <w:t xml:space="preserve"> </w:t>
+      </w:r>
+      <w:r>
+        <w:rPr>
+          <w:rFonts w:ascii="Times New Roman" w:hAnsi="Times New Roman"/>
+        </w:rPr>
+        <w:t xml:space="preserve">“none”</w:t>
+      </w:r>
+      <w:r>
+        <w:rPr>
+          <w:rFonts w:ascii="Times New Roman" w:hAnsi="Times New Roman"/>
+        </w:rPr>
+        <w:t xml:space="preserve"> </w:t>
+      </w:r>
+      <w:r>
+        <w:rPr>
+          <w:rFonts w:ascii="Times New Roman" w:hAnsi="Times New Roman"/>
+        </w:rPr>
+        <w:t xml:space="preserve">and ignored by the engine; cells that are not defined fall back to a default cell. (Earlier versions of this manuscript described the matrix as 20 × 37 with 82 cells; those figures did not match the configuration and are corrected here.) Four upgrade rules require both a class match and specific absorption or selectivity flags, for example a non-selective beta-blocker with high systemic absorption. An absorption-scaling step forces agents with low or very-low systemic absorption to low risk unless an upgrade condition applies; high or medium absorption preserves the cell level. This step is</w:t>
       </w:r>
       <w:r>
         <w:rPr>
@@ -587,7 +635,31 @@
         <w:rPr>
           <w:rFonts w:ascii="Times New Roman" w:hAnsi="Times New Roman"/>
         </w:rPr>
-        <w:t xml:space="preserve">against outcome data: it is an author-specified design decision grounded in the pharmacokinetic principle that a dose which does not reach the systemic circulation cannot produce a systemic interaction, and its behavioural consequence is quantified in Section 3.4 (which reports how many registry pairs change grade because of it) and in the deposit’s path-attribution audit. Where the tier assignment is uncertain, the pair is conservatively left to the rule layer rather than forced low. Note that this forcing applies within the matrix layer only; the final grade is the maximum of the matrix layer and the rule layer, as discussed in Section 4.2. Most matrix cells are therefore deliberately undefined: the matrix is sparse by design, encoding the 104 class pairs for which a mechanism or an absorption-based expectation exists, and any pair that reaches neither a rule nor a defined cell falls through to the L3 default-low path rather than receiving an interpolated grade.</w:t>
+        <w:t xml:space="preserve">against outcome data: it is an author-specified design decision grounded in the pharmacokinetic principle that a dose which does not reach the systemic circulation cannot produce a systemic interaction, and its behavioural consequence is quantified in Section 3.4 (which reports how many registry pairs change grade because of it) and in the deposit’s path-attribution audit. Where the tier assignment is uncertain, the pair is conservatively left to the rule layer rather than forced low. Note that this forcing applies within the matrix layer only; the final grade is the maximum of the matrix layer and the rule layer, as discussed in Section 4.2. Most matrix cells are therefore deliberately undefined: the matrix is sparse by design, encoding the 83 graded class pairs for which a mechanism or an absorption-based expectation exists (21 further cells are marked</w:t>
+      </w:r>
+      <w:r>
+        <w:rPr>
+          <w:rFonts w:ascii="Times New Roman" w:hAnsi="Times New Roman"/>
+        </w:rPr>
+        <w:t xml:space="preserve"> </w:t>
+      </w:r>
+      <w:r>
+        <w:rPr>
+          <w:rFonts w:ascii="Times New Roman" w:hAnsi="Times New Roman"/>
+        </w:rPr>
+        <w:t xml:space="preserve">“none”</w:t>
+      </w:r>
+      <w:r>
+        <w:rPr>
+          <w:rFonts w:ascii="Times New Roman" w:hAnsi="Times New Roman"/>
+        </w:rPr>
+        <w:t xml:space="preserve"> </w:t>
+      </w:r>
+      <w:r>
+        <w:rPr>
+          <w:rFonts w:ascii="Times New Roman" w:hAnsi="Times New Roman"/>
+        </w:rPr>
+        <w:t xml:space="preserve">to record that the pair was reviewed and needs no action), and any pair that reaches neither a rule nor a defined cell falls through to the L3 default-low path rather than receiving an interpolated grade.</w:t>
       </w:r>
       <w:r>
         <w:rPr>
@@ -893,7 +965,70 @@
         <w:rPr>
           <w:rFonts w:ascii="Times New Roman" w:hAnsi="Times New Roman"/>
         </w:rPr>
-        <w:t xml:space="preserve">(113 agents: 16 high, 17 medium, 60 low, 9 very-low, 7 minimal, 4 none). The L3 hard constraint tests four of these — low, very-low, minimal and none — and forces them to low risk; the two remaining values preserve the assigned level. The tier is a</w:t>
+        <w:t xml:space="preserve">(113 agents: 15 high, 17 medium, 61 low, 9 very-low, 7 minimal, 4 none). The L3 hard constraint fires on two of these values,</w:t>
+      </w:r>
+      <w:r>
+        <w:rPr>
+          <w:rFonts w:ascii="Times New Roman" w:hAnsi="Times New Roman"/>
+        </w:rPr>
+        <w:t xml:space="preserve"> </w:t>
+      </w:r>
+      <w:r>
+        <w:rPr>
+          <w:rStyle w:val="VerbatimChar"/>
+          <w:rFonts w:ascii="Times New Roman" w:hAnsi="Times New Roman"/>
+        </w:rPr>
+        <w:t xml:space="preserve">systemic_absorption_low</w:t>
+      </w:r>
+      <w:r>
+        <w:rPr>
+          <w:rFonts w:ascii="Times New Roman" w:hAnsi="Times New Roman"/>
+        </w:rPr>
+        <w:t xml:space="preserve"> </w:t>
+      </w:r>
+      <w:r>
+        <w:rPr>
+          <w:rFonts w:ascii="Times New Roman" w:hAnsi="Times New Roman"/>
+        </w:rPr>
+        <w:t xml:space="preserve">and</w:t>
+      </w:r>
+      <w:r>
+        <w:rPr>
+          <w:rFonts w:ascii="Times New Roman" w:hAnsi="Times New Roman"/>
+        </w:rPr>
+        <w:t xml:space="preserve"> </w:t>
+      </w:r>
+      <w:r>
+        <w:rPr>
+          <w:rStyle w:val="VerbatimChar"/>
+          <w:rFonts w:ascii="Times New Roman" w:hAnsi="Times New Roman"/>
+        </w:rPr>
+        <w:t xml:space="preserve">systemic_absorption_very_low</w:t>
+      </w:r>
+      <w:r>
+        <w:rPr>
+          <w:rFonts w:ascii="Times New Roman" w:hAnsi="Times New Roman"/>
+        </w:rPr>
+        <w:t xml:space="preserve">, as implemented in</w:t>
+      </w:r>
+      <w:r>
+        <w:rPr>
+          <w:rFonts w:ascii="Times New Roman" w:hAnsi="Times New Roman"/>
+        </w:rPr>
+        <w:t xml:space="preserve"> </w:t>
+      </w:r>
+      <w:r>
+        <w:rPr>
+          <w:rStyle w:val="VerbatimChar"/>
+          <w:rFonts w:ascii="Times New Roman" w:hAnsi="Times New Roman"/>
+        </w:rPr>
+        <w:t xml:space="preserve">kg_layer.py</w:t>
+      </w:r>
+      <w:r>
+        <w:rPr>
+          <w:rFonts w:ascii="Times New Roman" w:hAnsi="Times New Roman"/>
+        </w:rPr>
+        <w:t xml:space="preserve">; the remaining four values preserve the assigned level. (Section 2.2 and Section 4.2 of the previous revision stated that four tiers were tested; the code tests two. The final grades are unaffected because the other low-exposure values are already mapped to low risk within the matrix layer.) The tier is a</w:t>
       </w:r>
       <w:r>
         <w:rPr>
@@ -913,7 +1048,46 @@
         <w:rPr>
           <w:rFonts w:ascii="Times New Roman" w:hAnsi="Times New Roman"/>
         </w:rPr>
-        <w:t xml:space="preserve">: the intended reading is fractional systemic bioavailability after topical instillation (high above roughly 50%, medium roughly 10-50%, low below roughly 10%, with very-low, minimal and none indicating progressively smaller exposure), but the sources report heterogeneous quantities (bioavailability fractions, plasma concentrations, or qualitative statements), so the tiers should be read as an explicitly stated ordinal model rather than as measured exposure for every agent. Two limitations follow and are stated here rather than discovered later: first, the current assignment contains at least one internal inconsistency (flurbiprofen is tiered high in the registry while the candidate curation file records no tier flag for it), and second, nine of the 113 agents in the ophthalmic registry are not topically administered (six intravitreal anti-VEGF agents, intraocular acetylcholine, and two surgical viscoelastics), so the topical-absorption rationale does not apply to them in the same way. Both are flagged as required corrections in Section 4.4; the per-agent table with a source column is Supplementary Table S5. Ocular drug transfer from systemic administration is likewise complex and incompletely characterized [28]. For atropine and dexamethasone, tier assignment drew on regulatory labels and pharmacovigilance evidence [29]. The full per-agent tier table, with a source record for each agent, is provided as Supplementary Table S5.</w:t>
+        <w:t xml:space="preserve">: the intended reading is fractional systemic bioavailability after topical instillation (high above roughly 50%, medium roughly 10-50%, low below roughly 10%, with very-low, minimal and none indicating progressively smaller exposure), but the sources report heterogeneous quantities (bioavailability fractions, plasma concentrations, or qualitative statements), so the tiers should be read as an explicitly stated ordinal model rather than as measured exposure for every agent. Two limitations follow and are stated here rather than discovered later: first, the current assignment contains at least one internal inconsistency that has now been corrected (flurbiprofen was tiered high in the registry while the curation file recorded low for the same evidence sources; it is tiered low as of this revision), and second, nine of the 113 agents in the ophthalmic registry are not topically administered (six intravitreal anti-VEGF agents, intraocular acetylcholine, and two surgical viscoelastics), so the topical-absorption rationale does not apply to them in the same way. Both are flagged as required corrections in Section 4.4; the per-agent table is Supplementary Table S5.</w:t>
+      </w:r>
+      <w:r>
+        <w:rPr>
+          <w:rFonts w:ascii="Times New Roman" w:hAnsi="Times New Roman"/>
+        </w:rPr>
+        <w:t xml:space="preserve"> </w:t>
+      </w:r>
+      <w:r>
+        <w:rPr>
+          <w:rFonts w:ascii="Times New Roman" w:hAnsi="Times New Roman"/>
+          <w:b/>
+          <w:bCs/>
+        </w:rPr>
+        <w:t xml:space="preserve">The table’s source column does not evidence the tiers individually:</w:t>
+      </w:r>
+      <w:r>
+        <w:rPr>
+          <w:rFonts w:ascii="Times New Roman" w:hAnsi="Times New Roman"/>
+        </w:rPr>
+        <w:t xml:space="preserve"> </w:t>
+      </w:r>
+      <w:r>
+        <w:rPr>
+          <w:rFonts w:ascii="Times New Roman" w:hAnsi="Times New Roman"/>
+        </w:rPr>
+        <w:t xml:space="preserve">all 113 rows record the same string (</w:t>
+      </w:r>
+      <w:r>
+        <w:rPr>
+          <w:rStyle w:val="VerbatimChar"/>
+          <w:rFonts w:ascii="Times New Roman" w:hAnsi="Times New Roman"/>
+        </w:rPr>
+        <w:t xml:space="preserve">DrugBank DBxxxxx|PubMed</w:t>
+      </w:r>
+      <w:r>
+        <w:rPr>
+          <w:rFonts w:ascii="Times New Roman" w:hAnsi="Times New Roman"/>
+        </w:rPr>
+        <w:t xml:space="preserve">, with PubMed as a bare word and no identifier), and individual source records are named in this section for timolol [1,27] and for atropine and dexamethasone [29] only. The remaining tiers are the study team’s curation assignment; Table S5 marks this explicitly so the support behind each row is not overstated. Ocular drug transfer from systemic administration is likewise complex and incompletely characterized [28]. For atropine and dexamethasone, tier assignment drew on regulatory labels and pharmacovigilance evidence [29]. The full per-agent tier table, with a source record for each agent, is provided as Supplementary Table S5.</w:t>
       </w:r>
     </w:p>
     <w:p>
@@ -1283,7 +1457,7 @@
         <w:rPr>
           <w:rFonts w:ascii="Times New Roman" w:hAnsi="Times New Roman"/>
         </w:rPr>
-        <w:t xml:space="preserve">, the top 3 passages are retained, each truncated to 400 characters, and they are prepended to the case as an</w:t>
+        <w:t xml:space="preserve">, i.e. the drug names are included, the top 3 passages are retained, each truncated to 400 characters, and they are prepended to the case as an</w:t>
       </w:r>
       <w:r>
         <w:rPr>
@@ -1487,6 +1661,375 @@
           <w:rFonts w:ascii="Times New Roman" w:hAnsi="Times New Roman"/>
         </w:rPr>
         <w:t xml:space="preserve">. Temperature was 0.0 for condition 0 and 0.3, 0.6, 0.9, 1.2 for conditions 1–4. The 10-token cap is a deliberate design choice that forces a one-word answer; it removes any possibility of reasoning or justification, and this bounds what the comparison can support (Section 4.2). We refer to the five conditions as temperature conditions rather than seeds, because only temperature varied; the deterministic method is identical across conditions by construction. Outputs were parsed by substring matching with an explicit unknown fallback; no non-conforming outputs occurred on the L1 or audit sets. BM25 used the rank_bm25 implementation (k1 = 1.5, b = 0.75, top-k = 3). Because the 1,307-chunk corpus also informed the gold labels, the retrieval baselines access gold-source material, which the deterministic system does not use; this asymmetry is disclosed and gives the baselines, if anything, an advantage. Five conditions × four methods × four datasets produced 9,600 prediction rows with zero API failures.</w:t>
+      </w:r>
+      <w:r>
+        <w:rPr>
+          <w:rFonts w:ascii="Times New Roman" w:hAnsi="Times New Roman"/>
+        </w:rPr>
+        <w:t xml:space="preserve"> </w:t>
+      </w:r>
+      <w:r>
+        <w:rPr>
+          <w:rFonts w:ascii="Times New Roman" w:hAnsi="Times New Roman"/>
+          <w:b/>
+          <w:bCs/>
+        </w:rPr>
+        <w:t xml:space="preserve">Reasoning-model re-run (reported in Section 3.6 and Table 3).</w:t>
+      </w:r>
+      <w:r>
+        <w:rPr>
+          <w:rFonts w:ascii="Times New Roman" w:hAnsi="Times New Roman"/>
+        </w:rPr>
+        <w:t xml:space="preserve"> </w:t>
+      </w:r>
+      <w:r>
+        <w:rPr>
+          <w:rFonts w:ascii="Times New Roman" w:hAnsi="Times New Roman"/>
+        </w:rPr>
+        <w:t xml:space="preserve">The three LLM baselines were additionally re-run under an adequate output budget with a reasoning model. Setup, stated in full: provider Zhipu (Zhipu AI, China) through the coding-plan endpoint</w:t>
+      </w:r>
+      <w:r>
+        <w:rPr>
+          <w:rFonts w:ascii="Times New Roman" w:hAnsi="Times New Roman"/>
+        </w:rPr>
+        <w:t xml:space="preserve"> </w:t>
+      </w:r>
+      <w:r>
+        <w:rPr>
+          <w:rStyle w:val="VerbatimChar"/>
+          <w:rFonts w:ascii="Times New Roman" w:hAnsi="Times New Roman"/>
+        </w:rPr>
+        <w:t xml:space="preserve">https://open.bigmodel.cn/api/coding/paas/v4</w:t>
+      </w:r>
+      <w:r>
+        <w:rPr>
+          <w:rFonts w:ascii="Times New Roman" w:hAnsi="Times New Roman"/>
+        </w:rPr>
+        <w:t xml:space="preserve">, model identifier</w:t>
+      </w:r>
+      <w:r>
+        <w:rPr>
+          <w:rFonts w:ascii="Times New Roman" w:hAnsi="Times New Roman"/>
+        </w:rPr>
+        <w:t xml:space="preserve"> </w:t>
+      </w:r>
+      <w:r>
+        <w:rPr>
+          <w:rStyle w:val="VerbatimChar"/>
+          <w:rFonts w:ascii="Times New Roman" w:hAnsi="Times New Roman"/>
+        </w:rPr>
+        <w:t xml:space="preserve">glm-5.3-flash</w:t>
+      </w:r>
+      <w:r>
+        <w:rPr>
+          <w:rFonts w:ascii="Times New Roman" w:hAnsi="Times New Roman"/>
+        </w:rPr>
+        <w:t xml:space="preserve">, temperature 0.0,</w:t>
+      </w:r>
+      <w:r>
+        <w:rPr>
+          <w:rFonts w:ascii="Times New Roman" w:hAnsi="Times New Roman"/>
+        </w:rPr>
+        <w:t xml:space="preserve"> </w:t>
+      </w:r>
+      <w:r>
+        <w:rPr>
+          <w:rStyle w:val="VerbatimChar"/>
+          <w:rFonts w:ascii="Times New Roman" w:hAnsi="Times New Roman"/>
+        </w:rPr>
+        <w:t xml:space="preserve">max_tokens</w:t>
+      </w:r>
+      <w:r>
+        <w:rPr>
+          <w:rFonts w:ascii="Times New Roman" w:hAnsi="Times New Roman"/>
+        </w:rPr>
+        <w:t xml:space="preserve"> </w:t>
+      </w:r>
+      <w:r>
+        <w:rPr>
+          <w:rFonts w:ascii="Times New Roman" w:hAnsi="Times New Roman"/>
+        </w:rPr>
+        <w:t xml:space="preserve">3000, five repeated samples per case, temperature held fixed so the repetition captures sampling variance rather than a temperature schedule.</w:t>
+      </w:r>
+      <w:r>
+        <w:rPr>
+          <w:rFonts w:ascii="Times New Roman" w:hAnsi="Times New Roman"/>
+        </w:rPr>
+        <w:t xml:space="preserve"> </w:t>
+      </w:r>
+      <w:r>
+        <w:rPr>
+          <w:rFonts w:ascii="Times New Roman" w:hAnsi="Times New Roman"/>
+          <w:b/>
+          <w:bCs/>
+        </w:rPr>
+        <w:t xml:space="preserve">Reasoning tokens count against the 3000-token budget</w:t>
+      </w:r>
+      <w:r>
+        <w:rPr>
+          <w:rFonts w:ascii="Times New Roman" w:hAnsi="Times New Roman"/>
+        </w:rPr>
+        <w:t xml:space="preserve">: the model emits</w:t>
+      </w:r>
+      <w:r>
+        <w:rPr>
+          <w:rFonts w:ascii="Times New Roman" w:hAnsi="Times New Roman"/>
+        </w:rPr>
+        <w:t xml:space="preserve"> </w:t>
+      </w:r>
+      <w:r>
+        <w:rPr>
+          <w:rStyle w:val="VerbatimChar"/>
+          <w:rFonts w:ascii="Times New Roman" w:hAnsi="Times New Roman"/>
+        </w:rPr>
+        <w:t xml:space="preserve">reasoning_content</w:t>
+      </w:r>
+      <w:r>
+        <w:rPr>
+          <w:rFonts w:ascii="Times New Roman" w:hAnsi="Times New Roman"/>
+        </w:rPr>
+        <w:t xml:space="preserve"> </w:t>
+      </w:r>
+      <w:r>
+        <w:rPr>
+          <w:rFonts w:ascii="Times New Roman" w:hAnsi="Times New Roman"/>
+        </w:rPr>
+        <w:t xml:space="preserve">before</w:t>
+      </w:r>
+      <w:r>
+        <w:rPr>
+          <w:rFonts w:ascii="Times New Roman" w:hAnsi="Times New Roman"/>
+        </w:rPr>
+        <w:t xml:space="preserve"> </w:t>
+      </w:r>
+      <w:r>
+        <w:rPr>
+          <w:rStyle w:val="VerbatimChar"/>
+          <w:rFonts w:ascii="Times New Roman" w:hAnsi="Times New Roman"/>
+        </w:rPr>
+        <w:t xml:space="preserve">content</w:t>
+      </w:r>
+      <w:r>
+        <w:rPr>
+          <w:rFonts w:ascii="Times New Roman" w:hAnsi="Times New Roman"/>
+        </w:rPr>
+        <w:t xml:space="preserve">, so the budget covers both.</w:t>
+      </w:r>
+      <w:r>
+        <w:rPr>
+          <w:rFonts w:ascii="Times New Roman" w:hAnsi="Times New Roman"/>
+        </w:rPr>
+        <w:t xml:space="preserve"> </w:t>
+      </w:r>
+      <w:r>
+        <w:rPr>
+          <w:rFonts w:ascii="Times New Roman" w:hAnsi="Times New Roman"/>
+          <w:b/>
+          <w:bCs/>
+        </w:rPr>
+        <w:t xml:space="preserve">Zero responses were truncated</w:t>
+      </w:r>
+      <w:r>
+        <w:rPr>
+          <w:rFonts w:ascii="Times New Roman" w:hAnsi="Times New Roman"/>
+        </w:rPr>
+        <w:t xml:space="preserve"> </w:t>
+      </w:r>
+      <w:r>
+        <w:rPr>
+          <w:rFonts w:ascii="Times New Roman" w:hAnsi="Times New Roman"/>
+        </w:rPr>
+        <w:t xml:space="preserve">at this budget (completion_tokens never reached max_tokens across all 3,150 calls). Split votes were resolved by majority over the five samples; the deposited parse rule is applied to each sample first (exact match, then substring</w:t>
+      </w:r>
+      <w:r>
+        <w:rPr>
+          <w:rFonts w:ascii="Times New Roman" w:hAnsi="Times New Roman"/>
+        </w:rPr>
+        <w:t xml:space="preserve"> </w:t>
+      </w:r>
+      <w:r>
+        <w:rPr>
+          <w:rStyle w:val="VerbatimChar"/>
+          <w:rFonts w:ascii="Times New Roman" w:hAnsi="Times New Roman"/>
+        </w:rPr>
+        <w:t xml:space="preserve">high</w:t>
+      </w:r>
+      <w:r>
+        <w:rPr>
+          <w:rFonts w:ascii="Times New Roman" w:hAnsi="Times New Roman"/>
+        </w:rPr>
+        <w:t xml:space="preserve"> </w:t>
+      </w:r>
+      <w:r>
+        <w:rPr>
+          <w:rFonts w:ascii="Times New Roman" w:hAnsi="Times New Roman"/>
+        </w:rPr>
+        <w:t xml:space="preserve">&gt;</w:t>
+      </w:r>
+      <w:r>
+        <w:rPr>
+          <w:rFonts w:ascii="Times New Roman" w:hAnsi="Times New Roman"/>
+        </w:rPr>
+        <w:t xml:space="preserve"> </w:t>
+      </w:r>
+      <w:r>
+        <w:rPr>
+          <w:rStyle w:val="VerbatimChar"/>
+          <w:rFonts w:ascii="Times New Roman" w:hAnsi="Times New Roman"/>
+        </w:rPr>
+        <w:t xml:space="preserve">medium</w:t>
+      </w:r>
+      <w:r>
+        <w:rPr>
+          <w:rFonts w:ascii="Times New Roman" w:hAnsi="Times New Roman"/>
+        </w:rPr>
+        <w:t xml:space="preserve">/</w:t>
+      </w:r>
+      <w:r>
+        <w:rPr>
+          <w:rStyle w:val="VerbatimChar"/>
+          <w:rFonts w:ascii="Times New Roman" w:hAnsi="Times New Roman"/>
+        </w:rPr>
+        <w:t xml:space="preserve">moderate</w:t>
+      </w:r>
+      <w:r>
+        <w:rPr>
+          <w:rFonts w:ascii="Times New Roman" w:hAnsi="Times New Roman"/>
+        </w:rPr>
+        <w:t xml:space="preserve"> </w:t>
+      </w:r>
+      <w:r>
+        <w:rPr>
+          <w:rFonts w:ascii="Times New Roman" w:hAnsi="Times New Roman"/>
+        </w:rPr>
+        <w:t xml:space="preserve">&gt;</w:t>
+      </w:r>
+      <w:r>
+        <w:rPr>
+          <w:rFonts w:ascii="Times New Roman" w:hAnsi="Times New Roman"/>
+        </w:rPr>
+        <w:t xml:space="preserve"> </w:t>
+      </w:r>
+      <w:r>
+        <w:rPr>
+          <w:rStyle w:val="VerbatimChar"/>
+          <w:rFonts w:ascii="Times New Roman" w:hAnsi="Times New Roman"/>
+        </w:rPr>
+        <w:t xml:space="preserve">low</w:t>
+      </w:r>
+      <w:r>
+        <w:rPr>
+          <w:rFonts w:ascii="Times New Roman" w:hAnsi="Times New Roman"/>
+        </w:rPr>
+        <w:t xml:space="preserve">, else</w:t>
+      </w:r>
+      <w:r>
+        <w:rPr>
+          <w:rFonts w:ascii="Times New Roman" w:hAnsi="Times New Roman"/>
+        </w:rPr>
+        <w:t xml:space="preserve"> </w:t>
+      </w:r>
+      <w:r>
+        <w:rPr>
+          <w:rStyle w:val="VerbatimChar"/>
+          <w:rFonts w:ascii="Times New Roman" w:hAnsi="Times New Roman"/>
+        </w:rPr>
+        <w:t xml:space="preserve">unknown</w:t>
+      </w:r>
+      <w:r>
+        <w:rPr>
+          <w:rFonts w:ascii="Times New Roman" w:hAnsi="Times New Roman"/>
+        </w:rPr>
+        <w:t xml:space="preserve">), and no sample returned</w:t>
+      </w:r>
+      <w:r>
+        <w:rPr>
+          <w:rFonts w:ascii="Times New Roman" w:hAnsi="Times New Roman"/>
+        </w:rPr>
+        <w:t xml:space="preserve"> </w:t>
+      </w:r>
+      <w:r>
+        <w:rPr>
+          <w:rStyle w:val="VerbatimChar"/>
+          <w:rFonts w:ascii="Times New Roman" w:hAnsi="Times New Roman"/>
+        </w:rPr>
+        <w:t xml:space="preserve">unknown</w:t>
+      </w:r>
+      <w:r>
+        <w:rPr>
+          <w:rFonts w:ascii="Times New Roman" w:hAnsi="Times New Roman"/>
+        </w:rPr>
+        <w:t xml:space="preserve">. The run was executed on 23–24 September 2026 and produced 3,150 raw responses, deposited in full at</w:t>
+      </w:r>
+      <w:r>
+        <w:rPr>
+          <w:rFonts w:ascii="Times New Roman" w:hAnsi="Times New Roman"/>
+        </w:rPr>
+        <w:t xml:space="preserve"> </w:t>
+      </w:r>
+      <w:r>
+        <w:rPr>
+          <w:rStyle w:val="VerbatimChar"/>
+          <w:rFonts w:ascii="Times New Roman" w:hAnsi="Times New Roman"/>
+        </w:rPr>
+        <w:t xml:space="preserve">data/predictions/glm53_baselines/</w:t>
+      </w:r>
+      <w:r>
+        <w:rPr>
+          <w:rFonts w:ascii="Times New Roman" w:hAnsi="Times New Roman"/>
+        </w:rPr>
+        <w:t xml:space="preserve"> </w:t>
+      </w:r>
+      <w:r>
+        <w:rPr>
+          <w:rFonts w:ascii="Times New Roman" w:hAnsi="Times New Roman"/>
+        </w:rPr>
+        <w:t xml:space="preserve">with the run script</w:t>
+      </w:r>
+      <w:r>
+        <w:rPr>
+          <w:rFonts w:ascii="Times New Roman" w:hAnsi="Times New Roman"/>
+        </w:rPr>
+        <w:t xml:space="preserve"> </w:t>
+      </w:r>
+      <w:r>
+        <w:rPr>
+          <w:rStyle w:val="VerbatimChar"/>
+          <w:rFonts w:ascii="Times New Roman" w:hAnsi="Times New Roman"/>
+        </w:rPr>
+        <w:t xml:space="preserve">scripts/rerun_glm53_baselines.py</w:t>
+      </w:r>
+      <w:r>
+        <w:rPr>
+          <w:rFonts w:ascii="Times New Roman" w:hAnsi="Times New Roman"/>
+        </w:rPr>
+        <w:t xml:space="preserve">.</w:t>
+      </w:r>
+      <w:r>
+        <w:rPr>
+          <w:rFonts w:ascii="Times New Roman" w:hAnsi="Times New Roman"/>
+        </w:rPr>
+        <w:t xml:space="preserve"> </w:t>
+      </w:r>
+      <w:r>
+        <w:rPr>
+          <w:rFonts w:ascii="Times New Roman" w:hAnsi="Times New Roman"/>
+          <w:b/>
+          <w:bCs/>
+        </w:rPr>
+        <w:t xml:space="preserve">Single-model caveat:</w:t>
+      </w:r>
+      <w:r>
+        <w:rPr>
+          <w:rFonts w:ascii="Times New Roman" w:hAnsi="Times New Roman"/>
+        </w:rPr>
+        <w:t xml:space="preserve"> </w:t>
+      </w:r>
+      <w:r>
+        <w:rPr>
+          <w:rFonts w:ascii="Times New Roman" w:hAnsi="Times New Roman"/>
+        </w:rPr>
+        <w:t xml:space="preserve">this comparison uses one commercial reasoning model at one endpoint; the endpoint does not expose checkpoint revision, so the finding that reasoning models adopt a conservative rarely-high-risk policy is a property of this model family at this budget, not a claim about reasoning models in general. The deterministic cascade requires no model call and is unchanged between the two settings.</w:t>
       </w:r>
     </w:p>
     <w:p>
@@ -1726,7 +2269,7 @@
         <w:rPr>
           <w:rFonts w:ascii="Times New Roman" w:hAnsi="Times New Roman"/>
         </w:rPr>
-        <w:t xml:space="preserve">On this set the gold and the rules draw on the same literature (Section 3.8), so agreement measures the internal consistency of an explicitly evidence-graded encoding rather than accuracy against an independent standard. What the set does support is a like-for-like comparison of four methods on identical cases, and the ability to inspect every disagreement individually. Table 3 and Figure 2 summarize the comparison (five temperature conditions each; mean ± SD). The state-of-the-art LLM baselines acting as comparators receive the same three-level risk definitions and the same general absorption reminder in their system prompt (Section 2.4).</w:t>
+        <w:t xml:space="preserve">On this set the gold and the rules draw on the same literature (Section 3.9), so agreement measures the internal consistency of an explicitly evidence-graded encoding rather than accuracy against an independent standard. What the set does support is a like-for-like comparison of four methods on identical cases, and the ability to inspect every disagreement individually. Table 3 and Figure 2 summarize the comparison (five temperature conditions each; mean ± SD). The state-of-the-art LLM baselines acting as comparators receive the same three-level risk definitions and the same general absorption reminder in their system prompt (Section 2.4).</w:t>
       </w:r>
     </w:p>
     <w:p>
@@ -1738,7 +2281,7 @@
         <w:rPr>
           <w:rFonts w:ascii="Times New Roman" w:hAnsi="Times New Roman"/>
         </w:rPr>
-        <w:t xml:space="preserve">The deterministic system (full_system) achieved 0.907 exact accuracy (107/118; Wilson 95% CI 0.841–0.947), 0.964 high-risk sensitivity (27 of 28; CI 0.823–0.994), 0.989 specificity, and Cohen’s kappa 0.857 (bootstrap CI 0.791–0.947), with zero variance across conditions. Lightrag reached 0.737 accuracy, 0.779 sensitivity, and 0.936 specificity (kappa 0.603). Pure_llm reached 0.475 accuracy and 0.771 sensitivity (kappa 0.256). Naive_rag reached 0.415 accuracy and 0.757 sensitivity (kappa 0.182). Exact two-sided McNemar tests (condition 0) were significant for full_system versus each baseline: versus pure_llm (54 discordant pairs in favor of the system, 1 against; p = 3.1 × 10⁻¹⁵), versus naive_rag (60 versus 3; p = 9.0 × 10⁻¹⁵), and versus lightrag (21 versus 1; p = 1.1 × 10⁻⁵).</w:t>
+        <w:t xml:space="preserve">The deterministic system (full_system) achieved 0.907 exact accuracy (107/118; Wilson 95% CI 0.841–0.947), 0.964 high-risk sensitivity (27 of 28; CI 0.823–0.994), 0.989 specificity, and Cohen’s kappa 0.857 (bootstrap CI 0.772–0.934), with zero variance across conditions. Lightrag reached 0.737 accuracy, 0.779 sensitivity, and 0.936 specificity (kappa 0.603). Pure_llm reached 0.475 accuracy and 0.771 sensitivity (kappa 0.256). Naive_rag reached 0.415 accuracy and 0.757 sensitivity (kappa 0.182). Exact two-sided McNemar tests (condition 0) were significant for full_system versus each baseline: versus pure_llm (54 discordant pairs in favor of the system, 2 against; p = 4.4 × 10⁻¹⁴), versus naive_rag (60 versus 4; p = 7.4 × 10⁻¹⁴), and versus lightrag (20 versus 1; p = 2.1 × 10⁻⁵).</w:t>
       </w:r>
     </w:p>
     <w:p>
@@ -1828,7 +2371,46 @@
         <w:rPr>
           <w:rFonts w:ascii="Times New Roman" w:hAnsi="Times New Roman"/>
         </w:rPr>
-        <w:t xml:space="preserve">On the 92-case audit set, full_system reached 0.674 exact accuracy (62/92; Wilson CI 0.573–0.761) and kappa 0.428 against the absorption-corrected gold (specificity 0.955). Only part of that set is independent of the system’s own absorption assumption: restricting the analysis to the 62 cases kept at the third-party DDInter severity gives 34 of 62 (0.548), which is the figure free of the system’s assumption and should be read as the audit-set headline rather than 0.674. Against the uncorrected DDInter severity labels, agreement was 0.402 (37/92). Stratified: among the 30 absorption-corrected cases (all corrected to low), the system agreed on 28 (93%); among the 62 kept cases, it agreed on 34 (55%) (Table 5). Baselines on the corrected gold: pure_llm 0.630, lightrag 0.591, naive_rag 0.535. McNemar tests on the audit set were significant for full_system versus lightrag (8 versus 1; p = 0.039), but not versus naive_rag (27 versus 17; p = 0.169) or pure_llm (18 versus 15; p = 0.728). We also report, symmetrically, that on this set the two ungrounded baselines exceed the system on high-risk sensitivity (pure_llm and naive_rag 0.848 each, lightrag 0.264, versus 0.320 for the cascade), so the cascade’s advantage here is in specificity and exact accuracy, not in sensitivity.</w:t>
+        <w:t xml:space="preserve">On the 92-case audit set, full_system reached 0.674 exact accuracy (62/92; Wilson CI 0.573–0.761) and kappa 0.428 against the absorption-corrected gold (specificity 0.955). Only part of that set is independent of the system’s own absorption assumption: restricting the analysis to the 62 cases kept at the third-party DDInter severity gives 34 of 62 (0.548), which is the figure free of the system’s assumption and should be read as the audit-set headline rather than 0.674. Against the uncorrected DDInter severity labels, agreement was 0.370 (34/92). Stratified: among the 30 absorption-corrected cases (all corrected to low), the system agreed on 28 (93%); among the 62 kept cases, it agreed on 34 (55%) (Table 5). Baselines on the corrected gold: pure_llm 0.630, lightrag 0.591, naive_rag 0.535. McNemar tests on the audit set were significant for full_system versus lightrag (8 versus 1; p = 0.039), but not versus naive_rag (27 versus 17; p = 0.174) or pure_llm (18 versus 15; p = 0.728). We also report, symmetrically, that on this set the two ungrounded baselines exceed the system on high-risk sensitivity (pure_llm and naive_rag 0.848 each, lightrag 0.264, versus 0.320 for the cascade), so the cascade’s advantage here is in specificity and exact accuracy, not in sensitivity.</w:t>
+      </w:r>
+      <w:r>
+        <w:rPr>
+          <w:rFonts w:ascii="Times New Roman" w:hAnsi="Times New Roman"/>
+        </w:rPr>
+        <w:t xml:space="preserve"> </w:t>
+      </w:r>
+      <w:r>
+        <w:rPr>
+          <w:rFonts w:ascii="Times New Roman" w:hAnsi="Times New Roman"/>
+          <w:b/>
+          <w:bCs/>
+        </w:rPr>
+        <w:t xml:space="preserve">That comparison is partly confounded, and we quantify the confound rather than leave it implicit.</w:t>
+      </w:r>
+      <w:r>
+        <w:rPr>
+          <w:rFonts w:ascii="Times New Roman" w:hAnsi="Times New Roman"/>
+        </w:rPr>
+        <w:t xml:space="preserve"> </w:t>
+      </w:r>
+      <w:r>
+        <w:rPr>
+          <w:rFonts w:ascii="Times New Roman" w:hAnsi="Times New Roman"/>
+        </w:rPr>
+        <w:t xml:space="preserve">Of the 1,307 evidence chunks, 500 are DDInter 2.0 severity statements, and the audit gold for the 62 third-party-graded cases is the DDInter value itself. Running the deposited BM25 retrieval with the deposited parameters, the top-3 passages contain the pair’s own DDInter statement for 19 of those 62 cases (</w:t>
+      </w:r>
+      <w:r>
+        <w:rPr>
+          <w:rStyle w:val="VerbatimChar"/>
+          <w:rFonts w:ascii="Times New Roman" w:hAnsi="Times New Roman"/>
+        </w:rPr>
+        <w:t xml:space="preserve">scripts/naive_rag_leakage_audit.py</w:t>
+      </w:r>
+      <w:r>
+        <w:rPr>
+          <w:rFonts w:ascii="Times New Roman" w:hAnsi="Times New Roman"/>
+        </w:rPr>
+        <w:t xml:space="preserve">); for those cases naive_rag retrieves the gold label. Its exact accuracy on that subset therefore cannot be read as independent evidence, and the same applies in weaker form to lightrag, whose knowledge-graph profiles are built from the same curated corpus. The deterministic cascade does not query that corpus at inference time. We report the baseline comparison because it was pre-specified, and the leakage audit so that its weight can be judged correctly.</w:t>
       </w:r>
     </w:p>
     <w:p>
@@ -2282,7 +2864,7 @@
         <w:rPr>
           <w:rFonts w:ascii="Times New Roman" w:hAnsi="Times New Roman"/>
         </w:rPr>
-        <w:t xml:space="preserve">The mechanism is a shift in the predicted label distribution rather than an improvement in discrimination. Under the larger budget the baselines converge on a conservative policy: pure_llm assigns high risk to 6% of cases where the gold contains 24%, and on the audit set to 2% where the gold contains 27%. Because both gold sets are dominated by low and medium grades, this conservatism inflates exact accuracy while the baselines identify 6 to 15 of the 28 gold-high cases (the cascade identifies all 28). We therefore read the accuracy increase as an artefact of the decision rule the model adopts when given room to reason, not as evidence that reasoning improves ophthalmic DDI screening; the sensitivity column is the informative one.</w:t>
+        <w:t xml:space="preserve">The mechanism is a shift in the predicted label distribution rather than an improvement in discrimination. Under the larger budget the baselines converge on a conservative policy: pure_llm assigns high risk to 6% of cases where the gold contains 24%, and on the audit set to 2% where the gold contains 27%. Because both gold sets are dominated by low and medium grades, this conservatism inflates exact accuracy while the baselines identify 6 to 15 of the 28 gold-high cases (the cascade identifies 27 of them). We therefore read the accuracy increase as an artefact of the decision rule the model adopts when given room to reason, not as evidence that reasoning improves ophthalmic DDI screening; the sensitivity column is the informative one.</w:t>
       </w:r>
     </w:p>
     <w:p>
@@ -2360,7 +2942,7 @@
         <w:rPr>
           <w:rFonts w:ascii="Times New Roman" w:hAnsi="Times New Roman"/>
         </w:rPr>
-        <w:t xml:space="preserve">Two independent ophthalmology experts reviewed 12 cases under the grade-review protocol of Section 2.5, with the proposed gold and the system grade both visible (Table 6; Supplementary Table S3). Inter-rater agreement was 91.7% (11 of 12; kappa 0.846, weighted kappa 0.875; Figure 3). Expert–system agreement was 41.7% for expert 1 (5 of 12; kappa 0.125, weighted 0.500) and 33.3% for expert 2 (4 of 12; kappa 0.010, weighted 0.461). The disagreement was systematic: expert 1 rated 7 of 12 cases one tier lower than the system and none higher; expert 2 rated 7 lower and 1 higher. Neither expert rated any of the four system-high cases as high (0 of 4). Four cases were fully concordant between both experts and the system (R03 dexamethasone × rifampicin, R07 levofloxacin × sotalol, R10 fluorometholone × prednisone, R11 fluorometholone × glimepiride). The sole inter-expert disagreement was R08 (betaxolol × verapamil), graded medium by expert 1 and high by expert 2. The maximum achievable unweighted kappa given the marginal distributions is 0.625, so the observed near-zero kappas partly reflect margin incompatibility; the weighted kappas (0.500, 0.461) place the divergence at approximately half a tier.</w:t>
+        <w:t xml:space="preserve">Two ophthalmology experts reviewed 12 cases under the grade-review protocol of Section 2.5, with the proposed gold and the system grade both visible (Table 6; Supplementary Table S3). Inter-rater agreement was 91.7% (11 of 12; kappa 0.840, 95% bootstrap CI 0.526–1.000; Figure 3). Expert–system agreement, computed against the grades the experts were shown, was 16.7% for expert 1 (2 of 12; kappa −0.176) and 8.3% for expert 2 (1 of 12; kappa −0.257). The disagreement was systematic and one-directional: expert 1 rated 10 of 12 cases one tier lower than the grade shown and none higher; expert 2 rated 10 lower and 1 higher. Neither expert rated any of the four system-high cases as high (0 of 4). One case was fully concordant between both experts, the grade shown and the gold (R07 levofloxacin × sotalol). The sole inter-expert disagreement was R08 (betaxolol × verapamil), graded medium by expert 1 and high by expert 2. The maximum achievable unweighted kappa given the marginal distributions is 0.294 for expert 1 and 0.314 for expert 2, so the low observed kappas partly reflect margin incompatibility; the quadratic-weighted kappas (−0.630 and −0.793) place the divergence at roughly one tier.</w:t>
       </w:r>
     </w:p>
     <w:p>
@@ -2372,7 +2954,7 @@
         <w:rPr>
           <w:rFonts w:ascii="Times New Roman" w:hAnsi="Times New Roman"/>
         </w:rPr>
-        <w:t xml:space="preserve">Crucially, the experts disagreed with the gold labels exactly as much as with the system: expert 1 versus gold kappa 0.125 (agreement 41.7%) and expert 2 versus gold kappa 0.010 (agreement 33.3%), identical to the expert–system values because the system matched its gold on all 12 cases. The divergence is therefore not system-specific; it sits between clinical prior and evidence-graded gold. Consistent with this, the experts explicitly noted that they judged from clinical practice without mechanism-level assessment, and that ophthalmic drops are not routinely screened for systemic DDI in their practice. We interpret this as a perspective gap between clinical prior and evidence-based grading, reported transparently; with n = 12 and near-zero kappa, the gap cannot be statistically distinguished from chance-level agreement, and the small sample bounds all expert-based conclusions.</w:t>
+        <w:t xml:space="preserve">The experts disagreed with the gold labels to the same degree as with the system: expert 1 versus gold kappa 0.020 (agreement 33.3%) and expert 2 versus gold kappa −0.091 (agreement 25.0%). The two comparisons are not independent evidence — the questionnaire showed both the proposed gold and the system grade, and the system reproduced its gold on all 12 cases, so the expert–gold and expert–system comparisons measure the same disagreement twice. What the exercise supports is only that the experts did not endorse the assigned grades, not that the system and its gold were separately validated. Consistent with this, the experts explicitly noted that they judged from clinical practice without mechanism-level assessment, and that ophthalmic drops are not routinely screened for systemic DDI in their practice. We interpret this as a perspective gap between clinical prior and evidence-based grading, reported transparently; with n = 12 and near-zero kappa, the gap cannot be statistically distinguished from chance-level agreement, and the small sample bounds all expert-based conclusions.</w:t>
       </w:r>
     </w:p>
     <w:bookmarkEnd w:id="38"/>
@@ -2441,7 +3023,7 @@
         <w:rPr>
           <w:rFonts w:ascii="Times New Roman" w:hAnsi="Times New Roman"/>
         </w:rPr>
-        <w:t xml:space="preserve">The same ophthalmic–systemic pair receives three different risk assignments depending on who is judging, and this study places all three on common ground. Systemic-route database severity and absorption-aware assessment disagree for 75.3% of the 1,933 registry-matched pairs that carry a DDInter rating, and that divergence is dominated by a single mechanism: low topical systemic absorption accounts for 80.5% of downgrades. Evidence-graded rules and expert judgment also disagree, and not because of the rules — two ophthalmologists agreed closely with each other (kappa 0.846) yet graded most cases one tier lower than both the cascade and its gold, with expert–gold kappas numerically identical to the expert–system kappas (0.125 and 0.010) precisely because the cascade reproduced its gold on all 12 cases. Because both grades were visible to the experts (Section 2.5), this comparison cannot separate the two assessments; what it does establish is that the grades did not persuade them. The results therefore support absorption-first knowledge engineering as a way of making ophthalmic DDI risk explicit and individually auditable, and they locate the largest source of disagreement not in any one tool but in the absence of a shared grading standard for this route.</w:t>
+        <w:t xml:space="preserve">The same ophthalmic–systemic pair receives three different risk assignments depending on who is judging, and this study places all three on common ground. Systemic-route database severity and absorption-aware assessment disagree for 75.3% of the 1,933 registry-matched pairs that carry a DDInter rating, and that divergence is dominated by a single mechanism: low topical systemic absorption accounts for 80.5% of downgrades. Evidence-graded rules and expert judgment also disagree, and not because of the rules — two ophthalmologists agreed closely with each other (kappa 0.840) yet rated 10 of 12 cases one tier lower than the grade they were shown, and their agreement with the assigned grades was near zero for both experts (−0.176 and −0.257); because the questionnaire displayed both the proposed gold and the system grade and the cascade reproduced that gold on all 12 cases, this review is reported as a perspective comparison rather than an independent validation. Because both grades were visible to the experts (Section 2.5), this comparison cannot separate the two assessments; what it does establish is that the grades did not persuade them. The results therefore support absorption-first knowledge engineering as a way of making ophthalmic DDI risk explicit and individually auditable, and they locate the largest source of disagreement not in any one tool but in the absence of a shared grading standard for this route.</w:t>
       </w:r>
     </w:p>
     <w:p>
@@ -2480,7 +3062,7 @@
         <w:rPr>
           <w:rFonts w:ascii="Times New Roman" w:hAnsi="Times New Roman"/>
         </w:rPr>
-        <w:t xml:space="preserve">Against general-purpose DDI databases. Existing resources such as DDInter provide comprehensive pair-level severity ratings derived from systemic administration [16] but do not encode the decisive ophthalmic modifier, the magnitude of systemic absorption from topical administration, nor dose-route corrections. Our system makes this ophthalmic pharmacokinetic factor an explicit, first-class modelling component [32]. A systemic-absorption tier is assigned to every ophthalmic agent (six values in the registry, four of which the hard constraint forces to low); an absorption-scaling step forces low-absorption pairs to low risk within the matrix layer unless a mechanism-based upgrade applies; and a hard-constraint layer encodes the absorption-first pharmacology, with the final grade taken as the maximum of the rule and matrix layers.</w:t>
+        <w:t xml:space="preserve">Against general-purpose DDI databases. Existing resources such as DDInter provide comprehensive pair-level severity ratings derived from systemic administration [16,N2] but do not encode the decisive ophthalmic modifier, the magnitude of systemic absorption from topical administration, nor dose-route corrections. Our system makes this ophthalmic pharmacokinetic factor an explicit, first-class modelling component [32]. A systemic-absorption tier is assigned to every ophthalmic agent (six values in the registry, two of which the L3 constraint forces to low); an absorption-scaling step forces low-absorption pairs to low risk within the matrix layer unless a mechanism-based upgrade applies; and a hard-constraint layer encodes the absorption-first pharmacology, with the final grade taken as the maximum of the rule and matrix layers.</w:t>
       </w:r>
       <w:r>
         <w:rPr>
@@ -2569,7 +3151,7 @@
         <w:rPr>
           <w:rFonts w:ascii="Times New Roman" w:hAnsi="Times New Roman"/>
         </w:rPr>
-        <w:t xml:space="preserve">Two independent ophthalmologists agreed closely with each other (kappa 0.846) but rated most cases one tier lower than both the system and its gold. Because the expert–gold and expert–system kappas are identical (0.125 and 0.010), the divergence is not a system artifact; it reflects a systematic difference between clinical prior and evidence-graded gold. Three observations support this reading. First, clinically serious events from ophthalmic–systemic DDI are rare, and expert judgments rationally gravitate toward lower risk tiers; consistent with this, neither expert rated any of the four system-high cases as high. Second, the few interactions clinicians do recall are dominated by non-selective beta-blockers, which are prominently discussed in prescribing guidance; the systematic coverage described above is therefore most valuable precisely where clinical recall is weakest. Third, reports of serious adverse events attributable to ophthalmic–systemic interactions are rare in the PubMed literature, although pharmacovigilance analyses of ophthalmic agents do identify systemic signals [29,40]. High alert-override rates in computerized order entry [24] further suggest that a screening tool whose outputs sit one tier above clinical intuition will be treated as noise unless its mechanism-based justifications are presented transparently; our traceable decision paths are designed to do exactly that. Whether the gold, the system, or the clinical prior is the better predictor of patient-relevant outcomes cannot be resolved without outcome-linked data; the honest position is that all three are hypotheses awaiting prospective calibration.</w:t>
+        <w:t xml:space="preserve">Two independent ophthalmologists agreed closely with each other (kappa 0.840) but rated 10 of 12 cases one tier lower than both the system and its gold. Because the questionnaire displayed both grades and the system reproduced its gold on all 12 cases, the expert–gold and expert–system comparisons are not independent and neither can be read as validating the other. The exercise establishes a systematic difference between clinical prior and the assigned grades, nothing more. Three observations support this reading. First, clinically serious events from ophthalmic–systemic DDI are rare, and expert judgments rationally gravitate toward lower risk tiers; consistent with this, neither expert rated any of the four system-high cases as high. Second, the few interactions clinicians do recall are dominated by non-selective beta-blockers, which are prominently discussed in prescribing guidance; the systematic coverage described above is therefore most valuable precisely where clinical recall is weakest. Third, reports of serious adverse events attributable to ophthalmic–systemic interactions are rare in the PubMed literature, although pharmacovigilance analyses of ophthalmic agents do identify systemic signals [29,40]. High alert-override rates in computerized order entry [24] further suggest that a screening tool whose outputs sit one tier above clinical intuition will be treated as noise unless its mechanism-based justifications are presented transparently; our traceable decision paths are designed to do exactly that. Whether the gold, the system, or the clinical prior is the better predictor of patient-relevant outcomes cannot be resolved without outcome-linked data; the honest position is that all three are hypotheses awaiting prospective calibration.</w:t>
       </w:r>
     </w:p>
     <w:bookmarkEnd w:id="43"/>
@@ -2636,6 +3218,77 @@
           <w:b/>
           <w:bCs/>
         </w:rPr>
+        <w:t xml:space="preserve">Disclosed alternative tiers.</w:t>
+      </w:r>
+      <w:r>
+        <w:rPr>
+          <w:rFonts w:ascii="Times New Roman" w:hAnsi="Times New Roman"/>
+        </w:rPr>
+        <w:t xml:space="preserve"> </w:t>
+      </w:r>
+      <w:r>
+        <w:rPr>
+          <w:rFonts w:ascii="Times New Roman" w:hAnsi="Times New Roman"/>
+        </w:rPr>
+        <w:t xml:space="preserve">Thirteen further agents show the same registry-versus-curation discrepancy that led us to correct flurbiprofen (dorzolamide, brinzolamide, the timolol fixed combinations, dexamethasone, atropine among them). We adopt the registry (</w:t>
+      </w:r>
+      <w:r>
+        <w:rPr>
+          <w:rStyle w:val="VerbatimChar"/>
+          <w:rFonts w:ascii="Times New Roman" w:hAnsi="Times New Roman"/>
+        </w:rPr>
+        <w:t xml:space="preserve">data/seed/entities_a.csv</w:t>
+      </w:r>
+      <w:r>
+        <w:rPr>
+          <w:rFonts w:ascii="Times New Roman" w:hAnsi="Times New Roman"/>
+        </w:rPr>
+        <w:t xml:space="preserve">) as authoritative because it is the file the engine loads at inference time; the curation file is an intermediate artefact. To let readers judge how much the registry-scale headline depends on that choice, we re-ran the 1,933-pair audit under the curation-file tiers: the downgrade share moves from 75.27% to 75.69%, and the from-high downgrades stay at 352 (</w:t>
+      </w:r>
+      <w:r>
+        <w:rPr>
+          <w:rStyle w:val="VerbatimChar"/>
+          <w:rFonts w:ascii="Times New Roman" w:hAnsi="Times New Roman"/>
+        </w:rPr>
+        <w:t xml:space="preserve">scripts/audit_ddinter_disagreement.py --tier-override data/curation/entity_a_candidates.yaml</w:t>
+      </w:r>
+      <w:r>
+        <w:rPr>
+          <w:rFonts w:ascii="Times New Roman" w:hAnsi="Times New Roman"/>
+        </w:rPr>
+        <w:t xml:space="preserve">; result deposited as</w:t>
+      </w:r>
+      <w:r>
+        <w:rPr>
+          <w:rFonts w:ascii="Times New Roman" w:hAnsi="Times New Roman"/>
+        </w:rPr>
+        <w:t xml:space="preserve"> </w:t>
+      </w:r>
+      <w:r>
+        <w:rPr>
+          <w:rStyle w:val="VerbatimChar"/>
+          <w:rFonts w:ascii="Times New Roman" w:hAnsi="Times New Roman"/>
+        </w:rPr>
+        <w:t xml:space="preserve">audits/tier_override_scenario.json</w:t>
+      </w:r>
+      <w:r>
+        <w:rPr>
+          <w:rFonts w:ascii="Times New Roman" w:hAnsi="Times New Roman"/>
+        </w:rPr>
+        <w:t xml:space="preserve">). The registry-scale conclusion is therefore robust to which of the two files is treated as authoritative.</w:t>
+      </w:r>
+      <w:r>
+        <w:rPr>
+          <w:rFonts w:ascii="Times New Roman" w:hAnsi="Times New Roman"/>
+        </w:rPr>
+        <w:t xml:space="preserve"> </w:t>
+      </w:r>
+      <w:r>
+        <w:rPr>
+          <w:rFonts w:ascii="Times New Roman" w:hAnsi="Times New Roman"/>
+          <w:b/>
+          <w:bCs/>
+        </w:rPr>
         <w:t xml:space="preserve">Open:</w:t>
       </w:r>
       <w:r>
@@ -2684,7 +3337,7 @@
         <w:rPr>
           <w:rFonts w:ascii="Times New Roman" w:hAnsi="Times New Roman"/>
         </w:rPr>
-        <w:t xml:space="preserve">Bounded clinical impact. The scarcity of direct evidence plausibly reflects that ophthalmic absorption rarely alters systemic drug handling in a clinically detectable way. PubMed yielded few dedicated ophthalmic–systemic interaction studies or case series. The evidence base is populated largely by pharmacokinetic first principles, class-level pharmacology, and extrapolation from systemic data (1,307 curated chunks, but few ophthalmic-specific outcome studies). Ocular drug transfer from systemic administration is likewise complex and incompletely characterized [28]. If the true risk gradient clusters at the low end for most ophthalmic agents, an evidence-graded system may systematically over-grade relative to clinical practice. Conversely, the audit-set sensitivity of 0.320 shows the system can also under-grade relative to an absorption-corrected gold; both directions bound the current clinical utility. At a realistic 1% prevalence of clinically significant ophthalmic–systemic interactions, the audit operating point (sensitivity 0.320, specificity 0.955) would yield a positive predictive value of approximately 9%, so the system’s value lies in systematic coverage and traceability rather than in screening yield.</w:t>
+        <w:t xml:space="preserve">Bounded clinical impact. The scarcity of direct evidence plausibly reflects that ophthalmic absorption rarely alters systemic drug handling in a clinically detectable way. PubMed yielded few dedicated ophthalmic–systemic interaction studies or case series. The evidence base is populated largely by pharmacokinetic first principles, class-level pharmacology, and extrapolation from systemic data (1,307 curated chunks, but few ophthalmic-specific outcome studies). Ocular drug transfer from systemic administration is likewise complex and incompletely characterized [28]. If the true risk gradient clusters at the low end for most ophthalmic agents, an evidence-graded system may systematically over-grade relative to clinical practice. Conversely, the audit-set sensitivity of 0.320 shows the system can also under-grade relative to an absorption-corrected gold; both directions bound the current clinical utility. At a realistic 1% prevalence of clinically significant ophthalmic–systemic interactions, the audit operating point (sensitivity 0.320, specificity 0.955) would yield a positive predictive value of approximately 6.7%, so the system’s value lies in systematic coverage and traceability rather than in screening yield.</w:t>
       </w:r>
     </w:p>
     <w:p>
@@ -2845,7 +3498,49 @@
         <w:rPr>
           <w:rFonts w:ascii="Times New Roman" w:hAnsi="Times New Roman"/>
         </w:rPr>
-        <w:t xml:space="preserve">This study was conducted in accordance with the Declaration of Helsinki and was reviewed and approved by the Ethics Committee of the First Affiliated Hospital of Xinjiang Medical University (approval no. K202509-29; reviewed by expedited review). The approval covers the expert-opinion component of this work. No patient data, human tissue, biological specimens, or clinical interventions were involved: the only human involvement was an expert-opinion exercise in which two ophthalmologists independently rated 12 hypothetical drug-pair vignettes constructed by the study team, no identifiable information was collected, and both experts provided informed consent for their anonymised ratings to be used in research and publication. The ethics approval document is provided as supplementary material. The system is a research decision-support tool and is not intended to replace clinical judgment (Section 2.6).</w:t>
+        <w:t xml:space="preserve">This study used only publicly available secondary data: the DDInter severity tables, published drug labels, DrugBank records and the peer-reviewed literature. No human participants, patient-level data, human tissue, biological specimens or clinical interventions were involved, and no identifiable information was collected. Under the Declaration of Helsinki and the Chinese Measures for Ethical Review of Life Science and Medical Research Involving Humans, secondary analysis of published data does not constitute human-subjects research requiring ethics committee review, and the study was therefore exempt from ethics approval for the retrospective data-analysis and software-development components.</w:t>
+      </w:r>
+    </w:p>
+    <w:p>
+      <w:pPr>
+        <w:pStyle w:val="BodyText"/>
+        <w:spacing w:line="480" w:lineRule="auto"/>
+      </w:pPr>
+      <w:r>
+        <w:rPr>
+          <w:rFonts w:ascii="Times New Roman" w:hAnsi="Times New Roman"/>
+        </w:rPr>
+        <w:t xml:space="preserve">The only human involvement was a professional-opinion exercise: two ophthalmologists, both clinicians from the Department of Ophthalmology of the First Affiliated Hospital of Xinjiang Medical University, independently rated 12 hypothetical drug-pair vignettes constructed by the study team. The vignettes contained no patient data and no identifiable information; the experts provided their ratings as professional opinion and consented to their anonymised ratings being used in research and publication. One of the experts was a member of the research team of a separately approved study at the same department (ethics approval K202509-29,</w:t>
+      </w:r>
+      <w:r>
+        <w:rPr>
+          <w:rFonts w:ascii="Times New Roman" w:hAnsi="Times New Roman"/>
+        </w:rPr>
+        <w:t xml:space="preserve"> </w:t>
+      </w:r>
+      <w:r>
+        <w:rPr>
+          <w:rFonts w:ascii="Times New Roman" w:hAnsi="Times New Roman"/>
+        </w:rPr>
+        <w:t xml:space="preserve">“Preliminary study of a mobile-device-based method for refractive error detection”</w:t>
+      </w:r>
+      <w:r>
+        <w:rPr>
+          <w:rFonts w:ascii="Times New Roman" w:hAnsi="Times New Roman"/>
+        </w:rPr>
+        <w:t xml:space="preserve">), which is the source of the institutional link between that approval and the present work; K202509-29 does not itself cover this study. The document is included in the supplementary material only to evidence that relationship, and we ask the editor to treat this study as exempt rather than as covered by that approval.</w:t>
+      </w:r>
+    </w:p>
+    <w:p>
+      <w:pPr>
+        <w:pStyle w:val="BodyText"/>
+        <w:spacing w:line="480" w:lineRule="auto"/>
+      </w:pPr>
+      <w:r>
+        <w:rPr>
+          <w:rFonts w:ascii="Times New Roman" w:hAnsi="Times New Roman"/>
+        </w:rPr>
+        <w:t xml:space="preserve">The system is a research decision-support tool and is not intended to replace clinical judgment (Section 2.6).</w:t>
       </w:r>
     </w:p>
     <w:bookmarkEnd w:id="49"/>
@@ -3187,7 +3882,31 @@
         <w:rPr>
           <w:rFonts w:ascii="Times New Roman" w:hAnsi="Times New Roman"/>
         </w:rPr>
-        <w:t xml:space="preserve">Generative AI tools were used during this research and manuscript preparation, with full author review and responsibility. DeepSeek-chat (deepseek.ai) was used for LLM-baseline evaluations, for literature-assisted drafting, and as an assistive tool in knowledge-engineering tasks, including registry curation, evidence grading, and gold-label annotation; Zhipu GLM-4.6V was used for visual verification of scanned expert questionnaires and figures. Figure 1 (system architecture schematic) was created with an AI image-generation tool from a prompt defined by the authors (prompt archived in the supplementary material, figure_prompts.md); all quantitative figures (Figures 2–5) were generated directly from system outputs with Matplotlib. All AI-assisted content was reviewed and validated by the authors, who take full responsibility for the content of this manuscript. The authors disclose that no human expert participated in gold-label construction; the 12-case expert assessment is the sole human validation channel.</w:t>
+        <w:t xml:space="preserve">Generative AI tools were used during this research and manuscript preparation, with full author review and responsibility. DeepSeek-chat (deepseek.ai) was used for LLM-baseline evaluations, for literature-assisted drafting, and as an assistive tool in knowledge-engineering tasks, including registry curation, evidence grading, and gold-label annotation; Zhipu GLM-4.6V was used for visual verification of scanned expert questionnaires and figures. Figure 1 (system architecture schematic) was created with an AI image-generation tool from a prompt defined by the authors (prompt archived in the supplementary material, figure_prompts.md); all quantitative figures (Figures 2–5) were generated directly from system outputs with Matplotlib. All AI-assisted content was reviewed and validated by the authors, who take full responsibility for the content of this manuscript. The authors disclose that no human expert participated in gold-label construction; the 12-case expert assessment is the sole human validation channel. For clarity about the</w:t>
+      </w:r>
+      <w:r>
+        <w:rPr>
+          <w:rFonts w:ascii="Times New Roman" w:hAnsi="Times New Roman"/>
+        </w:rPr>
+        <w:t xml:space="preserve"> </w:t>
+      </w:r>
+      <w:r>
+        <w:rPr>
+          <w:rFonts w:ascii="Times New Roman" w:hAnsi="Times New Roman"/>
+        </w:rPr>
+        <w:t xml:space="preserve">“T1 expert”</w:t>
+      </w:r>
+      <w:r>
+        <w:rPr>
+          <w:rFonts w:ascii="Times New Roman" w:hAnsi="Times New Roman"/>
+        </w:rPr>
+        <w:t xml:space="preserve"> </w:t>
+      </w:r>
+      <w:r>
+        <w:rPr>
+          <w:rFonts w:ascii="Times New Roman" w:hAnsi="Times New Roman"/>
+        </w:rPr>
+        <w:t xml:space="preserve">referred to in the deposited design files: that label denotes the clinical opinion recorded in an earlier, separately conducted exercise by a member of the research team of the approved study cited in the Ethics statement, used only to phrase the questionnaire vignettes and to cross-check mechanism plausibility for R02 and R12. No human expert assigned any gold label in this study; every gold label is the study team’s own annotation from published sources, and the T1 comparison is reported in the deposit as provenance for how the vignettes were written, not as a source of gold.</w:t>
       </w:r>
     </w:p>
     <w:bookmarkEnd w:id="56"/>
@@ -11615,7 +12334,7 @@
                 <w:rFonts w:ascii="Times New Roman" w:hAnsi="Times New Roman"/>
                 <w:sz w:val="18"/>
               </w:rPr>
-              <w:t>All 92 (vs corrected gold)</w:t>
+              <w:t>All 92 (vs absorption-corrected gold)</w:t>
             </w:r>
           </w:p>
         </w:tc>
@@ -11702,7 +12421,7 @@
                 <w:rFonts w:ascii="Times New Roman" w:hAnsi="Times New Roman"/>
                 <w:sz w:val="18"/>
               </w:rPr>
-              <w:t>37 (0.402)</w:t>
+              <w:t>34 (0.370)</w:t>
             </w:r>
           </w:p>
         </w:tc>
@@ -11721,7 +12440,7 @@
                 <w:rFonts w:ascii="Times New Roman" w:hAnsi="Times New Roman"/>
                 <w:sz w:val="18"/>
               </w:rPr>
-              <w:t>Absorption-corrected cases</w:t>
+              <w:t>Absorption-corrected cases (gold set to low)</w:t>
             </w:r>
           </w:p>
         </w:tc>
@@ -11774,7 +12493,7 @@
                 <w:rFonts w:ascii="Times New Roman" w:hAnsi="Times New Roman"/>
                 <w:sz w:val="18"/>
               </w:rPr>
-              <w:t>Kept cases (third-party-only)</w:t>
+              <w:t>Kept cases (third-party severity, gold = DDInter)</w:t>
             </w:r>
           </w:p>
         </w:tc>
@@ -11847,7 +12566,7 @@
                 <w:b/>
                 <w:sz w:val="18"/>
               </w:rPr>
-              <w:t>disagreement direction</w:t>
+              <w:t>disagreement direction (vs corrected gold)</w:t>
             </w:r>
           </w:p>
         </w:tc>
@@ -12130,7 +12849,7 @@
           <w:b w:val="0"/>
           <w:sz w:val="18"/>
         </w:rPr>
-        <w:t>Note: values reflect the corrected flurbiprofen absorption tier. The four over-alerts (system grade above gold) are apraclonidine x midazolam, apraclonidine x loperamide, tacrolimus x ibuprofen and bromfenac x enalapril.</w:t>
+        <w:t>Note: values reflect the corrected flurbiprofen absorption tier. The four over-alerts (system grade above gold) are apraclonidine x midazolam, apraclonidine x loperamide, tacrolimus x ibuprofen and bromfenac x enalapril. The 62-case "kept" stratum is the subset whose gold is the third-party DDInter severity, so it is the only stratum free of the system's own absorption assumption; the 0.548 figure there should be read as the audit-set headline rather than 0.674. Of those 62 cases, the deposited BM25 retrieval returns the pair's own DDInter statement within the top-3 passages for 19, so the baseline figures on this stratum are partly confounded (see scripts/naive_rag_leakage_audit.py).</w:t>
       </w:r>
     </w:p>
     <w:p>
@@ -12234,7 +12953,7 @@
                 <w:b/>
                 <w:sz w:val="18"/>
               </w:rPr>
-              <w:t>gold</w:t>
+              <w:t>gold shown</w:t>
             </w:r>
           </w:p>
         </w:tc>
@@ -12252,7 +12971,7 @@
                 <w:b/>
                 <w:sz w:val="18"/>
               </w:rPr>
-              <w:t>system</w:t>
+              <w:t>system shown</w:t>
             </w:r>
           </w:p>
         </w:tc>
@@ -12634,24 +13353,24 @@
                 <w:rFonts w:ascii="Times New Roman" w:hAnsi="Times New Roman"/>
                 <w:sz w:val="18"/>
               </w:rPr>
-              <w:t>medium</w:t>
-            </w:r>
-          </w:p>
-        </w:tc>
-        <w:tc>
-          <w:tcPr>
-            <w:tcW w:type="dxa" w:w="1337"/>
-          </w:tcPr>
-          <w:p>
-            <w:pPr>
-              <w:spacing w:line="240" w:lineRule="auto"/>
-            </w:pPr>
-            <w:r>
-              <w:rPr>
-                <w:rFonts w:ascii="Times New Roman" w:hAnsi="Times New Roman"/>
-                <w:sz w:val="18"/>
-              </w:rPr>
-              <w:t>medium</w:t>
+              <w:t>low</w:t>
+            </w:r>
+          </w:p>
+        </w:tc>
+        <w:tc>
+          <w:tcPr>
+            <w:tcW w:type="dxa" w:w="1337"/>
+          </w:tcPr>
+          <w:p>
+            <w:pPr>
+              <w:spacing w:line="240" w:lineRule="auto"/>
+            </w:pPr>
+            <w:r>
+              <w:rPr>
+                <w:rFonts w:ascii="Times New Roman" w:hAnsi="Times New Roman"/>
+                <w:sz w:val="18"/>
+              </w:rPr>
+              <w:t>low</w:t>
             </w:r>
           </w:p>
         </w:tc>
@@ -13464,7 +14183,7 @@
                 <w:rFonts w:ascii="Times New Roman" w:hAnsi="Times New Roman"/>
                 <w:sz w:val="18"/>
               </w:rPr>
-              <w:t>low</w:t>
+              <w:t>medium</w:t>
             </w:r>
           </w:p>
         </w:tc>
@@ -13585,7 +14304,7 @@
                 <w:rFonts w:ascii="Times New Roman" w:hAnsi="Times New Roman"/>
                 <w:sz w:val="18"/>
               </w:rPr>
-              <w:t>low</w:t>
+              <w:t>medium</w:t>
             </w:r>
           </w:p>
         </w:tc>
@@ -13746,6 +14465,16 @@
         </w:tc>
       </w:tr>
     </w:tbl>
+    <w:p>
+      <w:r>
+        <w:rPr>
+          <w:rFonts w:ascii="Times New Roman" w:hAnsi="Times New Roman"/>
+          <w:b w:val="0"/>
+          <w:sz w:val="18"/>
+        </w:rPr>
+        <w:t>Note: system shown is the system grade displayed on the questionnaire the experts graded, which is the correct comparator for expert-system agreement. It is the value the engine returned at the time for R01-R09 and R12; for R10 and R11 the engine has since been changed (the displayed grade was medium, the current engine returns low). Expert values are transcribed from the returned questionnaires: expert 1's form is deposited as a scan, expert 2's responses were returned in text. R03 is recorded here as low/low; an earlier version of this table listed medium/medium in error, and the kappa values reported in the manuscript are computed from the values in this table.</w:t>
+      </w:r>
+    </w:p>
     <w:p>
       <w:pPr>
         <w:jc w:val="center"/>
@@ -14482,6 +15211,30 @@
           <w:rFonts w:ascii="Times New Roman" w:hAnsi="Times New Roman"/>
         </w:rPr>
         <w:t xml:space="preserve">[40] Prasad M, Ramsey D. Adverse events reported with standard-dose and high-dose aflibercept: a FAERS pharmacovigilance study. Vision. 2026. doi: 10.3390/vision10020018</w:t>
+      </w:r>
+    </w:p>
+    <w:p>
+      <w:pPr>
+        <w:pStyle w:val="BodyText"/>
+        <w:spacing w:line="480" w:lineRule="auto"/>
+      </w:pPr>
+      <w:r>
+        <w:rPr>
+          <w:rFonts w:ascii="Times New Roman" w:hAnsi="Times New Roman"/>
+        </w:rPr>
+        <w:t xml:space="preserve">[N1] Korte JM, Kaila T, Saari KM. Systemic bioavailability and cardiopulmonary effects of 0.25%, 0.5%, and 1% timolol eyedrops. Graefes Arch Clin Exp Ophthalmol. 2002;240(6):430-435. doi: 10.1007/s00417-002-0462-2</w:t>
+      </w:r>
+      <w:r>
+        <w:rPr>
+          <w:rFonts w:ascii="Times New Roman" w:hAnsi="Times New Roman"/>
+        </w:rPr>
+        <w:t xml:space="preserve"> </w:t>
+      </w:r>
+      <w:r>
+        <w:rPr>
+          <w:rFonts w:ascii="Times New Roman" w:hAnsi="Times New Roman"/>
+        </w:rPr>
+        <w:t xml:space="preserve">[N2] Tian S, Wang N, Yang Z, Li Y, Xiong G, Wang L, et al. DDInter 2.0: an enhanced drug-drug interaction database for precision medicine. Nucleic Acids Res. 2025. doi: 10.1093/nar/gkae726</w:t>
       </w:r>
     </w:p>
     <w:bookmarkEnd w:id="58"/>

</xml_diff>

<commit_message>
docs: cite the archived release, correct licence terms
Availability and Software statements now cite tag v1.1-revision3 with a DOI
placeholder, and no longer say a DOI will be registered on acceptance -- the
archive exists now. Licence corrected to Apache-2.0 (code) + CC BY 4.0
(original data), with the bundled DDInter tables explicitly left under
DDInter's CC BY-NC-SA 4.0.
</commit_message>
<xml_diff>
--- a/manuscript/manuscript.docx
+++ b/manuscript/manuscript.docx
@@ -3633,13 +3633,13 @@
           <w:rStyle w:val="VerbatimChar"/>
           <w:rFonts w:ascii="Times New Roman" w:hAnsi="Times New Roman"/>
         </w:rPr>
-        <w:t xml:space="preserve">v1.0-submission</w:t>
-      </w:r>
-      <w:r>
-        <w:rPr>
-          <w:rFonts w:ascii="Times New Roman" w:hAnsi="Times New Roman"/>
-        </w:rPr>
-        <w:t xml:space="preserve">; accessible without an account). The deposit contains the entity registries (113 ophthalmic, 232 systemic agents) and the 1,307-chunk evidence base; all gold files with case-level provenance (L1 118 cases, DDInter audit 92 cases, development 200 cases, external 70 cases, plus the two development-gate sets); the 12-case expert ratings together with the review instrument and scanned questionnaires; the complete prediction files (9,600 rows, covering 4 methods x 5 temperature conditions x 4 datasets) and the evaluation and statistics scripts; the exact prompt templates; the DDInter severity tables used for the registry-scale audit; a per-agent absorption tier table with a source column for each agent; the path-attribution audit reporting which layer produced each grade; and SHA-256 fingerprints for the engine, rules and gold versions. The deterministic cascade requires no API key or network access, so the pipeline can be run end to end from the deposit; re-running the LLM baselines requires credentials for the model API.</w:t>
+        <w:t xml:space="preserve">v1.1-revision3</w:t>
+      </w:r>
+      <w:r>
+        <w:rPr>
+          <w:rFonts w:ascii="Times New Roman" w:hAnsi="Times New Roman"/>
+        </w:rPr>
+        <w:t xml:space="preserve">, archived at DOI {DOI}; accessible without an account). The deposit contains the entity registries (113 ophthalmic, 232 systemic agents) and the 1,307-chunk evidence base; all gold files with case-level provenance (L1 118 cases, DDInter audit 92 cases, development 200 cases, external 70 cases, plus the two development-gate sets); the 12-case expert ratings together with the review instrument and scanned questionnaires; the complete prediction files (9,600 rows, covering 4 methods x 5 temperature conditions x 4 datasets) and the evaluation and statistics scripts; the exact prompt templates; the DDInter severity tables used for the registry-scale audit; a per-agent absorption tier table with a source column for each agent; the path-attribution audit reporting which layer produced each grade; and SHA-256 fingerprints for the engine, rules and gold versions. The deterministic cascade requires no API key or network access, so the pipeline can be run end to end from the deposit; re-running the LLM baselines requires credentials for the model API.</w:t>
       </w:r>
     </w:p>
     <w:p>
@@ -3678,7 +3678,7 @@
           <w:rStyle w:val="VerbatimChar"/>
           <w:rFonts w:ascii="Times New Roman" w:hAnsi="Times New Roman"/>
         </w:rPr>
-        <w:t xml:space="preserve">v1.0-submission</w:t>
+        <w:t xml:space="preserve">v1.1-revision3</w:t>
       </w:r>
       <w:r>
         <w:rPr>
@@ -3690,7 +3690,7 @@
         <w:rPr>
           <w:rFonts w:ascii="Times New Roman" w:hAnsi="Times New Roman"/>
         </w:rPr>
-        <w:t xml:space="preserve">in that repository; a versioned DOI will be registered on acceptance. Operating system(s): platform independent. Programming language: Python 3.11. Other requirements: Python 3.10 or later, with dependencies pinned in</w:t>
+        <w:t xml:space="preserve">and is archived at DOI {DOI} (Zenodo). The archive contains the full source, configurations, gold sets, 9,600 prediction rows, the 3,150 reasoning-model responses, the statistics module and every audit output, so the reported figures can be regenerated without network access. Operating system(s): platform independent. Programming language: Python 3.11. Other requirements: Python 3.10 or later, with dependencies pinned in</w:t>
       </w:r>
       <w:r>
         <w:rPr>
@@ -3709,7 +3709,7 @@
         <w:rPr>
           <w:rFonts w:ascii="Times New Roman" w:hAnsi="Times New Roman"/>
         </w:rPr>
-        <w:t xml:space="preserve">. Licence: Apache-2.0 (code) and CC BY 4.0 (data). Any restrictions to use by non-academics: none.</w:t>
+        <w:t xml:space="preserve">. Licence: Apache-2.0 (code) and CC BY 4.0 (original data). The bundled DDInter severity tables are third-party data and remain under DDInter’s CC BY-NC-SA 4.0 terms; they are included for research reproducibility only, and reuse is subject to those terms (see the component-licensing section of the repository LICENSE).</w:t>
       </w:r>
     </w:p>
     <w:p>

</xml_diff>

<commit_message>
sync: round-3 marked copy, author-block fix, completed response letter
</commit_message>
<xml_diff>
--- a/manuscript/manuscript.docx
+++ b/manuscript/manuscript.docx
@@ -1178,7 +1178,7 @@
         <w:rPr>
           <w:rFonts w:ascii="Times New Roman" w:hAnsi="Times New Roman"/>
         </w:rPr>
-        <w:t xml:space="preserve">the gold was constructed by the study team, which comprises the named authors, so</w:t>
+        <w:t xml:space="preserve">the gold was constructed by the two authors of the original submission (GW and YX), who performed the curation and annotation. The two authors added during revision (HL and WS) contributed clinical input and interpretation of the results and reviewed the manuscript, but did not construct the gold and did not take part in the expert grade review.</w:t>
       </w:r>
       <w:r>
         <w:rPr>
@@ -1190,7 +1190,7 @@
         <w:rPr>
           <w:rFonts w:ascii="Times New Roman" w:hAnsi="Times New Roman"/>
         </w:rPr>
-        <w:t xml:space="preserve">“no human expert participated in gold construction”</w:t>
+        <w:t xml:space="preserve">“No human expert participated in gold construction”</w:t>
       </w:r>
       <w:r>
         <w:rPr>
@@ -1202,7 +1202,7 @@
         <w:rPr>
           <w:rFonts w:ascii="Times New Roman" w:hAnsi="Times New Roman"/>
         </w:rPr>
-        <w:t xml:space="preserve">means that no</w:t>
+        <w:t xml:space="preserve">therefore means that no</w:t>
       </w:r>
       <w:r>
         <w:rPr>
@@ -1228,7 +1228,7 @@
         <w:rPr>
           <w:rFonts w:ascii="Times New Roman" w:hAnsi="Times New Roman"/>
         </w:rPr>
-        <w:t xml:space="preserve">expert was involved, and none of the expert opinion used here was blinded to the system.</w:t>
+        <w:t xml:space="preserve">expert was involved; none of the expert opinion used here was blinded to the system.</w:t>
       </w:r>
       <w:r>
         <w:rPr>

</xml_diff>

<commit_message>
fix(review): disclose the R01-R03 errata in the manuscript, not only the letter
Reviewer 1 asked for three things about the expert exercise and we had answered
all three in the response letter, but the errata disclosure had not reached the
manuscript text. Section 3.8 now states which cases carried labels that had just
been corrected, gives the pre-correction and shown values side by side in a
table, notes that both experts independently rated the pre-correction grade for
R02 and R03 while the corrected gold was retained, and records that the
procedural lock applies to the 40-case frozen subset which does not include
these cases. A reader can now reconstruct this from the manuscript rather than
from the deposited design file alone.
</commit_message>
<xml_diff>
--- a/manuscript/manuscript.docx
+++ b/manuscript/manuscript.docx
@@ -2943,6 +2943,433 @@
           <w:rFonts w:ascii="Times New Roman" w:hAnsi="Times New Roman"/>
         </w:rPr>
         <w:t xml:space="preserve">Two ophthalmology experts reviewed 12 cases under the grade-review protocol of Section 2.5, with the proposed gold and the system grade both visible (Table 6; Supplementary Table S3). Inter-rater agreement was 91.7% (11 of 12; kappa 0.840, 95% bootstrap CI 0.526–1.000; Figure 3). Expert–system agreement, computed against the grades the experts were shown, was 16.7% for expert 1 (2 of 12; kappa −0.176) and 8.3% for expert 2 (1 of 12; kappa −0.257). The disagreement was systematic and one-directional: expert 1 rated 10 of 12 cases one tier lower than the grade shown and none higher; expert 2 rated 10 lower and 1 higher. Neither expert rated any of the four system-high cases as high (0 of 4). One case was fully concordant between both experts, the grade shown and the gold (R07 levofloxacin × sotalol). The sole inter-expert disagreement was R08 (betaxolol × verapamil), graded medium by expert 1 and high by expert 2. The maximum achievable unweighted kappa given the marginal distributions is 0.294 for expert 1 and 0.314 for expert 2, so the low observed kappas partly reflect margin incompatibility; the quadratic-weighted kappas (−0.630 and −0.793) place the divergence at roughly one tier.</w:t>
+      </w:r>
+    </w:p>
+    <w:p>
+      <w:pPr>
+        <w:pStyle w:val="BodyText"/>
+        <w:spacing w:line="480" w:lineRule="auto"/>
+      </w:pPr>
+      <w:r>
+        <w:rPr>
+          <w:rFonts w:ascii="Times New Roman" w:hAnsi="Times New Roman"/>
+          <w:b/>
+          <w:bCs/>
+        </w:rPr>
+        <w:t xml:space="preserve">Three cases carried labels that had just been corrected, and we report what the experts saw.</w:t>
+      </w:r>
+      <w:r>
+        <w:rPr>
+          <w:rFonts w:ascii="Times New Roman" w:hAnsi="Times New Roman"/>
+        </w:rPr>
+        <w:t xml:space="preserve"> </w:t>
+      </w:r>
+      <w:r>
+        <w:rPr>
+          <w:rFonts w:ascii="Times New Roman" w:hAnsi="Times New Roman"/>
+        </w:rPr>
+        <w:t xml:space="preserve">The</w:t>
+      </w:r>
+      <w:r>
+        <w:rPr>
+          <w:rFonts w:ascii="Times New Roman" w:hAnsi="Times New Roman"/>
+        </w:rPr>
+        <w:t xml:space="preserve"> </w:t>
+      </w:r>
+      <w:r>
+        <w:rPr>
+          <w:rFonts w:ascii="Times New Roman" w:hAnsi="Times New Roman"/>
+        </w:rPr>
+        <w:t xml:space="preserve">questionnaire showed the experts the corrected gold, not the pre-correction DDInter value, for R01-R03.</w:t>
+      </w:r>
+      <w:r>
+        <w:rPr>
+          <w:rFonts w:ascii="Times New Roman" w:hAnsi="Times New Roman"/>
+        </w:rPr>
+        <w:t xml:space="preserve"> </w:t>
+      </w:r>
+      <w:r>
+        <w:rPr>
+          <w:rFonts w:ascii="Times New Roman" w:hAnsi="Times New Roman"/>
+        </w:rPr>
+        <w:t xml:space="preserve">The three cases, with both values, are:</w:t>
+      </w:r>
+    </w:p>
+    <w:tbl>
+      <w:tblPr>
+        <w:tblStyle w:val="Table"/>
+        <w:tblW w:type="pct" w:w="5000"/>
+        <w:tblLayout w:type="fixed"/>
+        <w:tblLook w:firstRow="1" w:lastRow="0" w:firstColumn="0" w:lastColumn="0" w:noHBand="0" w:noVBand="0" w:val="0020"/>
+      </w:tblPr>
+      <w:tblGrid>
+        <w:gridCol w:w="1320"/>
+        <w:gridCol w:w="1320"/>
+        <w:gridCol w:w="1320"/>
+        <w:gridCol w:w="1320"/>
+        <w:gridCol w:w="1320"/>
+        <w:gridCol w:w="1320"/>
+      </w:tblGrid>
+      <w:tr>
+        <w:trPr>
+          <w:tblHeader w:val="on"/>
+        </w:trPr>
+        <w:tc>
+          <w:tcPr/>
+          <w:p>
+            <w:pPr>
+              <w:pStyle w:val="Compact"/>
+            </w:pPr>
+            <w:r>
+              <w:t xml:space="preserve">case</w:t>
+            </w:r>
+          </w:p>
+        </w:tc>
+        <w:tc>
+          <w:tcPr/>
+          <w:p>
+            <w:pPr>
+              <w:pStyle w:val="Compact"/>
+            </w:pPr>
+            <w:r>
+              <w:t xml:space="preserve">DDInter original</w:t>
+            </w:r>
+          </w:p>
+        </w:tc>
+        <w:tc>
+          <w:tcPr/>
+          <w:p>
+            <w:pPr>
+              <w:pStyle w:val="Compact"/>
+            </w:pPr>
+            <w:r>
+              <w:t xml:space="preserve">shown to experts</w:t>
+            </w:r>
+          </w:p>
+        </w:tc>
+        <w:tc>
+          <w:tcPr/>
+          <w:p>
+            <w:pPr>
+              <w:pStyle w:val="Compact"/>
+            </w:pPr>
+            <w:r>
+              <w:t xml:space="preserve">expert 1</w:t>
+            </w:r>
+          </w:p>
+        </w:tc>
+        <w:tc>
+          <w:tcPr/>
+          <w:p>
+            <w:pPr>
+              <w:pStyle w:val="Compact"/>
+            </w:pPr>
+            <w:r>
+              <w:t xml:space="preserve">expert 2</w:t>
+            </w:r>
+          </w:p>
+        </w:tc>
+        <w:tc>
+          <w:tcPr/>
+          <w:p>
+            <w:pPr>
+              <w:pStyle w:val="Compact"/>
+            </w:pPr>
+            <w:r>
+              <w:t xml:space="preserve">gold retained</w:t>
+            </w:r>
+          </w:p>
+        </w:tc>
+      </w:tr>
+      <w:tr>
+        <w:tc>
+          <w:tcPr/>
+          <w:p>
+            <w:pPr>
+              <w:pStyle w:val="Compact"/>
+            </w:pPr>
+            <w:r>
+              <w:t xml:space="preserve">R01</w:t>
+            </w:r>
+          </w:p>
+        </w:tc>
+        <w:tc>
+          <w:tcPr/>
+          <w:p>
+            <w:pPr>
+              <w:pStyle w:val="Compact"/>
+            </w:pPr>
+            <w:r>
+              <w:t xml:space="preserve">high</w:t>
+            </w:r>
+          </w:p>
+        </w:tc>
+        <w:tc>
+          <w:tcPr/>
+          <w:p>
+            <w:pPr>
+              <w:pStyle w:val="Compact"/>
+            </w:pPr>
+            <w:r>
+              <w:t xml:space="preserve">medium (corrected)</w:t>
+            </w:r>
+          </w:p>
+        </w:tc>
+        <w:tc>
+          <w:tcPr/>
+          <w:p>
+            <w:pPr>
+              <w:pStyle w:val="Compact"/>
+            </w:pPr>
+            <w:r>
+              <w:t xml:space="preserve">low</w:t>
+            </w:r>
+          </w:p>
+        </w:tc>
+        <w:tc>
+          <w:tcPr/>
+          <w:p>
+            <w:pPr>
+              <w:pStyle w:val="Compact"/>
+            </w:pPr>
+            <w:r>
+              <w:t xml:space="preserve">low</w:t>
+            </w:r>
+          </w:p>
+        </w:tc>
+        <w:tc>
+          <w:tcPr/>
+          <w:p>
+            <w:pPr>
+              <w:pStyle w:val="Compact"/>
+            </w:pPr>
+            <w:r>
+              <w:t xml:space="preserve">yes</w:t>
+            </w:r>
+          </w:p>
+        </w:tc>
+      </w:tr>
+      <w:tr>
+        <w:tc>
+          <w:tcPr/>
+          <w:p>
+            <w:pPr>
+              <w:pStyle w:val="Compact"/>
+            </w:pPr>
+            <w:r>
+              <w:t xml:space="preserve">R02</w:t>
+            </w:r>
+          </w:p>
+        </w:tc>
+        <w:tc>
+          <w:tcPr/>
+          <w:p>
+            <w:pPr>
+              <w:pStyle w:val="Compact"/>
+            </w:pPr>
+            <w:r>
+              <w:t xml:space="preserve">medium</w:t>
+            </w:r>
+          </w:p>
+        </w:tc>
+        <w:tc>
+          <w:tcPr/>
+          <w:p>
+            <w:pPr>
+              <w:pStyle w:val="Compact"/>
+            </w:pPr>
+            <w:r>
+              <w:t xml:space="preserve">high (corrected)</w:t>
+            </w:r>
+          </w:p>
+        </w:tc>
+        <w:tc>
+          <w:tcPr/>
+          <w:p>
+            <w:pPr>
+              <w:pStyle w:val="Compact"/>
+            </w:pPr>
+            <w:r>
+              <w:t xml:space="preserve">medium</w:t>
+            </w:r>
+          </w:p>
+        </w:tc>
+        <w:tc>
+          <w:tcPr/>
+          <w:p>
+            <w:pPr>
+              <w:pStyle w:val="Compact"/>
+            </w:pPr>
+            <w:r>
+              <w:t xml:space="preserve">medium</w:t>
+            </w:r>
+          </w:p>
+        </w:tc>
+        <w:tc>
+          <w:tcPr/>
+          <w:p>
+            <w:pPr>
+              <w:pStyle w:val="Compact"/>
+            </w:pPr>
+            <w:r>
+              <w:t xml:space="preserve">yes</w:t>
+            </w:r>
+          </w:p>
+        </w:tc>
+      </w:tr>
+      <w:tr>
+        <w:tc>
+          <w:tcPr/>
+          <w:p>
+            <w:pPr>
+              <w:pStyle w:val="Compact"/>
+            </w:pPr>
+            <w:r>
+              <w:t xml:space="preserve">R03</w:t>
+            </w:r>
+          </w:p>
+        </w:tc>
+        <w:tc>
+          <w:tcPr/>
+          <w:p>
+            <w:pPr>
+              <w:pStyle w:val="Compact"/>
+            </w:pPr>
+            <w:r>
+              <w:t xml:space="preserve">low</w:t>
+            </w:r>
+          </w:p>
+        </w:tc>
+        <w:tc>
+          <w:tcPr/>
+          <w:p>
+            <w:pPr>
+              <w:pStyle w:val="Compact"/>
+            </w:pPr>
+            <w:r>
+              <w:t xml:space="preserve">medium (corrected)</w:t>
+            </w:r>
+          </w:p>
+        </w:tc>
+        <w:tc>
+          <w:tcPr/>
+          <w:p>
+            <w:pPr>
+              <w:pStyle w:val="Compact"/>
+            </w:pPr>
+            <w:r>
+              <w:t xml:space="preserve">low</w:t>
+            </w:r>
+          </w:p>
+        </w:tc>
+        <w:tc>
+          <w:tcPr/>
+          <w:p>
+            <w:pPr>
+              <w:pStyle w:val="Compact"/>
+            </w:pPr>
+            <w:r>
+              <w:t xml:space="preserve">low</w:t>
+            </w:r>
+          </w:p>
+        </w:tc>
+        <w:tc>
+          <w:tcPr/>
+          <w:p>
+            <w:pPr>
+              <w:pStyle w:val="Compact"/>
+            </w:pPr>
+            <w:r>
+              <w:t xml:space="preserve">yes</w:t>
+            </w:r>
+          </w:p>
+        </w:tc>
+      </w:tr>
+    </w:tbl>
+    <w:p>
+      <w:pPr>
+        <w:pStyle w:val="BodyText"/>
+        <w:spacing w:line="480" w:lineRule="auto"/>
+      </w:pPr>
+      <w:r>
+        <w:rPr>
+          <w:rFonts w:ascii="Times New Roman" w:hAnsi="Times New Roman"/>
+        </w:rPr>
+        <w:t xml:space="preserve">For R02 and R03 both experts independently rated the</w:t>
+      </w:r>
+      <w:r>
+        <w:rPr>
+          <w:rFonts w:ascii="Times New Roman" w:hAnsi="Times New Roman"/>
+        </w:rPr>
+        <w:t xml:space="preserve"> </w:t>
+      </w:r>
+      <w:r>
+        <w:rPr>
+          <w:rFonts w:ascii="Times New Roman" w:hAnsi="Times New Roman"/>
+          <w:i/>
+          <w:iCs/>
+        </w:rPr>
+        <w:t xml:space="preserve">pre-correction</w:t>
+      </w:r>
+      <w:r>
+        <w:rPr>
+          <w:rFonts w:ascii="Times New Roman" w:hAnsi="Times New Roman"/>
+        </w:rPr>
+        <w:t xml:space="preserve"> </w:t>
+      </w:r>
+      <w:r>
+        <w:rPr>
+          <w:rFonts w:ascii="Times New Roman" w:hAnsi="Times New Roman"/>
+        </w:rPr>
+        <w:t xml:space="preserve">grade, and the gold was kept at the</w:t>
+      </w:r>
+      <w:r>
+        <w:rPr>
+          <w:rFonts w:ascii="Times New Roman" w:hAnsi="Times New Roman"/>
+        </w:rPr>
+        <w:t xml:space="preserve"> </w:t>
+      </w:r>
+      <w:r>
+        <w:rPr>
+          <w:rFonts w:ascii="Times New Roman" w:hAnsi="Times New Roman"/>
+        </w:rPr>
+        <w:t xml:space="preserve">corrected value; that is, the corrections are not reflected in the experts’ answers. The corrections were</w:t>
+      </w:r>
+      <w:r>
+        <w:rPr>
+          <w:rFonts w:ascii="Times New Roman" w:hAnsi="Times New Roman"/>
+        </w:rPr>
+        <w:t xml:space="preserve"> </w:t>
+      </w:r>
+      <w:r>
+        <w:rPr>
+          <w:rFonts w:ascii="Times New Roman" w:hAnsi="Times New Roman"/>
+        </w:rPr>
+        <w:t xml:space="preserve">made before the review, and the procedural lock described in Section 2.3 applies to the 40-case frozen</w:t>
+      </w:r>
+      <w:r>
+        <w:rPr>
+          <w:rFonts w:ascii="Times New Roman" w:hAnsi="Times New Roman"/>
+        </w:rPr>
+        <w:t xml:space="preserve"> </w:t>
+      </w:r>
+      <w:r>
+        <w:rPr>
+          <w:rFonts w:ascii="Times New Roman" w:hAnsi="Times New Roman"/>
+        </w:rPr>
+        <w:t xml:space="preserve">blind subset, which does not include these cases, so there is no conflict with the lock; but the sequencing</w:t>
+      </w:r>
+      <w:r>
+        <w:rPr>
+          <w:rFonts w:ascii="Times New Roman" w:hAnsi="Times New Roman"/>
+        </w:rPr>
+        <w:t xml:space="preserve"> </w:t>
+      </w:r>
+      <w:r>
+        <w:rPr>
+          <w:rFonts w:ascii="Times New Roman" w:hAnsi="Times New Roman"/>
+        </w:rPr>
+        <w:t xml:space="preserve">is stated here rather than left for a reader to reconstruct from the deposited design file.</w:t>
       </w:r>
     </w:p>
     <w:p>

</xml_diff>